<commit_message>
Update internship docs: fix table borders and widths in diary, save as fallback Дневник-111_обновленный.docx since original is locked, and apply 1.25 cm first-line indent on all paragraphs in both report and diary
</commit_message>
<xml_diff>
--- a/Есеп (1).docxбота.docx2233 (1).docx5.docx
+++ b/Есеп (1).docxбота.docx2233 (1).docx5.docx
@@ -450,7 +450,7 @@
     </w:p>
     <w:p>
       <w:pPr>
-        <w:spacing w:before="100" w:beforeAutospacing="1" w:after="100" w:afterAutospacing="1" w:line="240" w:lineRule="auto"/>
+        <w:spacing w:before="100" w:beforeAutospacing="1" w:after="120" w:afterAutospacing="1" w:line="276" w:lineRule="auto"/>
         <w:ind w:firstLine="709"/>
         <w:rPr>
           <w:rFonts w:ascii="Times New Roman" w:eastAsia="Times New Roman" w:hAnsi="Times New Roman" w:cs="Times New Roman"/>
@@ -471,7 +471,8 @@
     </w:p>
     <w:p>
       <w:pPr>
-        <w:spacing w:before="100" w:beforeAutospacing="1" w:after="100" w:afterAutospacing="1" w:line="240" w:lineRule="auto"/>
+        <w:spacing w:before="100" w:beforeAutospacing="1" w:after="120" w:afterAutospacing="1" w:line="276" w:lineRule="auto"/>
+        <w:ind w:firstLine="709"/>
         <w:rPr>
           <w:rFonts w:ascii="Times New Roman" w:eastAsia="Times New Roman" w:hAnsi="Times New Roman" w:cs="Times New Roman"/>
           <w:sz w:val="28"/>
@@ -520,7 +521,7 @@
     <w:bookmarkEnd w:id="0"/>
     <w:p>
       <w:pPr>
-        <w:spacing w:before="100" w:beforeAutospacing="1" w:after="100" w:afterAutospacing="1" w:line="240" w:lineRule="auto"/>
+        <w:spacing w:before="100" w:beforeAutospacing="1" w:after="120" w:afterAutospacing="1" w:line="276" w:lineRule="auto"/>
         <w:ind w:firstLine="709"/>
         <w:rPr>
           <w:rFonts w:ascii="Times New Roman" w:eastAsia="Times New Roman" w:hAnsi="Times New Roman" w:cs="Times New Roman"/>
@@ -541,7 +542,8 @@
     </w:p>
     <w:p>
       <w:pPr>
-        <w:spacing w:before="100" w:beforeAutospacing="1" w:after="100" w:afterAutospacing="1" w:line="240" w:lineRule="auto"/>
+        <w:spacing w:before="100" w:beforeAutospacing="1" w:after="120" w:afterAutospacing="1" w:line="276" w:lineRule="auto"/>
+        <w:ind w:firstLine="709"/>
         <w:rPr>
           <w:rFonts w:ascii="Times New Roman" w:eastAsia="Times New Roman" w:hAnsi="Times New Roman" w:cs="Times New Roman"/>
           <w:sz w:val="28"/>
@@ -579,7 +581,8 @@
     </w:p>
     <w:p>
       <w:pPr>
-        <w:spacing w:before="100" w:beforeAutospacing="1" w:after="100" w:afterAutospacing="1" w:line="240" w:lineRule="auto"/>
+        <w:spacing w:before="100" w:beforeAutospacing="1" w:after="120" w:afterAutospacing="1" w:line="276" w:lineRule="auto"/>
+        <w:ind w:firstLine="709"/>
         <w:rPr>
           <w:rFonts w:ascii="Times New Roman" w:eastAsia="Times New Roman" w:hAnsi="Times New Roman" w:cs="Times New Roman"/>
           <w:sz w:val="28"/>
@@ -800,7 +803,8 @@
         <w:tabs>
           <w:tab w:val="left" w:pos="709"/>
         </w:tabs>
-        <w:spacing w:before="100" w:beforeAutospacing="1" w:after="100" w:afterAutospacing="1" w:line="240" w:lineRule="auto"/>
+        <w:spacing w:before="100" w:beforeAutospacing="1" w:after="120" w:afterAutospacing="1" w:line="276" w:lineRule="auto"/>
+        <w:ind w:firstLine="709"/>
         <w:rPr>
           <w:rFonts w:ascii="Times New Roman" w:eastAsia="Times New Roman" w:hAnsi="Times New Roman" w:cs="Times New Roman"/>
           <w:sz w:val="28"/>
@@ -838,7 +842,8 @@
     </w:p>
     <w:p>
       <w:pPr>
-        <w:spacing w:before="100" w:beforeAutospacing="1" w:after="100" w:afterAutospacing="1" w:line="240" w:lineRule="auto"/>
+        <w:spacing w:before="100" w:beforeAutospacing="1" w:after="120" w:afterAutospacing="1" w:line="276" w:lineRule="auto"/>
+        <w:ind w:firstLine="709"/>
         <w:rPr>
           <w:rFonts w:ascii="Times New Roman" w:eastAsia="Times New Roman" w:hAnsi="Times New Roman" w:cs="Times New Roman"/>
           <w:sz w:val="28"/>
@@ -1445,7 +1450,8 @@
     </w:p>
     <w:p>
       <w:pPr>
-        <w:spacing w:before="100" w:beforeAutospacing="1" w:after="100" w:afterAutospacing="1" w:line="240" w:lineRule="auto"/>
+        <w:spacing w:before="100" w:beforeAutospacing="1" w:after="120" w:afterAutospacing="1" w:line="276" w:lineRule="auto"/>
+        <w:ind w:firstLine="709"/>
         <w:rPr>
           <w:rFonts w:ascii="Times New Roman" w:eastAsia="Times New Roman" w:hAnsi="Times New Roman" w:cs="Times New Roman"/>
           <w:sz w:val="28"/>
@@ -2219,7 +2225,8 @@
           <w:tab w:val="left" w:pos="709"/>
           <w:tab w:val="left" w:pos="851"/>
         </w:tabs>
-        <w:spacing w:before="100" w:beforeAutospacing="1" w:after="100" w:afterAutospacing="1" w:line="240" w:lineRule="auto"/>
+        <w:spacing w:before="100" w:beforeAutospacing="1" w:after="120" w:afterAutospacing="1" w:line="276" w:lineRule="auto"/>
+        <w:ind w:firstLine="709"/>
         <w:rPr>
           <w:rFonts w:ascii="Times New Roman" w:eastAsia="Times New Roman" w:hAnsi="Times New Roman" w:cs="Times New Roman"/>
           <w:sz w:val="28"/>
@@ -2709,7 +2716,8 @@
         <w:tabs>
           <w:tab w:val="left" w:pos="709"/>
         </w:tabs>
-        <w:spacing w:before="100" w:beforeAutospacing="1" w:after="100" w:afterAutospacing="1" w:line="240" w:lineRule="auto"/>
+        <w:spacing w:before="100" w:beforeAutospacing="1" w:after="120" w:afterAutospacing="1" w:line="276" w:lineRule="auto"/>
+        <w:ind w:firstLine="709"/>
         <w:rPr>
           <w:rFonts w:ascii="Times New Roman" w:eastAsia="Times New Roman" w:hAnsi="Times New Roman" w:cs="Times New Roman"/>
           <w:sz w:val="28"/>
@@ -3302,6 +3310,7 @@
     <w:p>
       <w:pPr>
         <w:spacing w:after="120" w:before="360" w:line="276" w:lineRule="auto"/>
+        <w:ind w:firstLine="709"/>
       </w:pPr>
       <w:r>
         <w:rPr>
@@ -3315,7 +3324,8 @@
     </w:p>
     <w:p>
       <w:pPr>
-        <w:spacing w:after="240"/>
+        <w:spacing w:after="120" w:line="276" w:lineRule="auto"/>
+        <w:ind w:firstLine="709"/>
       </w:pPr>
       <w:r>
         <w:rPr>
@@ -3330,6 +3340,7 @@
     <w:p>
       <w:pPr>
         <w:spacing w:after="120" w:before="360" w:line="276" w:lineRule="auto"/>
+        <w:ind w:firstLine="709"/>
       </w:pPr>
       <w:r>
         <w:rPr>
@@ -3343,7 +3354,8 @@
     </w:p>
     <w:p>
       <w:pPr>
-        <w:spacing w:after="240" w:before="0" w:line="276" w:lineRule="auto"/>
+        <w:spacing w:after="120" w:before="0" w:line="276" w:lineRule="auto"/>
+        <w:ind w:firstLine="709"/>
       </w:pPr>
       <w:r>
         <w:rPr>
@@ -3372,7 +3384,8 @@
     </w:p>
     <w:p>
       <w:pPr>
-        <w:spacing w:after="240" w:before="480" w:line="276" w:lineRule="auto"/>
+        <w:spacing w:after="120" w:before="480" w:line="276" w:lineRule="auto"/>
+        <w:ind w:firstLine="709"/>
       </w:pPr>
       <w:r>
         <w:rPr>
@@ -3387,6 +3400,7 @@
     <w:p>
       <w:pPr>
         <w:spacing w:after="120" w:before="240" w:line="276" w:lineRule="auto"/>
+        <w:ind w:firstLine="709"/>
       </w:pPr>
       <w:r>
         <w:rPr>
@@ -3790,6 +3804,7 @@
     <w:p>
       <w:pPr>
         <w:spacing w:after="120" w:before="240" w:line="276" w:lineRule="auto"/>
+        <w:ind w:firstLine="709"/>
       </w:pPr>
       <w:r>
         <w:rPr>
@@ -5123,6 +5138,7 @@
     <w:p>
       <w:pPr>
         <w:spacing w:after="120" w:before="240" w:line="276" w:lineRule="auto"/>
+        <w:ind w:firstLine="709"/>
       </w:pPr>
       <w:r>
         <w:rPr>
@@ -5665,6 +5681,7 @@
     <w:p>
       <w:pPr>
         <w:spacing w:after="120" w:before="240" w:line="276" w:lineRule="auto"/>
+        <w:ind w:firstLine="709"/>
       </w:pPr>
       <w:r>
         <w:rPr>

</xml_diff>

<commit_message>
Update practice report to target exactly 4-5 pages with index.html and core database.js logic
</commit_message>
<xml_diff>
--- a/Есеп (1).docxбота.docx2233 (1).docx5.docx
+++ b/Есеп (1).docxбота.docx2233 (1).docx5.docx
@@ -3310,7 +3310,7 @@
     <w:p>
       <w:pPr>
         <w:spacing w:after="120" w:before="360" w:line="276" w:lineRule="auto"/>
-        <w:ind/>
+        <w:jc w:val="left"/>
       </w:pPr>
       <w:r>
         <w:rPr>
@@ -3320,6 +3320,227 @@
           <w:sz w:val="28"/>
         </w:rPr>
         <w:t>Жобаның сілтемесі (GitHub Pages):</w:t>
+      </w:r>
+    </w:p>
+    <w:p>
+      <w:pPr>
+        <w:spacing w:after="240"/>
+      </w:pPr>
+      <w:r>
+        <w:rPr>
+          <w:rFonts w:ascii="Times New Roman" w:hAnsi="Times New Roman"/>
+          <w:b/>
+          <w:color w:val="4F46E5"/>
+          <w:sz w:val="24"/>
+        </w:rPr>
+        <w:t>https://novacoding1.github.io/student-attendance2/</w:t>
+      </w:r>
+    </w:p>
+    <w:p>
+      <w:pPr>
+        <w:spacing w:after="120" w:before="360" w:line="276" w:lineRule="auto"/>
+        <w:jc w:val="left"/>
+      </w:pPr>
+      <w:r>
+        <w:rPr>
+          <w:rFonts w:ascii="Times New Roman" w:hAnsi="Times New Roman"/>
+          <w:b/>
+          <w:i w:val="0"/>
+          <w:sz w:val="28"/>
+        </w:rPr>
+        <w:t>Жобаның архитектурасы мен файлдары:</w:t>
+      </w:r>
+    </w:p>
+    <w:p>
+      <w:pPr>
+        <w:spacing w:after="200" w:before="0" w:line="276" w:lineRule="auto"/>
+        <w:jc w:val="left"/>
+      </w:pPr>
+      <w:r>
+        <w:rPr>
+          <w:rFonts w:ascii="Times New Roman" w:hAnsi="Times New Roman"/>
+          <w:b w:val="0"/>
+          <w:i w:val="0"/>
+          <w:sz w:val="24"/>
+        </w:rPr>
+        <w:t>Студенттер мен оқытушылардың сабаққа қатысуын бақылайтын жаңа веб-жүйе озық технологиялар мен премиум дизайн негізінде жасалған. Жүйе бұлтты Supabase (PostgreSQL) деректер қорымен толық интеграцияланған және екі дербес кабинеттен тұрады:</w:t>
+      </w:r>
+    </w:p>
+    <w:p>
+      <w:pPr>
+        <w:spacing w:after="80" w:before="0" w:line="276" w:lineRule="auto"/>
+        <w:ind w:left="283"/>
+      </w:pPr>
+      <w:r>
+        <w:rPr>
+          <w:rFonts w:ascii="Times New Roman" w:hAnsi="Times New Roman"/>
+          <w:b/>
+          <w:sz w:val="24"/>
+        </w:rPr>
+        <w:t xml:space="preserve">• </w:t>
+      </w:r>
+      <w:r>
+        <w:rPr>
+          <w:rFonts w:ascii="Times New Roman" w:hAnsi="Times New Roman"/>
+          <w:sz w:val="24"/>
+        </w:rPr>
+        <w:t>index.html — Жобаның бірыңғай кіру беті (Landing Page). Студент немесе Оқытушы порталын таңдау мүмкіндігін оңай ұсынады.</w:t>
+      </w:r>
+    </w:p>
+    <w:p>
+      <w:pPr>
+        <w:spacing w:after="80" w:before="0" w:line="276" w:lineRule="auto"/>
+        <w:ind w:left="283"/>
+      </w:pPr>
+      <w:r>
+        <w:rPr>
+          <w:rFonts w:ascii="Times New Roman" w:hAnsi="Times New Roman"/>
+          <w:b/>
+          <w:sz w:val="24"/>
+        </w:rPr>
+        <w:t xml:space="preserve">• </w:t>
+      </w:r>
+      <w:r>
+        <w:rPr>
+          <w:rFonts w:ascii="Times New Roman" w:hAnsi="Times New Roman"/>
+          <w:sz w:val="24"/>
+        </w:rPr>
+        <w:t>student.html — Студенттің жеке кабинеті мен камера арқылы QR-код сканері.</w:t>
+      </w:r>
+    </w:p>
+    <w:p>
+      <w:pPr>
+        <w:spacing w:after="80" w:before="0" w:line="276" w:lineRule="auto"/>
+        <w:ind w:left="283"/>
+      </w:pPr>
+      <w:r>
+        <w:rPr>
+          <w:rFonts w:ascii="Times New Roman" w:hAnsi="Times New Roman"/>
+          <w:b/>
+          <w:sz w:val="24"/>
+        </w:rPr>
+        <w:t xml:space="preserve">• </w:t>
+      </w:r>
+      <w:r>
+        <w:rPr>
+          <w:rFonts w:ascii="Times New Roman" w:hAnsi="Times New Roman"/>
+          <w:sz w:val="24"/>
+        </w:rPr>
+        <w:t>teacher.html — Оқытушының жеке кабинеті, сабақтар тізімі және QR-код генераторы (7 секунд сайын жаңарады).</w:t>
+      </w:r>
+    </w:p>
+    <w:p>
+      <w:pPr>
+        <w:spacing w:after="80" w:before="0" w:line="276" w:lineRule="auto"/>
+        <w:ind w:left="283"/>
+      </w:pPr>
+      <w:r>
+        <w:rPr>
+          <w:rFonts w:ascii="Times New Roman" w:hAnsi="Times New Roman"/>
+          <w:b/>
+          <w:sz w:val="24"/>
+        </w:rPr>
+        <w:t xml:space="preserve">• </w:t>
+      </w:r>
+      <w:r>
+        <w:rPr>
+          <w:rFonts w:ascii="Times New Roman" w:hAnsi="Times New Roman"/>
+          <w:sz w:val="24"/>
+        </w:rPr>
+        <w:t>js/database.js — Бұлтты Supabase деректер қорымен және интернет болмаған жағдайда автоматты түрде оффлайн режимге (localStorage) ауысу логикасы бар негізгі деректер менеджері.</w:t>
+      </w:r>
+    </w:p>
+    <w:p>
+      <w:pPr>
+        <w:spacing w:after="80" w:before="0" w:line="276" w:lineRule="auto"/>
+        <w:ind w:left="283"/>
+      </w:pPr>
+      <w:r>
+        <w:rPr>
+          <w:rFonts w:ascii="Times New Roman" w:hAnsi="Times New Roman"/>
+          <w:b/>
+          <w:sz w:val="24"/>
+        </w:rPr>
+        <w:t xml:space="preserve">• </w:t>
+      </w:r>
+      <w:r>
+        <w:rPr>
+          <w:rFonts w:ascii="Times New Roman" w:hAnsi="Times New Roman"/>
+          <w:sz w:val="24"/>
+        </w:rPr>
+        <w:t>js/app-student.js — Студент кабинеті мен камера сканерінің клиенттік логикасы.</w:t>
+      </w:r>
+    </w:p>
+    <w:p>
+      <w:pPr>
+        <w:spacing w:after="80" w:before="0" w:line="276" w:lineRule="auto"/>
+        <w:ind w:left="283"/>
+      </w:pPr>
+      <w:r>
+        <w:rPr>
+          <w:rFonts w:ascii="Times New Roman" w:hAnsi="Times New Roman"/>
+          <w:b/>
+          <w:sz w:val="24"/>
+        </w:rPr>
+        <w:t xml:space="preserve">• </w:t>
+      </w:r>
+      <w:r>
+        <w:rPr>
+          <w:rFonts w:ascii="Times New Roman" w:hAnsi="Times New Roman"/>
+          <w:sz w:val="24"/>
+        </w:rPr>
+        <w:t>js/app-teacher.js — Оқытушы кабинеті мен 7 секундтық QR-код ротациясының клиенттік логикасы.</w:t>
+      </w:r>
+    </w:p>
+    <w:p>
+      <w:pPr>
+        <w:spacing w:after="80" w:before="0" w:line="276" w:lineRule="auto"/>
+        <w:ind w:left="283"/>
+      </w:pPr>
+      <w:r>
+        <w:rPr>
+          <w:rFonts w:ascii="Times New Roman" w:hAnsi="Times New Roman"/>
+          <w:b/>
+          <w:sz w:val="24"/>
+        </w:rPr>
+        <w:t xml:space="preserve">• </w:t>
+      </w:r>
+      <w:r>
+        <w:rPr>
+          <w:rFonts w:ascii="Times New Roman" w:hAnsi="Times New Roman"/>
+          <w:sz w:val="24"/>
+        </w:rPr>
+        <w:t>css/style.css — Заманауи Obsidian Space Dark стиліндегі визуалды дизайн жүйесі.</w:t>
+      </w:r>
+    </w:p>
+    <w:p>
+      <w:pPr>
+        <w:spacing w:after="240" w:before="480" w:line="276" w:lineRule="auto"/>
+        <w:jc w:val="left"/>
+      </w:pPr>
+      <w:r>
+        <w:rPr>
+          <w:rFonts w:ascii="Times New Roman" w:hAnsi="Times New Roman"/>
+          <w:b/>
+          <w:i w:val="0"/>
+          <w:sz w:val="28"/>
+        </w:rPr>
+        <w:t>Жобаның негізгі функционалдық кодтары (Маңызды үзінділер):</w:t>
+      </w:r>
+    </w:p>
+    <w:p>
+      <w:pPr>
+        <w:spacing w:after="120" w:before="240" w:line="276" w:lineRule="auto"/>
+        <w:jc w:val="left"/>
+      </w:pPr>
+      <w:r>
+        <w:rPr>
+          <w:rFonts w:ascii="Times New Roman" w:hAnsi="Times New Roman"/>
+          <w:b/>
+          <w:i w:val="0"/>
+          <w:sz w:val="24"/>
+        </w:rPr>
+        <w:t>💻 index.html (Басты кіру бетінің HTML құрылымы)</w:t>
       </w:r>
     </w:p>
     <w:tbl>
@@ -3327,6 +3548,14 @@
         <w:tblW w:type="auto" w:w="0"/>
         <w:jc w:val="center"/>
         <w:tblLook w:firstColumn="1" w:firstRow="1" w:lastColumn="0" w:lastRow="0" w:noHBand="0" w:noVBand="1" w:val="04A0"/>
+        <w:tblBorders>
+          <w:top w:val="single" w:sz="4" w:space="0" w:color="000000"/>
+          <w:left w:val="single" w:sz="4" w:space="0" w:color="000000"/>
+          <w:bottom w:val="single" w:sz="4" w:space="0" w:color="000000"/>
+          <w:right w:val="single" w:sz="4" w:space="0" w:color="000000"/>
+          <w:insideH w:val="single" w:sz="4" w:space="0" w:color="000000"/>
+          <w:insideV w:val="single" w:sz="4" w:space="0" w:color="000000"/>
+        </w:tblBorders>
       </w:tblPr>
       <w:tblGrid>
         <w:gridCol w:w="9354"/>
@@ -3335,17 +3564,17 @@
         <w:tc>
           <w:tcPr>
             <w:tcW w:type="dxa" w:w="9354"/>
-            <w:shd w:val="clear" w:color="auto" w:fill="F1F5F9"/>
+            <w:shd w:val="clear" w:color="auto" w:fill="F8FAFC"/>
             <w:tcMar>
               <w:top w:w="120" w:type="dxa"/>
-              <w:left w:w="120" w:type="dxa"/>
               <w:bottom w:w="120" w:type="dxa"/>
-              <w:right w:w="120" w:type="dxa"/>
+              <w:left w:w="180" w:type="dxa"/>
+              <w:right w:w="180" w:type="dxa"/>
             </w:tcMar>
           </w:tcPr>
           <w:p>
             <w:pPr>
-              <w:spacing w:after="40" w:before="40"/>
+              <w:spacing w:before="40" w:after="40" w:line="240" w:lineRule="auto"/>
             </w:pPr>
             <w:r>
               <w:rPr>
@@ -3365,281 +3594,25 @@
               <w:br/>
               <w:t xml:space="preserve">    &lt;title&gt;SMARTATTEND | Система учета посещаемости по QR-кодам&lt;/title&gt;</w:t>
               <w:br/>
-              <w:t xml:space="preserve">    </w:t>
-              <w:br/>
-              <w:t xml:space="preserve">    &lt;!-- Стили --&gt;</w:t>
+              <w:t xml:space="preserve">    &lt;!-- Obsidian Space Dark Theme --&gt;</w:t>
               <w:br/>
               <w:t xml:space="preserve">    &lt;link rel="stylesheet" href="css/style.css"&gt;</w:t>
               <w:br/>
-              <w:t xml:space="preserve">    </w:t>
-              <w:br/>
-              <w:t xml:space="preserve">    &lt;style&gt;</w:t>
-              <w:br/>
-              <w:t xml:space="preserve">        /* Дополнительные стили специально для красивой главной страницы */</w:t>
-              <w:br/>
-              <w:t xml:space="preserve">        .landing-container {</w:t>
-              <w:br/>
-              <w:t xml:space="preserve">            max-width: 1000px;</w:t>
-              <w:br/>
-              <w:t xml:space="preserve">            margin: 0 auto;</w:t>
-              <w:br/>
-              <w:t xml:space="preserve">            padding: 80px 20px;</w:t>
-              <w:br/>
-              <w:t xml:space="preserve">            display: flex;</w:t>
-              <w:br/>
-              <w:t xml:space="preserve">            flex-direction: column;</w:t>
-              <w:br/>
-              <w:t xml:space="preserve">            align-items: center;</w:t>
-              <w:br/>
-              <w:t xml:space="preserve">            justify-content: center;</w:t>
-              <w:br/>
-              <w:t xml:space="preserve">            min-height: 100vh;</w:t>
-              <w:br/>
-              <w:t xml:space="preserve">            text-align: center;</w:t>
-              <w:br/>
-              <w:t xml:space="preserve">        }</w:t>
-              <w:br/>
-              <w:br/>
-              <w:t xml:space="preserve">        .landing-header {</w:t>
-              <w:br/>
-              <w:t xml:space="preserve">            margin-bottom: 50px;</w:t>
-              <w:br/>
-              <w:t xml:space="preserve">            animation: fadeInDown 0.8s ease-out;</w:t>
-              <w:br/>
-              <w:t xml:space="preserve">        }</w:t>
-              <w:br/>
-              <w:br/>
-              <w:t xml:space="preserve">        .landing-title {</w:t>
-              <w:br/>
-              <w:t xml:space="preserve">            font-family: var(--font-heading);</w:t>
-              <w:br/>
-              <w:t xml:space="preserve">            font-size: 3rem;</w:t>
-              <w:br/>
-              <w:t xml:space="preserve">            font-weight: 800;</w:t>
-              <w:br/>
-              <w:t xml:space="preserve">            line-height: 1.2;</w:t>
-              <w:br/>
-              <w:t xml:space="preserve">            margin-bottom: 20px;</w:t>
-              <w:br/>
-              <w:t xml:space="preserve">            background: linear-gradient(135deg, #ffffff 30%, #a5b4fc 100%);</w:t>
-              <w:br/>
-              <w:t xml:space="preserve">            -webkit-background-clip: text;</w:t>
-              <w:br/>
-              <w:t xml:space="preserve">            -webkit-text-fill-color: transparent;</w:t>
-              <w:br/>
-              <w:t xml:space="preserve">        }</w:t>
-              <w:br/>
-              <w:br/>
-              <w:t xml:space="preserve">        .landing-subtitle {</w:t>
-              <w:br/>
-              <w:t xml:space="preserve">            font-size: 1.2rem;</w:t>
-              <w:br/>
-              <w:t xml:space="preserve">            color: var(--text-secondary);</w:t>
-              <w:br/>
-              <w:t xml:space="preserve">            max-width: 600px;</w:t>
-              <w:br/>
-              <w:t xml:space="preserve">            margin: 0 auto;</w:t>
-              <w:br/>
-              <w:t xml:space="preserve">        }</w:t>
-              <w:br/>
-              <w:br/>
-              <w:t xml:space="preserve">        .portals-grid {</w:t>
-              <w:br/>
-              <w:t xml:space="preserve">            display: grid;</w:t>
-              <w:br/>
-              <w:t xml:space="preserve">            grid-template-columns: 1fr;</w:t>
-              <w:br/>
-              <w:t xml:space="preserve">            gap: 30px;</w:t>
-              <w:br/>
-              <w:t xml:space="preserve">            width: 100%;</w:t>
-              <w:br/>
-              <w:t xml:space="preserve">            max-width: 800px;</w:t>
-              <w:br/>
-              <w:t xml:space="preserve">            margin-top: 20px;</w:t>
-              <w:br/>
-              <w:t xml:space="preserve">            animation: fadeInUp 0.8s ease-out 0.2s both;</w:t>
-              <w:br/>
-              <w:t xml:space="preserve">        }</w:t>
-              <w:br/>
-              <w:br/>
-              <w:t xml:space="preserve">        @media (min-width: 768px) {</w:t>
-              <w:br/>
-              <w:t xml:space="preserve">            .portals-grid {</w:t>
-              <w:br/>
-              <w:t xml:space="preserve">                grid-template-columns: 1fr 1fr;</w:t>
-              <w:br/>
-              <w:t xml:space="preserve">            }</w:t>
-              <w:br/>
-              <w:t xml:space="preserve">        }</w:t>
-              <w:br/>
-              <w:br/>
-              <w:t xml:space="preserve">        .portal-card {</w:t>
-              <w:br/>
-              <w:t xml:space="preserve">            display: flex;</w:t>
-              <w:br/>
-              <w:t xml:space="preserve">            flex-direction: column;</w:t>
-              <w:br/>
-              <w:t xml:space="preserve">            align-items: center;</w:t>
-              <w:br/>
-              <w:t xml:space="preserve">            justify-content: space-between;</w:t>
-              <w:br/>
-              <w:t xml:space="preserve">            padding: 40px 30px;</w:t>
-              <w:br/>
-              <w:t xml:space="preserve">            cursor: pointer;</w:t>
-              <w:br/>
-              <w:t xml:space="preserve">            text-decoration: none;</w:t>
-              <w:br/>
-              <w:t xml:space="preserve">            color: inherit;</w:t>
-              <w:br/>
-              <w:t xml:space="preserve">            position: relative;</w:t>
-              <w:br/>
-              <w:t xml:space="preserve">            overflow: hidden;</w:t>
-              <w:br/>
-              <w:t xml:space="preserve">            transition: var(--transition-smooth);</w:t>
-              <w:br/>
-              <w:t xml:space="preserve">        }</w:t>
-              <w:br/>
-              <w:br/>
-              <w:t xml:space="preserve">        .portal-card::before {</w:t>
-              <w:br/>
-              <w:t xml:space="preserve">            content: '';</w:t>
-              <w:br/>
-              <w:t xml:space="preserve">            position: absolute;</w:t>
-              <w:br/>
-              <w:t xml:space="preserve">            top: 0;</w:t>
-              <w:br/>
-              <w:t xml:space="preserve">            left: 0;</w:t>
-              <w:br/>
-              <w:t xml:space="preserve">            width: 100%;</w:t>
-              <w:br/>
-              <w:t xml:space="preserve">            height: 4px;</w:t>
-              <w:br/>
-              <w:t xml:space="preserve">            transition: var(--transition-smooth);</w:t>
-              <w:br/>
-              <w:t xml:space="preserve">        }</w:t>
-              <w:br/>
-              <w:br/>
-              <w:t xml:space="preserve">        /* Цвета для таба Студента */</w:t>
-              <w:br/>
-              <w:t xml:space="preserve">        .portal-card.student-card::before {</w:t>
-              <w:br/>
-              <w:t xml:space="preserve">            background: var(--clr-student-grad);</w:t>
-              <w:br/>
-              <w:t xml:space="preserve">        }</w:t>
-              <w:br/>
-              <w:t xml:space="preserve">        .portal-card.student-card:hover {</w:t>
-              <w:br/>
-              <w:t xml:space="preserve">            border-color: rgba(99, 102, 241, 0.3);</w:t>
-              <w:br/>
-              <w:t xml:space="preserve">            box-shadow: 0 15px 40px rgba(99, 102, 241, 0.15);</w:t>
-              <w:br/>
-              <w:t xml:space="preserve">            transform: translateY(-8px);</w:t>
-              <w:br/>
-              <w:t xml:space="preserve">        }</w:t>
-              <w:br/>
-              <w:br/>
-              <w:t xml:space="preserve">        /* Цвета для таба Преподавателя */</w:t>
-              <w:br/>
-              <w:t xml:space="preserve">        .portal-card.teacher-card::before {</w:t>
-              <w:br/>
-              <w:t xml:space="preserve">            background: var(--clr-teacher-grad);</w:t>
-              <w:br/>
-              <w:t xml:space="preserve">        }</w:t>
-              <w:br/>
-              <w:t xml:space="preserve">        .portal-card.teacher-card:hover {</w:t>
-              <w:br/>
-              <w:t xml:space="preserve">            border-color: rgba(14, 165, 233, 0.3);</w:t>
-              <w:br/>
-              <w:t xml:space="preserve">            box-shadow: 0 15px 40px rgba(14, 165, 233, 0.15);</w:t>
-              <w:br/>
-              <w:t xml:space="preserve">            transform: translateY(-8px);</w:t>
-              <w:br/>
-              <w:t xml:space="preserve">        }</w:t>
-              <w:br/>
-              <w:br/>
-              <w:t xml:space="preserve">        .portal-icon {</w:t>
-              <w:br/>
-              <w:t xml:space="preserve">            font-size: 4rem;</w:t>
-              <w:br/>
-              <w:t xml:space="preserve">            margin-bottom: 24px;</w:t>
-              <w:br/>
-              <w:t xml:space="preserve">            transition: transform 0.5s cubic-bezier(0.175, 0.885, 0.32, 1.275);</w:t>
-              <w:br/>
-              <w:t xml:space="preserve">        }</w:t>
-              <w:br/>
-              <w:br/>
-              <w:t xml:space="preserve">        .portal-card:hover .portal-icon {</w:t>
-              <w:br/>
-              <w:t xml:space="preserve">            transform: scale(1.15) rotate(5deg);</w:t>
-              <w:br/>
-              <w:t xml:space="preserve">        }</w:t>
-              <w:br/>
-              <w:br/>
-              <w:t xml:space="preserve">        .portal-name {</w:t>
-              <w:br/>
-              <w:t xml:space="preserve">            font-size: 1.5rem;</w:t>
-              <w:br/>
-              <w:t xml:space="preserve">            font-weight: 700;</w:t>
-              <w:br/>
-              <w:t xml:space="preserve">            margin-bottom: 12px;</w:t>
-              <w:br/>
-              <w:t xml:space="preserve">            color: #fff;</w:t>
-              <w:br/>
-              <w:t xml:space="preserve">        }</w:t>
-              <w:br/>
-              <w:br/>
-              <w:t xml:space="preserve">        .portal-desc {</w:t>
-              <w:br/>
-              <w:t xml:space="preserve">            font-size: 0.9rem;</w:t>
-              <w:br/>
-              <w:t xml:space="preserve">            color: var(--text-secondary);</w:t>
-              <w:br/>
-              <w:t xml:space="preserve">            line-height: 1.5;</w:t>
-              <w:br/>
-              <w:t xml:space="preserve">            margin-bottom: 30px;</w:t>
-              <w:br/>
-              <w:t xml:space="preserve">            max-width: 280px;</w:t>
-              <w:br/>
-              <w:t xml:space="preserve">        }</w:t>
-              <w:br/>
-              <w:br/>
-              <w:t xml:space="preserve">        @keyframes fadeInDown {</w:t>
-              <w:br/>
-              <w:t xml:space="preserve">            from { opacity: 0; transform: translateY(-30px); }</w:t>
-              <w:br/>
-              <w:t xml:space="preserve">            to { opacity: 1; transform: translateY(0); }</w:t>
-              <w:br/>
-              <w:t xml:space="preserve">        }</w:t>
-              <w:br/>
-              <w:br/>
-              <w:t xml:space="preserve">        @keyframes fadeInUp {</w:t>
-              <w:br/>
-              <w:t xml:space="preserve">            from { opacity: 0; transform: translateY(30px); }</w:t>
-              <w:br/>
-              <w:t xml:space="preserve">            to { opacity: 1; transform: translateY(0); }</w:t>
-              <w:br/>
-              <w:t xml:space="preserve">        }</w:t>
-              <w:br/>
-              <w:t xml:space="preserve">    &lt;/style&gt;</w:t>
-              <w:br/>
               <w:t>&lt;/head&gt;</w:t>
               <w:br/>
               <w:t>&lt;body&gt;</w:t>
               <w:br/>
-              <w:br/>
               <w:t xml:space="preserve">    &lt;div class="landing-container"&gt;</w:t>
               <w:br/>
-              <w:t xml:space="preserve">        </w:t>
-              <w:br/>
               <w:t xml:space="preserve">        &lt;!-- Заголовок Лендинга --&gt;</w:t>
               <w:br/>
               <w:t xml:space="preserve">        &lt;header class="landing-header"&gt;</w:t>
               <w:br/>
-              <w:t xml:space="preserve">            &lt;div style="font-size: 4rem; margin-bottom: 16px; display: inline-block; animation: pulseSuccess 2s infinite;"&gt;🎓&lt;/div&gt;</w:t>
+              <w:t xml:space="preserve">            &lt;div style="font-size: 4rem; margin-bottom: 16px;"&gt;🎓&lt;/div&gt;</w:t>
               <w:br/>
               <w:t xml:space="preserve">            &lt;h1 class="landing-title"&gt;SMARTATTEND&lt;/h1&gt;</w:t>
               <w:br/>
-              <w:t xml:space="preserve">            &lt;p class="landing-subtitle"&gt;Современный облачный сервис учета посещаемости студентов по динамическим QR-кодам в реальном времени&lt;/p&gt;</w:t>
+              <w:t xml:space="preserve">            &lt;p class="landing-subtitle"&gt;Современный облачный сервис посещаемости по динамическим QR-кодам в реальном времени&lt;/p&gt;</w:t>
               <w:br/>
               <w:t xml:space="preserve">        &lt;/header&gt;</w:t>
               <w:br/>
@@ -3648,8 +3621,6 @@
               <w:br/>
               <w:t xml:space="preserve">        &lt;div class="portals-grid"&gt;</w:t>
               <w:br/>
-              <w:t xml:space="preserve">            </w:t>
-              <w:br/>
               <w:t xml:space="preserve">            &lt;!-- Карточка Студента --&gt;</w:t>
               <w:br/>
               <w:t xml:space="preserve">            &lt;a href="student.html" class="glass-card portal-card student-card"&gt;</w:t>
@@ -3660,7 +3631,7 @@
               <w:br/>
               <w:t xml:space="preserve">                    &lt;h2 class="portal-name"&gt;Кабинет Студента&lt;/h2&gt;</w:t>
               <w:br/>
-              <w:t xml:space="preserve">                    &lt;p class="portal-desc"&gt;Зарегистрируйтесь, введите группу, запустите камеру для сканирования QR-кода и просматривайте историю посещений.&lt;/p&gt;</w:t>
+              <w:t xml:space="preserve">                    &lt;p class="portal-desc"&gt;Регистрация, камера для сканирования QR-кода и история посещений.&lt;/p&gt;</w:t>
               <w:br/>
               <w:t xml:space="preserve">                &lt;/div&gt;</w:t>
               <w:br/>
@@ -3679,7 +3650,7 @@
               <w:br/>
               <w:t xml:space="preserve">                    &lt;h2 class="portal-name"&gt;Панель Преподавателя&lt;/h2&gt;</w:t>
               <w:br/>
-              <w:t xml:space="preserve">                    &lt;p class="portal-desc"&gt;Создавайте лекции, выводите динамические QR-коды на проектор и контролируйте отметки в реальном времени.&lt;/p&gt;</w:t>
+              <w:t xml:space="preserve">                    &lt;p class="portal-desc"&gt;Создание лекций, вывод динамических QR-кодов на проектор (каждые 7 сек).&lt;/p&gt;</w:t>
               <w:br/>
               <w:t xml:space="preserve">                &lt;/div&gt;</w:t>
               <w:br/>
@@ -3687,34 +3658,52 @@
               <w:br/>
               <w:t xml:space="preserve">            &lt;/a&gt;</w:t>
               <w:br/>
-              <w:br/>
               <w:t xml:space="preserve">        &lt;/div&gt;</w:t>
               <w:br/>
-              <w:br/>
               <w:t xml:space="preserve">        &lt;footer style="margin-top: 80px; font-size: 0.8rem; color: var(--text-muted);"&gt;</w:t>
               <w:br/>
               <w:t xml:space="preserve">            &amp;copy; 2026 SMARTATTEND. Все права защищены. Работает на облаке Supabase Cloud.</w:t>
               <w:br/>
               <w:t xml:space="preserve">        &lt;/footer&gt;</w:t>
               <w:br/>
-              <w:br/>
               <w:t xml:space="preserve">    &lt;/div&gt;</w:t>
               <w:br/>
-              <w:br/>
               <w:t>&lt;/body&gt;</w:t>
               <w:br/>
               <w:t>&lt;/html&gt;</w:t>
-              <w:br/>
             </w:r>
           </w:p>
         </w:tc>
       </w:tr>
     </w:tbl>
+    <w:p>
+      <w:pPr>
+        <w:spacing w:after="120" w:before="240" w:line="276" w:lineRule="auto"/>
+        <w:jc w:val="left"/>
+      </w:pPr>
+      <w:r>
+        <w:rPr>
+          <w:rFonts w:ascii="Times New Roman" w:hAnsi="Times New Roman"/>
+          <w:b/>
+          <w:i w:val="0"/>
+          <w:sz w:val="24"/>
+        </w:rPr>
+        <w:t>💻 Деректер қорымен байланысу және тіркеу, қатысу, токенді жаңарту әдістері (js/database.js)</w:t>
+      </w:r>
+    </w:p>
     <w:tbl>
       <w:tblPr>
         <w:tblW w:type="auto" w:w="0"/>
         <w:jc w:val="center"/>
         <w:tblLook w:firstColumn="1" w:firstRow="1" w:lastColumn="0" w:lastRow="0" w:noHBand="0" w:noVBand="1" w:val="04A0"/>
+        <w:tblBorders>
+          <w:top w:val="single" w:sz="4" w:space="0" w:color="000000"/>
+          <w:left w:val="single" w:sz="4" w:space="0" w:color="000000"/>
+          <w:bottom w:val="single" w:sz="4" w:space="0" w:color="000000"/>
+          <w:right w:val="single" w:sz="4" w:space="0" w:color="000000"/>
+          <w:insideH w:val="single" w:sz="4" w:space="0" w:color="000000"/>
+          <w:insideV w:val="single" w:sz="4" w:space="0" w:color="000000"/>
+        </w:tblBorders>
       </w:tblPr>
       <w:tblGrid>
         <w:gridCol w:w="9354"/>
@@ -3723,17 +3712,17 @@
         <w:tc>
           <w:tcPr>
             <w:tcW w:type="dxa" w:w="9354"/>
-            <w:shd w:val="clear" w:color="auto" w:fill="F1F5F9"/>
+            <w:shd w:val="clear" w:color="auto" w:fill="F8FAFC"/>
             <w:tcMar>
               <w:top w:w="120" w:type="dxa"/>
-              <w:left w:w="120" w:type="dxa"/>
               <w:bottom w:w="120" w:type="dxa"/>
-              <w:right w:w="120" w:type="dxa"/>
+              <w:left w:w="180" w:type="dxa"/>
+              <w:right w:w="180" w:type="dxa"/>
             </w:tcMar>
           </w:tcPr>
           <w:p>
             <w:pPr>
-              <w:spacing w:after="40" w:before="40"/>
+              <w:spacing w:before="40" w:after="40" w:line="240" w:lineRule="auto"/>
             </w:pPr>
             <w:r>
               <w:rPr>
@@ -3745,40 +3734,23 @@
               <w:br/>
               <w:t xml:space="preserve"> * Модуль базы данных (Database Engine) - ДВУХРЕЖИМНЫЙ (Local Storage &amp; Supabase Cloud)</w:t>
               <w:br/>
-              <w:t xml:space="preserve"> * </w:t>
-              <w:br/>
-              <w:t xml:space="preserve"> * ПОДДЕРЖИВАЕТ ДВА РЕЖИМА:</w:t>
-              <w:br/>
-              <w:t xml:space="preserve"> * 1. Локальный режим (localStorage) - если ключи Supabase не заполнены. Работает оффлайн.</w:t>
-              <w:br/>
-              <w:t xml:space="preserve"> * 2. Облачный режим (Supabase) - если указаны SUPABASE_URL и SUPABASE_KEY. Синхронизирует телефон и ПК!</w:t>
+              <w:t xml:space="preserve"> * Поддерживает Cloud-синхронизацию и автономный режим работы (localStorage).</w:t>
               <w:br/>
               <w:t xml:space="preserve"> */</w:t>
               <w:br/>
-              <w:br/>
-              <w:t>// ====================================================================</w:t>
-              <w:br/>
-              <w:t>// УКАЖИТЕ ЗДЕСЬ ВАШИ КЛЮЧИ ИЗ КАБИНЕТА SUPABASE ДЛЯ СИНХРОНИЗАЦИИ С ТЕЛЕФОНОМ:</w:t>
-              <w:br/>
-              <w:t>// ====================================================================</w:t>
-              <w:br/>
               <w:t>const SUPABASE_URL = 'https://bxgtxtbwiiltabolfcph.supabase.co';</w:t>
               <w:br/>
               <w:t>const SUPABASE_KEY = 'sb_publishable_RQatZXJ0ZXwC3fV9tu9XMg_HN56FOzP';</w:t>
               <w:br/>
               <w:br/>
-              <w:t>// Переименовано в supabaseClient, чтобы избежать конфликта имен (Identifier 'supabase' has already been declared)</w:t>
-              <w:br/>
-              <w:t>// с глобальным объектом 'supabase', который загружает официальная библиотека CDN</w:t>
-              <w:br/>
               <w:t>let supabaseClient = null;</w:t>
               <w:br/>
               <w:t>let isSupabaseMode = false;</w:t>
               <w:br/>
               <w:br/>
-              <w:t>// Инициализация Supabase</w:t>
-              <w:br/>
-              <w:t>if (SUPABASE_URL !== 'YOUR_SUPABASE_URL' &amp;&amp; SUPABASE_KEY !== 'YOUR_SUPABASE_ANON_KEY' &amp;&amp; SUPABASE_URL &amp;&amp; SUPABASE_KEY) {</w:t>
+              <w:t>// Инициализация облака Supabase</w:t>
+              <w:br/>
+              <w:t>if (SUPABASE_URL &amp;&amp; SUPABASE_KEY) {</w:t>
               <w:br/>
               <w:t xml:space="preserve">    try {</w:t>
               <w:br/>
@@ -3790,2692 +3762,222 @@
               <w:br/>
               <w:t xml:space="preserve">    } catch (e) {</w:t>
               <w:br/>
-              <w:t xml:space="preserve">        console.error('Не удалось подключить Supabase. Используется локальный localStorage.', e);</w:t>
+              <w:t xml:space="preserve">        console.error('Ошибка инициализации Supabase. Режим: Offline localStorage.', e);</w:t>
               <w:br/>
               <w:t xml:space="preserve">    }</w:t>
               <w:br/>
-              <w:t>} else {</w:t>
-              <w:br/>
-              <w:t xml:space="preserve">    console.log('📦 Ключи Supabase не заполнены. Используется локальный localStorage.');</w:t>
-              <w:br/>
               <w:t>}</w:t>
               <w:br/>
               <w:br/>
               <w:t>const Database = {</w:t>
               <w:br/>
-              <w:t xml:space="preserve">    // Вспомогательные локальные методы</w:t>
-              <w:br/>
-              <w:t xml:space="preserve">    _get(key, defaultValue = []) {</w:t>
-              <w:br/>
-              <w:t xml:space="preserve">        const data = localStorage.getItem(`qr_attend_${key}`);</w:t>
-              <w:br/>
-              <w:t xml:space="preserve">        return data ? JSON.parse(data) : defaultValue;</w:t>
+              <w:t xml:space="preserve">    // Регистрация нового пользователя (поддерживает Фамилию, Имя, Отчество и Группу)</w:t>
+              <w:br/>
+              <w:t xml:space="preserve">    async registerUser(role, lastName, firstName, patronymic, group, username, password) {</w:t>
+              <w:br/>
+              <w:t xml:space="preserve">        const cleanLastName = (lastName || '').trim();</w:t>
+              <w:br/>
+              <w:t xml:space="preserve">        const cleanFirstName = (firstName || '').trim();</w:t>
+              <w:br/>
+              <w:t xml:space="preserve">        const cleanPatronymic = (patronymic || '').trim();</w:t>
+              <w:br/>
+              <w:t xml:space="preserve">        const cleanGroup = (group || '').trim();</w:t>
+              <w:br/>
+              <w:t xml:space="preserve">        const cleanUsername = (username || '').trim().toLowerCase();</w:t>
+              <w:br/>
+              <w:br/>
+              <w:t xml:space="preserve">        if (isSupabaseMode) {</w:t>
+              <w:br/>
+              <w:t xml:space="preserve">            // Проверка уникальности логина</w:t>
+              <w:br/>
+              <w:t xml:space="preserve">            const { data: existingUser } = await supabaseClient</w:t>
+              <w:br/>
+              <w:t xml:space="preserve">                .from('users')</w:t>
+              <w:br/>
+              <w:t xml:space="preserve">                .select('username')</w:t>
+              <w:br/>
+              <w:t xml:space="preserve">                .eq('username', cleanUsername)</w:t>
+              <w:br/>
+              <w:t xml:space="preserve">                .maybeSingle();</w:t>
+              <w:br/>
+              <w:br/>
+              <w:t xml:space="preserve">            if (existingUser) {</w:t>
+              <w:br/>
+              <w:t xml:space="preserve">                throw new Error('Пользователь с таким логином уже существует');</w:t>
+              <w:br/>
+              <w:t xml:space="preserve">            }</w:t>
+              <w:br/>
+              <w:br/>
+              <w:t xml:space="preserve">            const newUser = {</w:t>
+              <w:br/>
+              <w:t xml:space="preserve">                id: 'usr_' + Date.now() + '_' + Math.random().toString(36).substr(2, 9),</w:t>
+              <w:br/>
+              <w:t xml:space="preserve">                role,</w:t>
+              <w:br/>
+              <w:t xml:space="preserve">                last_name: cleanLastName,</w:t>
+              <w:br/>
+              <w:t xml:space="preserve">                first_name: cleanFirstName,</w:t>
+              <w:br/>
+              <w:t xml:space="preserve">                patronymic: cleanPatronymic,</w:t>
+              <w:br/>
+              <w:t xml:space="preserve">                student_group: role === 'student' ? cleanGroup : '',</w:t>
+              <w:br/>
+              <w:t xml:space="preserve">                username: cleanUsername,</w:t>
+              <w:br/>
+              <w:t xml:space="preserve">                password: password</w:t>
+              <w:br/>
+              <w:t xml:space="preserve">            };</w:t>
+              <w:br/>
+              <w:br/>
+              <w:t xml:space="preserve">            const { error } = await supabaseClient.from('users').insert([newUser]);</w:t>
+              <w:br/>
+              <w:t xml:space="preserve">            if (error) throw new Error('Ошибка БД: ' + error.message);</w:t>
+              <w:br/>
+              <w:t xml:space="preserve">            return newUser;</w:t>
+              <w:br/>
+              <w:t xml:space="preserve">        } else {</w:t>
+              <w:br/>
+              <w:t xml:space="preserve">            // Локальный режим localStorage</w:t>
+              <w:br/>
+              <w:t xml:space="preserve">            const users = this._get('users');</w:t>
+              <w:br/>
+              <w:t xml:space="preserve">            if (users.some(u =&gt; u.username.toLowerCase() === cleanUsername)) {</w:t>
+              <w:br/>
+              <w:t xml:space="preserve">                throw new Error('Пользователь с таким логином уже существует');</w:t>
+              <w:br/>
+              <w:t xml:space="preserve">            }</w:t>
+              <w:br/>
+              <w:t xml:space="preserve">            const newUser = {</w:t>
+              <w:br/>
+              <w:t xml:space="preserve">                id: 'usr_' + Date.now(),</w:t>
+              <w:br/>
+              <w:t xml:space="preserve">                role, lastName: cleanLastName, firstName: cleanFirstName, patronymic: cleanPatronymic,</w:t>
+              <w:br/>
+              <w:t xml:space="preserve">                group: role === 'student' ? cleanGroup : '', username: cleanUsername, password</w:t>
+              <w:br/>
+              <w:t xml:space="preserve">            };</w:t>
+              <w:br/>
+              <w:t xml:space="preserve">            users.push(newUser);</w:t>
+              <w:br/>
+              <w:t xml:space="preserve">            this._set('users', users);</w:t>
+              <w:br/>
+              <w:t xml:space="preserve">            return newUser;</w:t>
+              <w:br/>
+              <w:t xml:space="preserve">        }</w:t>
               <w:br/>
               <w:t xml:space="preserve">    },</w:t>
               <w:br/>
               <w:br/>
-              <w:t xml:space="preserve">    _set(key, data) {</w:t>
-              <w:br/>
-              <w:t xml:space="preserve">        localStorage.setItem(`qr_attend_${key}`, JSON.stringify(data));</w:t>
+              <w:t xml:space="preserve">    // 7-секундный токен безопасности сессии (динамический QR-код)</w:t>
+              <w:br/>
+              <w:t xml:space="preserve">    async updateSessionToken(sessionId) {</w:t>
+              <w:br/>
+              <w:t xml:space="preserve">        const newToken = sessionId + '_tok_' + Math.random().toString(36).substr(2, 5);</w:t>
+              <w:br/>
+              <w:br/>
+              <w:t xml:space="preserve">        if (isSupabaseMode) {</w:t>
+              <w:br/>
+              <w:t xml:space="preserve">            const { error } = await supabaseClient</w:t>
+              <w:br/>
+              <w:t xml:space="preserve">                .from('sessions')</w:t>
+              <w:br/>
+              <w:t xml:space="preserve">                .update({ active_token: newToken })</w:t>
+              <w:br/>
+              <w:t xml:space="preserve">                .eq('id', sessionId);</w:t>
+              <w:br/>
+              <w:t xml:space="preserve">            if (error) return null;</w:t>
+              <w:br/>
+              <w:t xml:space="preserve">            return newToken;</w:t>
+              <w:br/>
+              <w:t xml:space="preserve">        } else {</w:t>
+              <w:br/>
+              <w:t xml:space="preserve">            const sessions = this._get('sessions');</w:t>
+              <w:br/>
+              <w:t xml:space="preserve">            const session = sessions.find(s =&gt; s.id === sessionId);</w:t>
+              <w:br/>
+              <w:t xml:space="preserve">            if (!session || !session.isActive) return null;</w:t>
+              <w:br/>
+              <w:t xml:space="preserve">            session.activeToken = newToken;</w:t>
+              <w:br/>
+              <w:t xml:space="preserve">            this._set('sessions', sessions);</w:t>
+              <w:br/>
+              <w:t xml:space="preserve">            return newToken;</w:t>
+              <w:br/>
+              <w:t xml:space="preserve">        }</w:t>
               <w:br/>
               <w:t xml:space="preserve">    },</w:t>
               <w:br/>
               <w:br/>
-              <w:t xml:space="preserve">    // --- УПРАВЛЕНИЕ ПОЛЬЗОВАТЕЛЯМИ (АВТОРИЗАЦИЯ) ---</w:t>
-              <w:br/>
-              <w:br/>
-              <w:t xml:space="preserve">    /**</w:t>
-              <w:br/>
-              <w:t xml:space="preserve">     * Регистрация нового пользователя</w:t>
-              <w:br/>
-              <w:t xml:space="preserve">     */</w:t>
-              <w:br/>
-              <w:t xml:space="preserve">    async registerUser(role, lastName, firstName, patronymic, group, username, password) {</w:t>
-              <w:br/>
-              <w:t xml:space="preserve">        // Защита от undefined и лишних пробелов</w:t>
-              <w:br/>
-              <w:t xml:space="preserve">        const cleanLastName = (lastName || '').trim();</w:t>
-              <w:br/>
-              <w:t xml:space="preserve">        const cleanFirstName = (firstName || '').trim();</w:t>
-              <w:br/>
-              <w:t xml:space="preserve">        const cleanPatronymic = (patronymic || '').trim();</w:t>
-              <w:br/>
-              <w:t xml:space="preserve">        const cleanGroup = (group || '').trim();</w:t>
-              <w:br/>
-              <w:t xml:space="preserve">        const cleanUsername = (username || '').trim().toLowerCase();</w:t>
+              <w:t xml:space="preserve">    // Студент белгісі (Проверка времени действия QR-кода и токена)</w:t>
+              <w:br/>
+              <w:t xml:space="preserve">    async checkInStudent(studentId, scannedToken) {</w:t>
+              <w:br/>
+              <w:t xml:space="preserve">        const sessionId = scannedToken.split('_tok_')[0];</w:t>
               <w:br/>
               <w:br/>
               <w:t xml:space="preserve">        if (isSupabaseMode) {</w:t>
               <w:br/>
-              <w:t xml:space="preserve">            // Проверка логина</w:t>
-              <w:br/>
-              <w:t xml:space="preserve">            const { data: existingUser } = await supabaseClient</w:t>
-              <w:br/>
-              <w:t xml:space="preserve">                .from('users')</w:t>
-              <w:br/>
-              <w:t xml:space="preserve">                .select('username')</w:t>
-              <w:br/>
-              <w:t xml:space="preserve">                .eq('username', cleanUsername)</w:t>
+              <w:t xml:space="preserve">            const { data: session } = await supabaseClient</w:t>
+              <w:br/>
+              <w:t xml:space="preserve">                .from('sessions')</w:t>
+              <w:br/>
+              <w:t xml:space="preserve">                .select('*')</w:t>
+              <w:br/>
+              <w:t xml:space="preserve">                .eq('id', sessionId)</w:t>
               <w:br/>
               <w:t xml:space="preserve">                .maybeSingle();</w:t>
               <w:br/>
               <w:br/>
-              <w:t xml:space="preserve">            if (existingUser) {</w:t>
-              <w:br/>
-              <w:t xml:space="preserve">                throw new Error('Пользователь с таким логином уже существует');</w:t>
-              <w:br/>
-              <w:t xml:space="preserve">            }</w:t>
-              <w:br/>
-              <w:br/>
-              <w:t xml:space="preserve">            const newUser = {</w:t>
-              <w:br/>
-              <w:t xml:space="preserve">                id: 'usr_' + Date.now() + '_' + Math.random().toString(36).substr(2, 9),</w:t>
-              <w:br/>
-              <w:t xml:space="preserve">                role,</w:t>
-              <w:br/>
-              <w:t xml:space="preserve">                last_name: cleanLastName,</w:t>
-              <w:br/>
-              <w:t xml:space="preserve">                first_name: cleanFirstName,</w:t>
-              <w:br/>
-              <w:t xml:space="preserve">                patronymic: cleanPatronymic,</w:t>
-              <w:br/>
-              <w:t xml:space="preserve">                student_group: role === 'student' ? cleanGroup : '',</w:t>
-              <w:br/>
-              <w:t xml:space="preserve">                username: cleanUsername,</w:t>
-              <w:br/>
-              <w:t xml:space="preserve">                password: password</w:t>
+              <w:t xml:space="preserve">            if (!session) throw new Error('Занятие не найдено');</w:t>
+              <w:br/>
+              <w:t xml:space="preserve">            if (!session.is_active) throw new Error('Срок действия QR-кода истек!');</w:t>
+              <w:br/>
+              <w:t xml:space="preserve">            if (session.active_token !== scannedToken) throw new Error('QR-код устарел! Отсканируйте свежий.');</w:t>
+              <w:br/>
+              <w:br/>
+              <w:t xml:space="preserve">            const { data: existing } = await supabaseClient</w:t>
+              <w:br/>
+              <w:t xml:space="preserve">                .from('attendance')</w:t>
+              <w:br/>
+              <w:t xml:space="preserve">                .select('id')</w:t>
+              <w:br/>
+              <w:t xml:space="preserve">                .eq('session_id', sessionId)</w:t>
+              <w:br/>
+              <w:t xml:space="preserve">                .eq('student_id', studentId)</w:t>
+              <w:br/>
+              <w:t xml:space="preserve">                .maybeSingle();</w:t>
+              <w:br/>
+              <w:br/>
+              <w:t xml:space="preserve">            if (existing) return { success: true, message: 'Вы уже отметились!' };</w:t>
+              <w:br/>
+              <w:br/>
+              <w:t xml:space="preserve">            const now = new Date();</w:t>
+              <w:br/>
+              <w:t xml:space="preserve">            const timeStr = now.toLocaleTimeString('ru-RU', { hour: '2-digit', minute: '2-digit' });</w:t>
+              <w:br/>
+              <w:t xml:space="preserve">            const newRecord = {</w:t>
+              <w:br/>
+              <w:t xml:space="preserve">                id: 'att_' + Date.now(),</w:t>
+              <w:br/>
+              <w:t xml:space="preserve">                session_id: sessionId,</w:t>
+              <w:br/>
+              <w:t xml:space="preserve">                student_id: studentId,</w:t>
+              <w:br/>
+              <w:t xml:space="preserve">                timestamp: timeStr</w:t>
               <w:br/>
               <w:t xml:space="preserve">            };</w:t>
               <w:br/>
-              <w:br/>
-              <w:t xml:space="preserve">            const { error } = await supabaseClient</w:t>
-              <w:br/>
-              <w:t xml:space="preserve">                .from('users')</w:t>
-              <w:br/>
-              <w:t xml:space="preserve">                .insert([newUser]);</w:t>
-              <w:br/>
-              <w:br/>
-              <w:t xml:space="preserve">            if (error) throw new Error('Ошибка базы данных: ' + error.message);</w:t>
-              <w:br/>
-              <w:t xml:space="preserve">            </w:t>
-              <w:br/>
-              <w:t xml:space="preserve">            return newUser;</w:t>
-              <w:br/>
-              <w:t xml:space="preserve">        } else {</w:t>
-              <w:br/>
-              <w:t xml:space="preserve">            // Локальный режим</w:t>
-              <w:br/>
-              <w:t xml:space="preserve">            const users = this._get('users');</w:t>
-              <w:br/>
-              <w:t xml:space="preserve">            const exists = users.some(u =&gt; u.username.toLowerCase() === cleanUsername);</w:t>
-              <w:br/>
-              <w:t xml:space="preserve">            if (exists) {</w:t>
-              <w:br/>
-              <w:t xml:space="preserve">                throw new Error('Пользователь с таким логином уже существует');</w:t>
-              <w:br/>
-              <w:t xml:space="preserve">            }</w:t>
-              <w:br/>
-              <w:br/>
-              <w:t xml:space="preserve">            const newUser = {</w:t>
-              <w:br/>
-              <w:t xml:space="preserve">                id: 'usr_' + Date.now() + '_' + Math.random().toString(36).substr(2, 9),</w:t>
-              <w:br/>
-              <w:t xml:space="preserve">                role,</w:t>
-              <w:br/>
-              <w:t xml:space="preserve">                lastName: cleanLastName,</w:t>
-              <w:br/>
-              <w:t xml:space="preserve">                firstName: cleanFirstName,</w:t>
-              <w:br/>
-              <w:t xml:space="preserve">                patronymic: cleanPatronymic,</w:t>
-              <w:br/>
-              <w:t xml:space="preserve">                group: role === 'student' ? cleanGroup : '',</w:t>
-              <w:br/>
-              <w:t xml:space="preserve">                username: cleanUsername,</w:t>
-              <w:br/>
-              <w:t xml:space="preserve">                password: password</w:t>
-              <w:br/>
-              <w:t xml:space="preserve">            };</w:t>
-              <w:br/>
-              <w:br/>
-              <w:t xml:space="preserve">            users.push(newUser);</w:t>
-              <w:br/>
-              <w:t xml:space="preserve">            this._set('users', users);</w:t>
-              <w:br/>
-              <w:t xml:space="preserve">            return newUser;</w:t>
+              <w:t xml:space="preserve">            const { error } = await supabaseClient.from('attendance').insert([newRecord]);</w:t>
+              <w:br/>
+              <w:t xml:space="preserve">            if (error) throw new Error(error.message);</w:t>
+              <w:br/>
+              <w:t xml:space="preserve">            return { success: true, message: 'Посещение успешно отмечено!' };</w:t>
               <w:br/>
               <w:t xml:space="preserve">        }</w:t>
               <w:br/>
-              <w:t xml:space="preserve">    },</w:t>
-              <w:br/>
-              <w:br/>
-              <w:t xml:space="preserve">    /**</w:t>
-              <w:br/>
-              <w:t xml:space="preserve">     * Вход пользователя в систему</w:t>
-              <w:br/>
-              <w:t xml:space="preserve">     */</w:t>
-              <w:br/>
-              <w:t xml:space="preserve">    async loginUser(role, username, password) {</w:t>
-              <w:br/>
-              <w:t xml:space="preserve">        if (isSupabaseMode) {</w:t>
-              <w:br/>
-              <w:t xml:space="preserve">            const { data: user, error } = await supabaseClient</w:t>
-              <w:br/>
-              <w:t xml:space="preserve">                .from('users')</w:t>
-              <w:br/>
-              <w:t xml:space="preserve">                .select('*')</w:t>
-              <w:br/>
-              <w:t xml:space="preserve">                .eq('username', username.trim().toLowerCase())</w:t>
-              <w:br/>
-              <w:t xml:space="preserve">                .maybeSingle();</w:t>
-              <w:br/>
-              <w:br/>
-              <w:t xml:space="preserve">            if (error || !user) {</w:t>
-              <w:br/>
-              <w:t xml:space="preserve">                throw new Error('Неверный логин или пароль');</w:t>
-              <w:br/>
-              <w:t xml:space="preserve">            }</w:t>
-              <w:br/>
-              <w:br/>
-              <w:t xml:space="preserve">            if (user.password !== password) {</w:t>
-              <w:br/>
-              <w:t xml:space="preserve">                throw new Error('Неверный логин или пароль');</w:t>
-              <w:br/>
-              <w:t xml:space="preserve">            }</w:t>
-              <w:br/>
-              <w:br/>
-              <w:t xml:space="preserve">            if (user.role !== role) {</w:t>
-              <w:br/>
-              <w:t xml:space="preserve">                throw new Error(role === 'teacher' </w:t>
-              <w:br/>
-              <w:t xml:space="preserve">                    ? 'Этот аккаунт не преподаватель' </w:t>
-              <w:br/>
-              <w:t xml:space="preserve">                    : 'Этот аккаунт не студент'</w:t>
-              <w:br/>
-              <w:t xml:space="preserve">                );</w:t>
-              <w:br/>
-              <w:t xml:space="preserve">            }</w:t>
-              <w:br/>
-              <w:br/>
-              <w:t xml:space="preserve">            const sessionUser = {</w:t>
-              <w:br/>
-              <w:t xml:space="preserve">                id: user.id,</w:t>
-              <w:br/>
-              <w:t xml:space="preserve">                role: user.role,</w:t>
-              <w:br/>
-              <w:t xml:space="preserve">                lastName: user.last_name,</w:t>
-              <w:br/>
-              <w:t xml:space="preserve">                firstName: user.first_name,</w:t>
-              <w:br/>
-              <w:t xml:space="preserve">                patronymic: user.patronymic,</w:t>
-              <w:br/>
-              <w:t xml:space="preserve">                group: user.student_group,</w:t>
-              <w:br/>
-              <w:t xml:space="preserve">                username: user.username</w:t>
-              <w:br/>
-              <w:t xml:space="preserve">            };</w:t>
-              <w:br/>
-              <w:t xml:space="preserve">            </w:t>
-              <w:br/>
-              <w:t xml:space="preserve">            try {</w:t>
-              <w:br/>
-              <w:t xml:space="preserve">                sessionStorage.setItem('qr_attend_current_session', JSON.stringify(sessionUser));</w:t>
-              <w:br/>
-              <w:t xml:space="preserve">            } catch (e) {</w:t>
-              <w:br/>
-              <w:t xml:space="preserve">                console.warn('sessionStorage is not accessible', e);</w:t>
-              <w:br/>
-              <w:t xml:space="preserve">            }</w:t>
-              <w:br/>
-              <w:t xml:space="preserve">            return sessionUser;</w:t>
-              <w:br/>
-              <w:t xml:space="preserve">        } else {</w:t>
-              <w:br/>
-              <w:t xml:space="preserve">            // Локальный режим</w:t>
-              <w:br/>
-              <w:t xml:space="preserve">            const users = this._get('users');</w:t>
-              <w:br/>
-              <w:t xml:space="preserve">            const user = users.find(u =&gt; u.username.toLowerCase() === username.trim().toLowerCase());</w:t>
-              <w:br/>
-              <w:br/>
-              <w:t xml:space="preserve">            if (!user || user.password !== password) {</w:t>
-              <w:br/>
-              <w:t xml:space="preserve">                throw new Error('Неверный логин или пароль');</w:t>
-              <w:br/>
-              <w:t xml:space="preserve">            }</w:t>
-              <w:br/>
-              <w:br/>
-              <w:t xml:space="preserve">            if (user.role !== role) {</w:t>
-              <w:br/>
-              <w:t xml:space="preserve">                throw new Error(role === 'teacher' </w:t>
-              <w:br/>
-              <w:t xml:space="preserve">                    ? 'Этот аккаунт не преподаватель' </w:t>
-              <w:br/>
-              <w:t xml:space="preserve">                    : 'Этот аккаунт не студент'</w:t>
-              <w:br/>
-              <w:t xml:space="preserve">                );</w:t>
-              <w:br/>
-              <w:t xml:space="preserve">            }</w:t>
-              <w:br/>
-              <w:br/>
-              <w:t xml:space="preserve">            const sessionUser = {</w:t>
-              <w:br/>
-              <w:t xml:space="preserve">                id: user.id,</w:t>
-              <w:br/>
-              <w:t xml:space="preserve">                role: user.role,</w:t>
-              <w:br/>
-              <w:t xml:space="preserve">                lastName: user.lastName,</w:t>
-              <w:br/>
-              <w:t xml:space="preserve">                firstName: user.firstName,</w:t>
-              <w:br/>
-              <w:t xml:space="preserve">                patronymic: user.patronymic,</w:t>
-              <w:br/>
-              <w:t xml:space="preserve">                group: user.group,</w:t>
-              <w:br/>
-              <w:t xml:space="preserve">                username: user.username</w:t>
-              <w:br/>
-              <w:t xml:space="preserve">            };</w:t>
-              <w:br/>
-              <w:t xml:space="preserve">            </w:t>
-              <w:br/>
-              <w:t xml:space="preserve">            try {</w:t>
-              <w:br/>
-              <w:t xml:space="preserve">                sessionStorage.setItem('qr_attend_current_session', JSON.stringify(sessionUser));</w:t>
-              <w:br/>
-              <w:t xml:space="preserve">            } catch (e) {</w:t>
-              <w:br/>
-              <w:t xml:space="preserve">                console.warn('sessionStorage is not accessible', e);</w:t>
-              <w:br/>
-              <w:t xml:space="preserve">            }</w:t>
-              <w:br/>
-              <w:t xml:space="preserve">            return sessionUser;</w:t>
-              <w:br/>
-              <w:t xml:space="preserve">        }</w:t>
-              <w:br/>
-              <w:t xml:space="preserve">    },</w:t>
-              <w:br/>
-              <w:br/>
-              <w:t xml:space="preserve">    getCurrentUser() {</w:t>
-              <w:br/>
-              <w:t xml:space="preserve">        try {</w:t>
-              <w:br/>
-              <w:t xml:space="preserve">            const session = sessionStorage.getItem('qr_attend_current_session');</w:t>
-              <w:br/>
-              <w:t xml:space="preserve">            return session ? JSON.parse(session) : null;</w:t>
-              <w:br/>
-              <w:t xml:space="preserve">        } catch (e) {</w:t>
-              <w:br/>
-              <w:t xml:space="preserve">            sessionStorage.removeItem('qr_attend_current_session');</w:t>
-              <w:br/>
-              <w:t xml:space="preserve">            return null;</w:t>
-              <w:br/>
-              <w:t xml:space="preserve">        }</w:t>
-              <w:br/>
-              <w:t xml:space="preserve">    },</w:t>
-              <w:br/>
-              <w:br/>
-              <w:t xml:space="preserve">    logout() {</w:t>
-              <w:br/>
-              <w:t xml:space="preserve">        try {</w:t>
-              <w:br/>
-              <w:t xml:space="preserve">            sessionStorage.removeItem('qr_attend_current_session');</w:t>
-              <w:br/>
-              <w:t xml:space="preserve">        } catch (e) {</w:t>
-              <w:br/>
-              <w:t xml:space="preserve">            console.warn('sessionStorage is not accessible', e);</w:t>
-              <w:br/>
-              <w:t xml:space="preserve">        }</w:t>
-              <w:br/>
-              <w:t xml:space="preserve">    },</w:t>
-              <w:br/>
-              <w:br/>
-              <w:t xml:space="preserve">    // --- УПРАВЛЕНИЕ ПРЕДМЕТАМИ ---</w:t>
-              <w:br/>
-              <w:br/>
-              <w:t xml:space="preserve">    async getSubjects(teacherId) {</w:t>
-              <w:br/>
-              <w:t xml:space="preserve">        if (isSupabaseMode) {</w:t>
-              <w:br/>
-              <w:t xml:space="preserve">            const { data: subjects } = await supabaseClient</w:t>
-              <w:br/>
-              <w:t xml:space="preserve">                .from('subjects')</w:t>
-              <w:br/>
-              <w:t xml:space="preserve">                .select('*')</w:t>
-              <w:br/>
-              <w:t xml:space="preserve">                .eq('teacher_id', teacherId);</w:t>
-              <w:br/>
-              <w:t xml:space="preserve">            </w:t>
-              <w:br/>
-              <w:t xml:space="preserve">            return (subjects || []).map(s =&gt; ({</w:t>
-              <w:br/>
-              <w:t xml:space="preserve">                id: s.id,</w:t>
-              <w:br/>
-              <w:t xml:space="preserve">                name: s.name,</w:t>
-              <w:br/>
-              <w:t xml:space="preserve">                teacherId: s.teacher_id</w:t>
-              <w:br/>
-              <w:t xml:space="preserve">            }));</w:t>
-              <w:br/>
-              <w:t xml:space="preserve">        } else {</w:t>
-              <w:br/>
-              <w:t xml:space="preserve">            const subjects = this._get('subjects');</w:t>
-              <w:br/>
-              <w:t xml:space="preserve">            return subjects.filter(s =&gt; s.teacherId === teacherId);</w:t>
-              <w:br/>
-              <w:t xml:space="preserve">        }</w:t>
-              <w:br/>
-              <w:t xml:space="preserve">    },</w:t>
-              <w:br/>
-              <w:br/>
-              <w:t xml:space="preserve">    async getSubjectById(subjectId) {</w:t>
-              <w:br/>
-              <w:t xml:space="preserve">        if (isSupabaseMode) {</w:t>
-              <w:br/>
-              <w:t xml:space="preserve">            const { data: subject } = await supabaseClient</w:t>
-              <w:br/>
-              <w:t xml:space="preserve">                .from('subjects')</w:t>
-              <w:br/>
-              <w:t xml:space="preserve">                .select('*')</w:t>
-              <w:br/>
-              <w:t xml:space="preserve">                .eq('id', subjectId)</w:t>
-              <w:br/>
-              <w:t xml:space="preserve">                .maybeSingle();</w:t>
-              <w:br/>
-              <w:t xml:space="preserve">            </w:t>
-              <w:br/>
-              <w:t xml:space="preserve">            if (!subject) return null;</w:t>
-              <w:br/>
-              <w:t xml:space="preserve">            return {</w:t>
-              <w:br/>
-              <w:t xml:space="preserve">                id: subject.id,</w:t>
-              <w:br/>
-              <w:t xml:space="preserve">                name: subject.name,</w:t>
-              <w:br/>
-              <w:t xml:space="preserve">                teacherId: subject.teacher_id</w:t>
-              <w:br/>
-              <w:t xml:space="preserve">            };</w:t>
-              <w:br/>
-              <w:t xml:space="preserve">        } else {</w:t>
-              <w:br/>
-              <w:t xml:space="preserve">            const subjects = this._get('subjects');</w:t>
-              <w:br/>
-              <w:t xml:space="preserve">            return subjects.find(s =&gt; s.id === subjectId) || null;</w:t>
-              <w:br/>
-              <w:t xml:space="preserve">        }</w:t>
-              <w:br/>
-              <w:t xml:space="preserve">    },</w:t>
-              <w:br/>
-              <w:br/>
-              <w:t xml:space="preserve">    async addSubject(name, teacherId) {</w:t>
-              <w:br/>
-              <w:t xml:space="preserve">        if (isSupabaseMode) {</w:t>
-              <w:br/>
-              <w:t xml:space="preserve">            // Проверка названия</w:t>
-              <w:br/>
-              <w:t xml:space="preserve">            const { data: existing } = await supabaseClient</w:t>
-              <w:br/>
-              <w:t xml:space="preserve">                .from('subjects')</w:t>
-              <w:br/>
-              <w:t xml:space="preserve">                .select('id')</w:t>
-              <w:br/>
-              <w:t xml:space="preserve">                .eq('name', name.trim())</w:t>
-              <w:br/>
-              <w:t xml:space="preserve">                .eq('teacher_id', teacherId)</w:t>
-              <w:br/>
-              <w:t xml:space="preserve">                .maybeSingle();</w:t>
-              <w:br/>
-              <w:br/>
-              <w:t xml:space="preserve">            if (existing) {</w:t>
-              <w:br/>
-              <w:t xml:space="preserve">                throw new Error('Предмет с таким названием уже существует');</w:t>
-              <w:br/>
-              <w:t xml:space="preserve">            }</w:t>
-              <w:br/>
-              <w:br/>
-              <w:t xml:space="preserve">            const newSubject = {</w:t>
-              <w:br/>
-              <w:t xml:space="preserve">                id: 'sub_' + Date.now() + '_' + Math.random().toString(36).substr(2, 9),</w:t>
-              <w:br/>
-              <w:t xml:space="preserve">                name: name.trim(),</w:t>
-              <w:br/>
-              <w:t xml:space="preserve">                teacher_id: teacherId</w:t>
-              <w:br/>
-              <w:t xml:space="preserve">            };</w:t>
-              <w:br/>
-              <w:br/>
-              <w:t xml:space="preserve">            const { error } = await supabaseClient</w:t>
-              <w:br/>
-              <w:t xml:space="preserve">                .from('subjects')</w:t>
-              <w:br/>
-              <w:t xml:space="preserve">                .insert([newSubject]);</w:t>
-              <w:br/>
-              <w:br/>
-              <w:t xml:space="preserve">            if (error) throw new Error(error.message);</w:t>
-              <w:br/>
-              <w:br/>
-              <w:t xml:space="preserve">            return {</w:t>
-              <w:br/>
-              <w:t xml:space="preserve">                id: newSubject.id,</w:t>
-              <w:br/>
-              <w:t xml:space="preserve">                name: newSubject.name,</w:t>
-              <w:br/>
-              <w:t xml:space="preserve">                teacherId: newSubject.teacher_id</w:t>
-              <w:br/>
-              <w:t xml:space="preserve">            };</w:t>
-              <w:br/>
-              <w:t xml:space="preserve">        } else {</w:t>
-              <w:br/>
-              <w:t xml:space="preserve">            const subjects = this._get('subjects');</w:t>
-              <w:br/>
-              <w:t xml:space="preserve">            const exists = subjects.some(s =&gt; s.name.toLowerCase() === name.trim().toLowerCase() &amp;&amp; s.teacherId === teacherId);</w:t>
-              <w:br/>
-              <w:t xml:space="preserve">            if (exists) {</w:t>
-              <w:br/>
-              <w:t xml:space="preserve">                throw new Error('Предмет с таким названием уже существует');</w:t>
-              <w:br/>
-              <w:t xml:space="preserve">            }</w:t>
-              <w:br/>
-              <w:br/>
-              <w:t xml:space="preserve">            const newSubject = {</w:t>
-              <w:br/>
-              <w:t xml:space="preserve">                id: 'sub_' + Date.now() + '_' + Math.random().toString(36).substr(2, 9),</w:t>
-              <w:br/>
-              <w:t xml:space="preserve">                name: name.trim(),</w:t>
-              <w:br/>
-              <w:t xml:space="preserve">                teacherId</w:t>
-              <w:br/>
-              <w:t xml:space="preserve">            };</w:t>
-              <w:br/>
-              <w:br/>
-              <w:t xml:space="preserve">            subjects.push(newSubject);</w:t>
-              <w:br/>
-              <w:t xml:space="preserve">            this._set('subjects', subjects);</w:t>
-              <w:br/>
-              <w:t xml:space="preserve">            return newSubject;</w:t>
-              <w:br/>
-              <w:t xml:space="preserve">        }</w:t>
-              <w:br/>
-              <w:t xml:space="preserve">    },</w:t>
-              <w:br/>
-              <w:br/>
-              <w:t xml:space="preserve">    // --- УПРАВЛЕНИЕ СЕССИЯМИ ---</w:t>
-              <w:br/>
-              <w:br/>
-              <w:t xml:space="preserve">    async startSession(subjectId) {</w:t>
-              <w:br/>
-              <w:t xml:space="preserve">        // Дни недели на русском</w:t>
-              <w:br/>
-              <w:t xml:space="preserve">        const daysOfWeek = ['Воскресенье', 'Понедельник', 'Вторник', 'Среда', 'Четверг', 'Пятница', 'Суббота'];</w:t>
-              <w:br/>
-              <w:t xml:space="preserve">        const now = new Date();</w:t>
-              <w:br/>
-              <w:t xml:space="preserve">        const dayName = daysOfWeek[now.getDay()];</w:t>
-              <w:br/>
-              <w:t xml:space="preserve">        const dateStr = now.toLocaleDateString('ru-RU', { day: '2-digit', month: '2-digit', year: 'numeric' });</w:t>
-              <w:br/>
-              <w:t xml:space="preserve">        const timeStr = now.toLocaleTimeString('ru-RU', { hour: '2-digit', minute: '2-digit' });</w:t>
-              <w:br/>
-              <w:br/>
-              <w:t xml:space="preserve">        const sessionId = 'ses_' + Date.now() + '_' + Math.random().toString(36).substr(2, 9);</w:t>
-              <w:br/>
-              <w:t xml:space="preserve">        const initialToken = sessionId + '_tok_' + Math.random().toString(36).substr(2, 5);</w:t>
-              <w:br/>
-              <w:br/>
-              <w:t xml:space="preserve">        if (isSupabaseMode) {</w:t>
-              <w:br/>
-              <w:t xml:space="preserve">            // Деактивируем прошлые сессии</w:t>
-              <w:br/>
-              <w:t xml:space="preserve">            await supabaseClient</w:t>
-              <w:br/>
-              <w:t xml:space="preserve">                .from('sessions')</w:t>
-              <w:br/>
-              <w:t xml:space="preserve">                .update({ is_active: false })</w:t>
-              <w:br/>
-              <w:t xml:space="preserve">                .eq('subject_id', subjectId);</w:t>
-              <w:br/>
-              <w:br/>
-              <w:t xml:space="preserve">            const newSession = {</w:t>
-              <w:br/>
-              <w:t xml:space="preserve">                id: sessionId,</w:t>
-              <w:br/>
-              <w:t xml:space="preserve">                subject_id: subjectId,</w:t>
-              <w:br/>
-              <w:t xml:space="preserve">                date: dateStr,</w:t>
-              <w:br/>
-              <w:t xml:space="preserve">                time: timeStr,</w:t>
-              <w:br/>
-              <w:t xml:space="preserve">                day_of_week: dayName,</w:t>
-              <w:br/>
-              <w:t xml:space="preserve">                is_active: true,</w:t>
-              <w:br/>
-              <w:t xml:space="preserve">                active_token: initialToken</w:t>
-              <w:br/>
-              <w:t xml:space="preserve">            };</w:t>
-              <w:br/>
-              <w:br/>
-              <w:t xml:space="preserve">            const { error } = await supabaseClient</w:t>
-              <w:br/>
-              <w:t xml:space="preserve">                .from('sessions')</w:t>
-              <w:br/>
-              <w:t xml:space="preserve">                .insert([newSession]);</w:t>
-              <w:br/>
-              <w:br/>
-              <w:t xml:space="preserve">            if (error) throw new Error(error.message);</w:t>
-              <w:br/>
-              <w:br/>
-              <w:t xml:space="preserve">            return {</w:t>
-              <w:br/>
-              <w:t xml:space="preserve">                id: newSession.id,</w:t>
-              <w:br/>
-              <w:t xml:space="preserve">                subjectId: newSession.subject_id,</w:t>
-              <w:br/>
-              <w:t xml:space="preserve">                date: newSession.date,</w:t>
-              <w:br/>
-              <w:t xml:space="preserve">                time: newSession.time,</w:t>
-              <w:br/>
-              <w:t xml:space="preserve">                dayOfWeek: newSession.day_of_week,</w:t>
-              <w:br/>
-              <w:t xml:space="preserve">                isActive: newSession.is_active,</w:t>
-              <w:br/>
-              <w:t xml:space="preserve">                activeToken: newSession.active_token</w:t>
-              <w:br/>
-              <w:t xml:space="preserve">            };</w:t>
-              <w:br/>
-              <w:t xml:space="preserve">        } else {</w:t>
-              <w:br/>
-              <w:t xml:space="preserve">            const sessions = this._get('sessions');</w:t>
-              <w:br/>
-              <w:t xml:space="preserve">            sessions.forEach(s =&gt; {</w:t>
-              <w:br/>
-              <w:t xml:space="preserve">                if (s.subjectId === subjectId) s.isActive = false;</w:t>
-              <w:br/>
-              <w:t xml:space="preserve">            });</w:t>
-              <w:br/>
-              <w:br/>
-              <w:t xml:space="preserve">            const newSession = {</w:t>
-              <w:br/>
-              <w:t xml:space="preserve">                id: sessionId,</w:t>
-              <w:br/>
-              <w:t xml:space="preserve">                subjectId,</w:t>
-              <w:br/>
-              <w:t xml:space="preserve">                date: dateStr,</w:t>
-              <w:br/>
-              <w:t xml:space="preserve">                time: timeStr,</w:t>
-              <w:br/>
-              <w:t xml:space="preserve">                dayOfWeek: dayName,</w:t>
-              <w:br/>
-              <w:t xml:space="preserve">                isActive: true,</w:t>
-              <w:br/>
-              <w:t xml:space="preserve">                activeToken: initialToken</w:t>
-              <w:br/>
-              <w:t xml:space="preserve">            };</w:t>
-              <w:br/>
-              <w:br/>
-              <w:t xml:space="preserve">            sessions.push(newSession);</w:t>
-              <w:br/>
-              <w:t xml:space="preserve">            this._set('sessions', sessions);</w:t>
-              <w:br/>
-              <w:t xml:space="preserve">            return newSession;</w:t>
-              <w:br/>
-              <w:t xml:space="preserve">        }</w:t>
-              <w:br/>
-              <w:t xml:space="preserve">    },</w:t>
-              <w:br/>
-              <w:br/>
-              <w:t xml:space="preserve">    async updateSessionToken(sessionId) {</w:t>
-              <w:br/>
-              <w:t xml:space="preserve">        const newToken = sessionId + '_tok_' + Math.random().toString(36).substr(2, 5);</w:t>
-              <w:br/>
-              <w:br/>
-              <w:t xml:space="preserve">        if (isSupabaseMode) {</w:t>
-              <w:br/>
-              <w:t xml:space="preserve">            const { error } = await supabaseClient</w:t>
-              <w:br/>
-              <w:t xml:space="preserve">                .from('sessions')</w:t>
-              <w:br/>
-              <w:t xml:space="preserve">                .update({ active_token: newToken })</w:t>
-              <w:br/>
-              <w:t xml:space="preserve">                .eq('id', sessionId);</w:t>
-              <w:br/>
-              <w:br/>
-              <w:t xml:space="preserve">            if (error) return null;</w:t>
-              <w:br/>
-              <w:t xml:space="preserve">            return newToken;</w:t>
-              <w:br/>
-              <w:t xml:space="preserve">        } else {</w:t>
-              <w:br/>
-              <w:t xml:space="preserve">            const sessions = this._get('sessions');</w:t>
-              <w:br/>
-              <w:t xml:space="preserve">            const session = sessions.find(s =&gt; s.id === sessionId);</w:t>
-              <w:br/>
-              <w:t xml:space="preserve">            if (!session || !session.isActive) return null;</w:t>
-              <w:br/>
-              <w:br/>
-              <w:t xml:space="preserve">            session.activeToken = newToken;</w:t>
-              <w:br/>
-              <w:t xml:space="preserve">            this._set('sessions', sessions);</w:t>
-              <w:br/>
-              <w:t xml:space="preserve">            return newToken;</w:t>
-              <w:br/>
-              <w:t xml:space="preserve">        }</w:t>
-              <w:br/>
-              <w:t xml:space="preserve">    },</w:t>
-              <w:br/>
-              <w:br/>
-              <w:t xml:space="preserve">    async getSessions(subjectId) {</w:t>
-              <w:br/>
-              <w:t xml:space="preserve">        if (isSupabaseMode) {</w:t>
-              <w:br/>
-              <w:t xml:space="preserve">            const { data: sessions } = await supabaseClient</w:t>
-              <w:br/>
-              <w:t xml:space="preserve">                .from('sessions')</w:t>
-              <w:br/>
-              <w:t xml:space="preserve">                .select('*')</w:t>
-              <w:br/>
-              <w:t xml:space="preserve">                .eq('subject_id', subjectId)</w:t>
-              <w:br/>
-              <w:t xml:space="preserve">                .order('created_at', { ascending: false });</w:t>
-              <w:br/>
-              <w:br/>
-              <w:t xml:space="preserve">            return (sessions || []).map(s =&gt; ({</w:t>
-              <w:br/>
-              <w:t xml:space="preserve">                id: s.id,</w:t>
-              <w:br/>
-              <w:t xml:space="preserve">                subjectId: s.subject_id,</w:t>
-              <w:br/>
-              <w:t xml:space="preserve">                date: s.date,</w:t>
-              <w:br/>
-              <w:t xml:space="preserve">                time: s.time,</w:t>
-              <w:br/>
-              <w:t xml:space="preserve">                dayOfWeek: s.day_of_week,</w:t>
-              <w:br/>
-              <w:t xml:space="preserve">                isActive: s.is_active,</w:t>
-              <w:br/>
-              <w:t xml:space="preserve">                activeToken: s.active_token</w:t>
-              <w:br/>
-              <w:t xml:space="preserve">            }));</w:t>
-              <w:br/>
-              <w:t xml:space="preserve">        } else {</w:t>
-              <w:br/>
-              <w:t xml:space="preserve">            const sessions = this._get('sessions');</w:t>
-              <w:br/>
-              <w:t xml:space="preserve">            return sessions</w:t>
-              <w:br/>
-              <w:t xml:space="preserve">                .filter(s =&gt; s.subjectId === subjectId)</w:t>
-              <w:br/>
-              <w:t xml:space="preserve">                .sort((a, b) =&gt; b.id.localeCompare(a.id));</w:t>
-              <w:br/>
-              <w:t xml:space="preserve">        }</w:t>
-              <w:br/>
-              <w:t xml:space="preserve">    },</w:t>
-              <w:br/>
-              <w:br/>
-              <w:t xml:space="preserve">    async getSessionById(sessionId) {</w:t>
-              <w:br/>
-              <w:t xml:space="preserve">        if (isSupabaseMode) {</w:t>
-              <w:br/>
-              <w:t xml:space="preserve">            const { data: session } = await supabaseClient</w:t>
-              <w:br/>
-              <w:t xml:space="preserve">                .from('sessions')</w:t>
-              <w:br/>
-              <w:t xml:space="preserve">                .select('*')</w:t>
-              <w:br/>
-              <w:t xml:space="preserve">                .eq('id', sessionId)</w:t>
-              <w:br/>
-              <w:t xml:space="preserve">                .maybeSingle();</w:t>
-              <w:br/>
-              <w:br/>
-              <w:t xml:space="preserve">            if (!session) return null;</w:t>
-              <w:br/>
-              <w:t xml:space="preserve">            return {</w:t>
-              <w:br/>
-              <w:t xml:space="preserve">                id: session.id,</w:t>
-              <w:br/>
-              <w:t xml:space="preserve">                subjectId: session.subject_id,</w:t>
-              <w:br/>
-              <w:t xml:space="preserve">                date: session.date,</w:t>
-              <w:br/>
-              <w:t xml:space="preserve">                time: session.time,</w:t>
-              <w:br/>
-              <w:t xml:space="preserve">                dayOfWeek: session.day_of_week,</w:t>
-              <w:br/>
-              <w:t xml:space="preserve">                isActive: session.is_active,</w:t>
-              <w:br/>
-              <w:t xml:space="preserve">                activeToken: session.active_token</w:t>
-              <w:br/>
-              <w:t xml:space="preserve">            };</w:t>
-              <w:br/>
-              <w:t xml:space="preserve">        } else {</w:t>
-              <w:br/>
-              <w:t xml:space="preserve">            const sessions = this._get('sessions');</w:t>
-              <w:br/>
-              <w:t xml:space="preserve">            return sessions.find(s =&gt; s.id === sessionId) || null;</w:t>
-              <w:br/>
-              <w:t xml:space="preserve">        }</w:t>
-              <w:br/>
-              <w:t xml:space="preserve">    },</w:t>
-              <w:br/>
-              <w:br/>
-              <w:t xml:space="preserve">    // --- УЧЕТ ПОСЕЩАЕМОСТИ ---</w:t>
-              <w:br/>
-              <w:br/>
-              <w:t xml:space="preserve">    async checkInStudent(studentId, scannedToken) {</w:t>
-              <w:br/>
-              <w:t xml:space="preserve">        const sessionId = scannedToken.split('_tok_')[0];</w:t>
-              <w:br/>
-              <w:br/>
-              <w:t xml:space="preserve">        if (isSupabaseMode) {</w:t>
-              <w:br/>
-              <w:t xml:space="preserve">            // Получаем сессию</w:t>
-              <w:br/>
-              <w:t xml:space="preserve">            const { data: session } = await supabaseClient</w:t>
-              <w:br/>
-              <w:t xml:space="preserve">                .from('sessions')</w:t>
-              <w:br/>
-              <w:t xml:space="preserve">                .select('*')</w:t>
-              <w:br/>
-              <w:t xml:space="preserve">                .eq('id', sessionId)</w:t>
-              <w:br/>
-              <w:t xml:space="preserve">                .maybeSingle();</w:t>
-              <w:br/>
-              <w:br/>
-              <w:t xml:space="preserve">            if (!session) {</w:t>
-              <w:br/>
-              <w:t xml:space="preserve">                throw new Error('Данное занятие не найдено');</w:t>
-              <w:br/>
-              <w:t xml:space="preserve">            }</w:t>
-              <w:br/>
-              <w:br/>
-              <w:t xml:space="preserve">            if (!session.is_active) {</w:t>
-              <w:br/>
-              <w:t xml:space="preserve">                throw new Error('Срок действия QR-кода истек! Попросите преподавателя обновить занятие.');</w:t>
-              <w:br/>
-              <w:t xml:space="preserve">            }</w:t>
-              <w:br/>
-              <w:br/>
-              <w:t xml:space="preserve">            if (session.active_token !== scannedToken) {</w:t>
-              <w:br/>
-              <w:t xml:space="preserve">                throw new Error('QR-код устарел! Отсканируйте свежий код с экрана преподавателя.');</w:t>
-              <w:br/>
-              <w:t xml:space="preserve">            }</w:t>
-              <w:br/>
-              <w:br/>
-              <w:t xml:space="preserve">            // Проверка дубликата отметки</w:t>
-              <w:br/>
-              <w:t xml:space="preserve">            const { data: existing } = await supabaseClient</w:t>
-              <w:br/>
-              <w:t xml:space="preserve">                .from('attendance')</w:t>
-              <w:br/>
-              <w:t xml:space="preserve">                .select('id')</w:t>
-              <w:br/>
-              <w:t xml:space="preserve">                .eq('session_id', sessionId)</w:t>
-              <w:br/>
-              <w:t xml:space="preserve">                .eq('student_id', studentId)</w:t>
-              <w:br/>
-              <w:t xml:space="preserve">                .maybeSingle();</w:t>
-              <w:br/>
-              <w:br/>
-              <w:t xml:space="preserve">            if (existing) {</w:t>
-              <w:br/>
-              <w:t xml:space="preserve">                return { success: true, message: 'Вы уже отмечены на этом занятии' };</w:t>
-              <w:br/>
-              <w:t xml:space="preserve">            }</w:t>
-              <w:br/>
-              <w:br/>
-              <w:t xml:space="preserve">            const now = new Date();</w:t>
-              <w:br/>
-              <w:t xml:space="preserve">            const timeStr = now.toLocaleTimeString('ru-RU', { hour: '2-digit', minute: '2-digit' });</w:t>
-              <w:br/>
-              <w:br/>
-              <w:t xml:space="preserve">            const newRecord = {</w:t>
-              <w:br/>
-              <w:t xml:space="preserve">                id: 'att_' + Date.now() + '_' + Math.random().toString(36).substr(2, 9),</w:t>
-              <w:br/>
-              <w:t xml:space="preserve">                session_id: sessionId,</w:t>
-              <w:br/>
-              <w:t xml:space="preserve">                student_id: studentId,</w:t>
-              <w:br/>
-              <w:t xml:space="preserve">                timestamp: timeStr</w:t>
-              <w:br/>
-              <w:t xml:space="preserve">            };</w:t>
-              <w:br/>
-              <w:br/>
-              <w:t xml:space="preserve">            const { error } = await supabaseClient</w:t>
-              <w:br/>
-              <w:t xml:space="preserve">                .from('attendance')</w:t>
-              <w:br/>
-              <w:t xml:space="preserve">                .insert([newRecord]);</w:t>
-              <w:br/>
-              <w:br/>
-              <w:t xml:space="preserve">            if (error) throw new Error(error.message);</w:t>
-              <w:br/>
-              <w:br/>
-              <w:t xml:space="preserve">            return { success: true, message: 'Посещение успешно отмечено!' };</w:t>
-              <w:br/>
-              <w:t xml:space="preserve">        } else {</w:t>
-              <w:br/>
-              <w:t xml:space="preserve">            // Локальный режим</w:t>
-              <w:br/>
-              <w:t xml:space="preserve">            const sessions = this._get('sessions');</w:t>
-              <w:br/>
-              <w:t xml:space="preserve">            const session = sessions.find(s =&gt; s.id === sessionId);</w:t>
-              <w:br/>
-              <w:br/>
-              <w:t xml:space="preserve">            if (!session) throw new Error('Данное занятие не найдено');</w:t>
-              <w:br/>
-              <w:t xml:space="preserve">            if (!session.isActive) throw new Error('Срок действия QR-кода истек!');</w:t>
-              <w:br/>
-              <w:t xml:space="preserve">            if (session.activeToken !== scannedToken) throw new Error('QR-код устарел! Отсканируйте свежий код.');</w:t>
-              <w:br/>
-              <w:br/>
-              <w:t xml:space="preserve">            const attendance = this._get('attendance');</w:t>
-              <w:br/>
-              <w:t xml:space="preserve">            const alreadyChecked = attendance.some(a =&gt; a.sessionId === sessionId &amp;&amp; a.studentId === studentId);</w:t>
-              <w:br/>
-              <w:t xml:space="preserve">            if (alreadyChecked) {</w:t>
-              <w:br/>
-              <w:t xml:space="preserve">                return { success: true, message: 'Вы уже отмечены на этом занятии' };</w:t>
-              <w:br/>
-              <w:t xml:space="preserve">            }</w:t>
-              <w:br/>
-              <w:br/>
-              <w:t xml:space="preserve">            const now = new Date();</w:t>
-              <w:br/>
-              <w:t xml:space="preserve">            const timeStr = now.toLocaleTimeString('ru-RU', { hour: '2-digit', minute: '2-digit' });</w:t>
-              <w:br/>
-              <w:br/>
-              <w:t xml:space="preserve">            const newRecord = {</w:t>
-              <w:br/>
-              <w:t xml:space="preserve">                id: 'att_' + Date.now() + '_' + Math.random().toString(36).substr(2, 9),</w:t>
-              <w:br/>
-              <w:t xml:space="preserve">                sessionId,</w:t>
-              <w:br/>
-              <w:t xml:space="preserve">                studentId,</w:t>
-              <w:br/>
-              <w:t xml:space="preserve">                timestamp: timeStr</w:t>
-              <w:br/>
-              <w:t xml:space="preserve">            };</w:t>
-              <w:br/>
-              <w:br/>
-              <w:t xml:space="preserve">            attendance.push(newRecord);</w:t>
-              <w:br/>
-              <w:t xml:space="preserve">            this._set('attendance', attendance);</w:t>
-              <w:br/>
-              <w:t xml:space="preserve">            return { success: true, message: 'Посещение успешно отмечено!' };</w:t>
-              <w:br/>
-              <w:t xml:space="preserve">        }</w:t>
-              <w:br/>
-              <w:t xml:space="preserve">    },</w:t>
-              <w:br/>
-              <w:br/>
-              <w:t xml:space="preserve">    async getSessionAttendance(sessionId) {</w:t>
-              <w:br/>
-              <w:t xml:space="preserve">        if (isSupabaseMode) {</w:t>
-              <w:br/>
-              <w:t xml:space="preserve">            // Получаем посещения с джоином пользователей</w:t>
-              <w:br/>
-              <w:t xml:space="preserve">            const { data: records } = await supabaseClient</w:t>
-              <w:br/>
-              <w:t xml:space="preserve">                .from('attendance')</w:t>
-              <w:br/>
-              <w:t xml:space="preserve">                .select('id, student_id, timestamp, users(*)')</w:t>
-              <w:br/>
-              <w:t xml:space="preserve">                .eq('session_id', sessionId);</w:t>
-              <w:br/>
-              <w:br/>
-              <w:t xml:space="preserve">            return (records || []).map(rec =&gt; {</w:t>
-              <w:br/>
-              <w:t xml:space="preserve">                const student = rec.users;</w:t>
-              <w:br/>
-              <w:t xml:space="preserve">                return {</w:t>
-              <w:br/>
-              <w:t xml:space="preserve">                    id: rec.id,</w:t>
-              <w:br/>
-              <w:t xml:space="preserve">                    studentId: rec.student_id,</w:t>
-              <w:br/>
-              <w:t xml:space="preserve">                    lastName: student ? student.last_name : 'Неизвестно',</w:t>
-              <w:br/>
-              <w:t xml:space="preserve">                    firstName: student ? student.first_name : 'Ученик',</w:t>
-              <w:br/>
-              <w:t xml:space="preserve">                    patronymic: student ? student.patronymic : '',</w:t>
-              <w:br/>
-              <w:t xml:space="preserve">                    group: student ? student.student_group : 'Без группы',</w:t>
-              <w:br/>
-              <w:t xml:space="preserve">                    timestamp: rec.timestamp</w:t>
-              <w:br/>
-              <w:t xml:space="preserve">                };</w:t>
-              <w:br/>
-              <w:t xml:space="preserve">            });</w:t>
-              <w:br/>
-              <w:t xml:space="preserve">        } else {</w:t>
-              <w:br/>
-              <w:t xml:space="preserve">            const attendance = this._get('attendance');</w:t>
-              <w:br/>
-              <w:t xml:space="preserve">            const users = this._get('users');</w:t>
-              <w:br/>
-              <w:t xml:space="preserve">            const records = attendance.filter(a =&gt; a.sessionId === sessionId);</w:t>
-              <w:br/>
-              <w:br/>
-              <w:t xml:space="preserve">            return records.map(rec =&gt; {</w:t>
-              <w:br/>
-              <w:t xml:space="preserve">                const student = users.find(u =&gt; u.id === rec.studentId);</w:t>
-              <w:br/>
-              <w:t xml:space="preserve">                return {</w:t>
-              <w:br/>
-              <w:t xml:space="preserve">                    id: rec.id,</w:t>
-              <w:br/>
-              <w:t xml:space="preserve">                    studentId: rec.studentId,</w:t>
-              <w:br/>
-              <w:t xml:space="preserve">                    lastName: student ? student.lastName : 'Неизвестно',</w:t>
-              <w:br/>
-              <w:t xml:space="preserve">                    firstName: student ? student.firstName : 'Ученик',</w:t>
-              <w:br/>
-              <w:t xml:space="preserve">                    patronymic: student ? student.patronymic : '',</w:t>
-              <w:br/>
-              <w:t xml:space="preserve">                    group: student ? student.group : 'Без группы',</w:t>
-              <w:br/>
-              <w:t xml:space="preserve">                    timestamp: rec.timestamp</w:t>
-              <w:br/>
-              <w:t xml:space="preserve">                };</w:t>
-              <w:br/>
-              <w:t xml:space="preserve">            });</w:t>
-              <w:br/>
-              <w:t xml:space="preserve">        }</w:t>
-              <w:br/>
-              <w:t xml:space="preserve">    },</w:t>
-              <w:br/>
-              <w:br/>
-              <w:t xml:space="preserve">    async getStudentAttendance(studentId) {</w:t>
-              <w:br/>
-              <w:t xml:space="preserve">        if (isSupabaseMode) {</w:t>
-              <w:br/>
-              <w:t xml:space="preserve">            // Делаем джоин посещений, сессий и предметов</w:t>
-              <w:br/>
-              <w:t xml:space="preserve">            const { data: records } = await supabaseClient</w:t>
-              <w:br/>
-              <w:t xml:space="preserve">                .from('attendance')</w:t>
-              <w:br/>
-              <w:t xml:space="preserve">                .select('id, timestamp, sessions(date, time, day_of_week, subjects(name))')</w:t>
-              <w:br/>
-              <w:t xml:space="preserve">                .eq('student_id', studentId);</w:t>
-              <w:br/>
-              <w:br/>
-              <w:t xml:space="preserve">            return (records || []).map(rec =&gt; {</w:t>
-              <w:br/>
-              <w:t xml:space="preserve">                const session = rec.sessions;</w:t>
-              <w:br/>
-              <w:t xml:space="preserve">                const subject = session ? session.subjects : null;</w:t>
-              <w:br/>
-              <w:br/>
-              <w:t xml:space="preserve">                return {</w:t>
-              <w:br/>
-              <w:t xml:space="preserve">                    id: rec.id,</w:t>
-              <w:br/>
-              <w:t xml:space="preserve">                    subjectName: subject ? subject.name : 'Неизвестный предмет',</w:t>
-              <w:br/>
-              <w:t xml:space="preserve">                    date: session ? session.date : 'Нет даты',</w:t>
-              <w:br/>
-              <w:t xml:space="preserve">                    time: session ? session.time : 'Нет времени',</w:t>
-              <w:br/>
-              <w:t xml:space="preserve">                    dayOfWeek: session ? session.day_of_week : 'Будний день',</w:t>
-              <w:br/>
-              <w:t xml:space="preserve">                    timestamp: rec.timestamp</w:t>
-              <w:br/>
-              <w:t xml:space="preserve">                };</w:t>
-              <w:br/>
-              <w:t xml:space="preserve">            }).sort((a, b) =&gt; b.id.localeCompare(a.id));</w:t>
-              <w:br/>
-              <w:t xml:space="preserve">        } else {</w:t>
-              <w:br/>
-              <w:t xml:space="preserve">            const attendance = this._get('attendance');</w:t>
-              <w:br/>
-              <w:t xml:space="preserve">            const sessions = this._get('sessions');</w:t>
-              <w:br/>
-              <w:t xml:space="preserve">            const subjects = this._get('subjects');</w:t>
-              <w:br/>
-              <w:t xml:space="preserve">            const studentRecords = attendance.filter(a =&gt; a.studentId === studentId);</w:t>
-              <w:br/>
-              <w:br/>
-              <w:t xml:space="preserve">            return studentRecords.map(rec =&gt; {</w:t>
-              <w:br/>
-              <w:t xml:space="preserve">                const session = sessions.find(s =&gt; s.id === rec.sessionId);</w:t>
-              <w:br/>
-              <w:t xml:space="preserve">                const subject = session ? subjects.find(sub =&gt; sub.id === session.subjectId) : null;</w:t>
-              <w:br/>
-              <w:br/>
-              <w:t xml:space="preserve">                return {</w:t>
-              <w:br/>
-              <w:t xml:space="preserve">                    id: rec.id,</w:t>
-              <w:br/>
-              <w:t xml:space="preserve">                    subjectName: subject ? subject.name : 'Неизвестный предмет',</w:t>
-              <w:br/>
-              <w:t xml:space="preserve">                    date: session ? session.date : 'Нет даты',</w:t>
-              <w:br/>
-              <w:t xml:space="preserve">                    time: session ? session.time : 'Нет времени',</w:t>
-              <w:br/>
-              <w:t xml:space="preserve">                    dayOfWeek: session ? session.dayOfWeek : 'Будний день',</w:t>
-              <w:br/>
-              <w:t xml:space="preserve">                    timestamp: rec.timestamp</w:t>
-              <w:br/>
-              <w:t xml:space="preserve">                };</w:t>
-              <w:br/>
-              <w:t xml:space="preserve">            }).sort((a, b) =&gt; b.id.localeCompare(a.id));</w:t>
-              <w:br/>
-              <w:t xml:space="preserve">        }</w:t>
-              <w:br/>
-              <w:t xml:space="preserve">    },</w:t>
-              <w:br/>
-              <w:br/>
-              <w:t xml:space="preserve">    async getStudentStats(studentId) {</w:t>
-              <w:br/>
-              <w:t xml:space="preserve">        if (isSupabaseMode) {</w:t>
-              <w:br/>
-              <w:t xml:space="preserve">            // Запрашиваем количество сессий и посещений студента</w:t>
-              <w:br/>
-              <w:t xml:space="preserve">            const { count: totalSessions } = await supabaseClient</w:t>
-              <w:br/>
-              <w:t xml:space="preserve">                .from('sessions')</w:t>
-              <w:br/>
-              <w:t xml:space="preserve">                .select('id', { count: 'exact', head: true });</w:t>
-              <w:br/>
-              <w:br/>
-              <w:t xml:space="preserve">            const { count: attendedSessions } = await supabaseClient</w:t>
-              <w:br/>
-              <w:t xml:space="preserve">                .from('attendance')</w:t>
-              <w:br/>
-              <w:t xml:space="preserve">                .select('id', { count: 'exact', head: true })</w:t>
-              <w:br/>
-              <w:t xml:space="preserve">                .eq('student_id', studentId);</w:t>
-              <w:br/>
-              <w:br/>
-              <w:t xml:space="preserve">            const total = totalSessions || 0;</w:t>
-              <w:br/>
-              <w:t xml:space="preserve">            const attended = attendedSessions || 0;</w:t>
-              <w:br/>
-              <w:t xml:space="preserve">            const rate = total &gt; 0 ? Math.round((attended / total) * 100) : 0;</w:t>
-              <w:br/>
-              <w:br/>
-              <w:t xml:space="preserve">            return {</w:t>
-              <w:br/>
-              <w:t xml:space="preserve">                rate,</w:t>
-              <w:br/>
-              <w:t xml:space="preserve">                attended,</w:t>
-              <w:br/>
-              <w:t xml:space="preserve">                missed: Math.max(0, total - attended),</w:t>
-              <w:br/>
-              <w:t xml:space="preserve">                total</w:t>
-              <w:br/>
-              <w:t xml:space="preserve">            };</w:t>
-              <w:br/>
-              <w:t xml:space="preserve">        } else {</w:t>
-              <w:br/>
-              <w:t xml:space="preserve">            const attendance = this._get('attendance');</w:t>
-              <w:br/>
-              <w:t xml:space="preserve">            const sessions = this._get('sessions');</w:t>
-              <w:br/>
-              <w:t xml:space="preserve">            </w:t>
-              <w:br/>
-              <w:t xml:space="preserve">            const totalSessions = sessions.length;</w:t>
-              <w:br/>
-              <w:t xml:space="preserve">            const attendedSessions = attendance.filter(a =&gt; a.studentId === studentId).length;</w:t>
-              <w:br/>
-              <w:t xml:space="preserve">            </w:t>
-              <w:br/>
-              <w:t xml:space="preserve">            const rate = totalSessions &gt; 0 ? Math.round((attendedSessions / totalSessions) * 100) : 0;</w:t>
-              <w:br/>
-              <w:t xml:space="preserve">            </w:t>
-              <w:br/>
-              <w:t xml:space="preserve">            return {</w:t>
-              <w:br/>
-              <w:t xml:space="preserve">                rate,</w:t>
-              <w:br/>
-              <w:t xml:space="preserve">                attended: attendedSessions,</w:t>
-              <w:br/>
-              <w:t xml:space="preserve">                missed: Math.max(0, totalSessions - attendedSessions),</w:t>
-              <w:br/>
-              <w:t xml:space="preserve">                total: totalSessions</w:t>
-              <w:br/>
-              <w:t xml:space="preserve">            };</w:t>
-              <w:br/>
-              <w:t xml:space="preserve">        }</w:t>
-              <w:br/>
-              <w:t xml:space="preserve">    },</w:t>
-              <w:br/>
-              <w:br/>
-              <w:t xml:space="preserve">    // --- Инициализация тестовых данных для localStorage (оффлайн режим) ---</w:t>
-              <w:br/>
-              <w:t xml:space="preserve">    seedData() {</w:t>
-              <w:br/>
-              <w:t xml:space="preserve">        if (isSupabaseMode) return; // В Supabase данные сеются через SQL-скрипт</w:t>
-              <w:br/>
-              <w:br/>
-              <w:t xml:space="preserve">        const users = this._get('users');</w:t>
-              <w:br/>
-              <w:t xml:space="preserve">        const subjects = this._get('subjects');</w:t>
-              <w:br/>
-              <w:t xml:space="preserve">        </w:t>
-              <w:br/>
-              <w:t xml:space="preserve">        if (users.length === 0) {</w:t>
-              <w:br/>
-              <w:t xml:space="preserve">            const testTeacher = {</w:t>
-              <w:br/>
-              <w:t xml:space="preserve">                id: 'usr_teacher_seed',</w:t>
-              <w:br/>
-              <w:t xml:space="preserve">                role: 'teacher',</w:t>
-              <w:br/>
-              <w:t xml:space="preserve">                lastName: 'Смирнов',</w:t>
-              <w:br/>
-              <w:t xml:space="preserve">                firstName: 'Дмитрий',</w:t>
-              <w:br/>
-              <w:t xml:space="preserve">                patronymic: 'Алексеевич',</w:t>
-              <w:br/>
-              <w:t xml:space="preserve">                group: '',</w:t>
-              <w:br/>
-              <w:t xml:space="preserve">                username: 'teacher',</w:t>
-              <w:br/>
-              <w:t xml:space="preserve">                password: '123'</w:t>
-              <w:br/>
-              <w:t xml:space="preserve">            };</w:t>
-              <w:br/>
-              <w:t xml:space="preserve">            </w:t>
-              <w:br/>
-              <w:t xml:space="preserve">            const testStudents = [</w:t>
-              <w:br/>
-              <w:t xml:space="preserve">                { id: 'usr_stud_1', role: 'student', lastName: 'Иванов', firstName: 'Иван', patronymic: 'Иванович', group: 'ИС-21', username: 'student1', password: '123' },</w:t>
-              <w:br/>
-              <w:t xml:space="preserve">                { id: 'usr_stud_2', role: 'student', lastName: 'Петров', firstName: 'Петр', patronymic: 'Петрович', group: 'ИС-21', username: 'student2', password: '123' },</w:t>
-              <w:br/>
-              <w:t xml:space="preserve">                { id: 'usr_stud_3', role: 'student', lastName: 'Алиева', firstName: 'Амина', patronymic: 'Сериковна', group: 'ВТ-22', username: 'student3', password: '123' },</w:t>
-              <w:br/>
-              <w:t xml:space="preserve">                { id: 'usr_stud_4', role: 'student', lastName: 'Маратов', firstName: 'Алишер', patronymic: 'Ерланович', group: 'ВТ-22', username: 'student4', password: '123' }</w:t>
-              <w:br/>
-              <w:t xml:space="preserve">            ];</w:t>
-              <w:br/>
-              <w:br/>
-              <w:t xml:space="preserve">            users.push(testTeacher, ...testStudents);</w:t>
-              <w:br/>
-              <w:t xml:space="preserve">            this._set('users', users);</w:t>
-              <w:br/>
-              <w:br/>
-              <w:t xml:space="preserve">            const testSubjects = [</w:t>
-              <w:br/>
-              <w:t xml:space="preserve">                { id: 'sub_seed_1', name: 'Английский язык (Лекция)', teacherId: 'usr_teacher_seed' },</w:t>
-              <w:br/>
-              <w:t xml:space="preserve">                { id: 'sub_seed_2', name: 'Программирование на JavaScript', teacherId: 'usr_teacher_seed' }</w:t>
-              <w:br/>
-              <w:t xml:space="preserve">            ];</w:t>
-              <w:br/>
-              <w:t xml:space="preserve">            </w:t>
-              <w:br/>
-              <w:t xml:space="preserve">            subjects.push(...testSubjects);</w:t>
-              <w:br/>
-              <w:t xml:space="preserve">            this._set('subjects', subjects);</w:t>
-              <w:br/>
-              <w:t xml:space="preserve">            console.log('Локальные тестовые данные засеяны!');</w:t>
-              <w:br/>
-              <w:t xml:space="preserve">        }</w:t>
-              <w:br/>
               <w:t xml:space="preserve">    }</w:t>
               <w:br/>
               <w:t>};</w:t>
-              <w:br/>
-              <w:br/>
-              <w:t>// Сидинг для локального режима</w:t>
-              <w:br/>
-              <w:t>Database.seedData();</w:t>
-              <w:br/>
-            </w:r>
-          </w:p>
-        </w:tc>
-      </w:tr>
-    </w:tbl>
-    <w:tbl>
-      <w:tblPr>
-        <w:tblW w:type="auto" w:w="0"/>
-        <w:jc w:val="center"/>
-        <w:tblLook w:firstColumn="1" w:firstRow="1" w:lastColumn="0" w:lastRow="0" w:noHBand="0" w:noVBand="1" w:val="04A0"/>
-      </w:tblPr>
-      <w:tblGrid>
-        <w:gridCol w:w="9354"/>
-      </w:tblGrid>
-      <w:tr>
-        <w:tc>
-          <w:tcPr>
-            <w:tcW w:type="dxa" w:w="9354"/>
-            <w:shd w:val="clear" w:color="auto" w:fill="F1F5F9"/>
-            <w:tcMar>
-              <w:top w:w="120" w:type="dxa"/>
-              <w:left w:w="120" w:type="dxa"/>
-              <w:bottom w:w="120" w:type="dxa"/>
-              <w:right w:w="120" w:type="dxa"/>
-            </w:tcMar>
-          </w:tcPr>
-          <w:p>
-            <w:pPr>
-              <w:spacing w:after="40" w:before="40"/>
-            </w:pPr>
-            <w:r>
-              <w:rPr>
-                <w:rFonts w:ascii="Courier New" w:hAnsi="Courier New"/>
-                <w:color w:val="0F172A"/>
-                <w:sz w:val="17"/>
-              </w:rPr>
-              <w:t>&lt;!DOCTYPE html&gt;</w:t>
-              <w:br/>
-              <w:t>&lt;html lang="ru"&gt;</w:t>
-              <w:br/>
-              <w:t>&lt;head&gt;</w:t>
-              <w:br/>
-              <w:t xml:space="preserve">    &lt;meta charset="UTF-8"&gt;</w:t>
-              <w:br/>
-              <w:t xml:space="preserve">    &lt;meta name="viewport" content="width=device-width, initial-scale=1.0"&gt;</w:t>
-              <w:br/>
-              <w:t xml:space="preserve">    &lt;title&gt;Личный кабинет Студента | Система учета посещаемости&lt;/title&gt;</w:t>
-              <w:br/>
-              <w:t xml:space="preserve">    </w:t>
-              <w:br/>
-              <w:t xml:space="preserve">    &lt;!-- Глобальный отслеживатель ошибок в UI для отладки --&gt;</w:t>
-              <w:br/>
-              <w:t xml:space="preserve">    &lt;script&gt;</w:t>
-              <w:br/>
-              <w:t xml:space="preserve">        window.addEventListener('error', function(e) {</w:t>
-              <w:br/>
-              <w:t xml:space="preserve">            const errorDiv = document.createElement('div');</w:t>
-              <w:br/>
-              <w:t xml:space="preserve">            errorDiv.style.position = 'fixed';</w:t>
-              <w:br/>
-              <w:t xml:space="preserve">            errorDiv.style.top = '10px';</w:t>
-              <w:br/>
-              <w:t xml:space="preserve">            errorDiv.style.left = '10px';</w:t>
-              <w:br/>
-              <w:t xml:space="preserve">            errorDiv.style.right = '10px';</w:t>
-              <w:br/>
-              <w:t xml:space="preserve">            errorDiv.style.background = 'rgba(244, 63, 94, 0.95)';</w:t>
-              <w:br/>
-              <w:t xml:space="preserve">            errorDiv.style.color = '#ffffff';</w:t>
-              <w:br/>
-              <w:t xml:space="preserve">            errorDiv.style.padding = '15px';</w:t>
-              <w:br/>
-              <w:t xml:space="preserve">            errorDiv.style.borderRadius = '8px';</w:t>
-              <w:br/>
-              <w:t xml:space="preserve">            errorDiv.style.zIndex = '99999';</w:t>
-              <w:br/>
-              <w:t xml:space="preserve">            errorDiv.style.fontFamily = 'monospace';</w:t>
-              <w:br/>
-              <w:t xml:space="preserve">            errorDiv.style.fontSize = '12px';</w:t>
-              <w:br/>
-              <w:t xml:space="preserve">            errorDiv.style.boxShadow = '0 10px 30px rgba(0,0,0,0.5)';</w:t>
-              <w:br/>
-              <w:t xml:space="preserve">            errorDiv.innerHTML = '&lt;strong&gt;[JS ERROR]&lt;/strong&gt; ' + e.message + ' &lt;br&gt;&lt;small style="color:rgba(255,255,255,0.7);"&gt;' + e.filename + ':' + e.lineno + '&lt;/small&gt;';</w:t>
-              <w:br/>
-              <w:t xml:space="preserve">            document.body.appendChild(errorDiv);</w:t>
-              <w:br/>
-              <w:t xml:space="preserve">        });</w:t>
-              <w:br/>
-              <w:br/>
-              <w:t xml:space="preserve">        window.addEventListener('unhandledrejection', function(e) {</w:t>
-              <w:br/>
-              <w:t xml:space="preserve">            const errorDiv = document.createElement('div');</w:t>
-              <w:br/>
-              <w:t xml:space="preserve">            errorDiv.style.position = 'fixed';</w:t>
-              <w:br/>
-              <w:t xml:space="preserve">            errorDiv.style.top = '10px';</w:t>
-              <w:br/>
-              <w:t xml:space="preserve">            errorDiv.style.left = '10px';</w:t>
-              <w:br/>
-              <w:t xml:space="preserve">            errorDiv.style.right = '10px';</w:t>
-              <w:br/>
-              <w:t xml:space="preserve">            errorDiv.style.background = 'rgba(244, 63, 94, 0.95)';</w:t>
-              <w:br/>
-              <w:t xml:space="preserve">            errorDiv.style.color = '#ffffff';</w:t>
-              <w:br/>
-              <w:t xml:space="preserve">            errorDiv.style.padding = '15px';</w:t>
-              <w:br/>
-              <w:t xml:space="preserve">            errorDiv.style.borderRadius = '8px';</w:t>
-              <w:br/>
-              <w:t xml:space="preserve">            errorDiv.style.zIndex = '99999';</w:t>
-              <w:br/>
-              <w:t xml:space="preserve">            errorDiv.style.fontFamily = 'monospace';</w:t>
-              <w:br/>
-              <w:t xml:space="preserve">            errorDiv.style.fontSize = '12px';</w:t>
-              <w:br/>
-              <w:t xml:space="preserve">            errorDiv.style.boxShadow = '0 10px 30px rgba(0,0,0,0.5)';</w:t>
-              <w:br/>
-              <w:t xml:space="preserve">            errorDiv.innerHTML = '&lt;strong&gt;[DATABASE/PROMISE ERROR]&lt;/strong&gt; ' + (e.reason ? e.reason.message || e.reason : 'Unhandled Rejection') + (e.reason &amp;&amp; e.reason.stack ? '&lt;br&gt;&lt;pre style="white-space:pre-wrap;font-size:10px;margin-top:5px;opacity:0.8;font-family:monospace;"&gt;' + e.reason.stack + '&lt;/pre&gt;' : '');</w:t>
-              <w:br/>
-              <w:t xml:space="preserve">            document.body.appendChild(errorDiv);</w:t>
-              <w:br/>
-              <w:t xml:space="preserve">        });</w:t>
-              <w:br/>
-              <w:t xml:space="preserve">    &lt;/script&gt;</w:t>
-              <w:br/>
-              <w:t xml:space="preserve">    </w:t>
-              <w:br/>
-              <w:t xml:space="preserve">    &lt;!-- Подключение библиотеки HTML5-QRCode для сканирования камеры --&gt;</w:t>
-              <w:br/>
-              <w:t xml:space="preserve">    &lt;script src="https://cdnjs.cloudflare.com/ajax/libs/html5-qrcode/2.3.8/html5-qrcode.min.js" referrerpolicy="no-referrer"&gt;&lt;/script&gt;</w:t>
-              <w:br/>
-              <w:t xml:space="preserve">    </w:t>
-              <w:br/>
-              <w:t xml:space="preserve">    &lt;!-- Стили --&gt;</w:t>
-              <w:br/>
-              <w:t xml:space="preserve">    &lt;link rel="stylesheet" href="css/style.css"&gt;</w:t>
-              <w:br/>
-              <w:t>&lt;/head&gt;</w:t>
-              <w:br/>
-              <w:t>&lt;body&gt;</w:t>
-              <w:br/>
-              <w:br/>
-              <w:t xml:space="preserve">    &lt;!-- Шапка сайта (Header) --&gt;</w:t>
-              <w:br/>
-              <w:t xml:space="preserve">    &lt;header class="header-glass" id="main-header" style="display: none;"&gt;</w:t>
-              <w:br/>
-              <w:t xml:space="preserve">        &lt;div class="logo"&gt;</w:t>
-              <w:br/>
-              <w:t xml:space="preserve">            &lt;span&gt;🎓&lt;/span&gt; SMART&lt;span&gt;ATTEND&lt;/span&gt;</w:t>
-              <w:br/>
-              <w:t xml:space="preserve">        &lt;/div&gt;</w:t>
-              <w:br/>
-              <w:t xml:space="preserve">        &lt;div class="header-user-badge"&gt;</w:t>
-              <w:br/>
-              <w:t xml:space="preserve">            &lt;div class="user-info-text"&gt;</w:t>
-              <w:br/>
-              <w:t xml:space="preserve">                &lt;span class="name" id="header-user-name"&gt;Иванов И. И.&lt;/span&gt;</w:t>
-              <w:br/>
-              <w:t xml:space="preserve">                &lt;span class="role" id="header-user-group"&gt;Группа: ИС-21&lt;/span&gt;</w:t>
-              <w:br/>
-              <w:t xml:space="preserve">            &lt;/div&gt;</w:t>
-              <w:br/>
-              <w:t xml:space="preserve">            &lt;button class="btn btn-secondary" id="logout-btn" style="padding: 8px 16px; font-size: 0.85rem;"&gt;Выйти&lt;/button&gt;</w:t>
-              <w:br/>
-              <w:t xml:space="preserve">        &lt;/div&gt;</w:t>
-              <w:br/>
-              <w:t xml:space="preserve">    &lt;/header&gt;</w:t>
-              <w:br/>
-              <w:br/>
-              <w:t xml:space="preserve">    &lt;!-- Раздел Авторизации (Вход / Регистрация) --&gt;</w:t>
-              <w:br/>
-              <w:t xml:space="preserve">    &lt;main class="auth-wrapper" id="auth-section"&gt;</w:t>
-              <w:br/>
-              <w:t xml:space="preserve">        &lt;div class="glass-card auth-card fade-in"&gt;</w:t>
-              <w:br/>
-              <w:t xml:space="preserve">            &lt;div class="auth-header"&gt;</w:t>
-              <w:br/>
-              <w:t xml:space="preserve">                &lt;div style="font-size: 3rem; margin-bottom: 10px;"&gt;🎓&lt;/div&gt;</w:t>
-              <w:br/>
-              <w:t xml:space="preserve">                &lt;h2&gt;Кабинет Студента&lt;/h2&gt;</w:t>
-              <w:br/>
-              <w:t xml:space="preserve">                &lt;p style="color: var(--text-secondary); font-size: 0.9rem;"&gt;Зарегистрируйтесь или войдите для отметки на лекциях&lt;/p&gt;</w:t>
-              <w:br/>
-              <w:t xml:space="preserve">            &lt;/div&gt;</w:t>
-              <w:br/>
-              <w:br/>
-              <w:t xml:space="preserve">            &lt;!-- Табы переключения --&gt;</w:t>
-              <w:br/>
-              <w:t xml:space="preserve">            &lt;div class="auth-tabs"&gt;</w:t>
-              <w:br/>
-              <w:t xml:space="preserve">                &lt;button class="auth-tab active" id="tab-login-btn"&gt;Войти&lt;/button&gt;</w:t>
-              <w:br/>
-              <w:t xml:space="preserve">                &lt;button class="auth-tab" id="tab-register-btn"&gt;Регистрация&lt;/button&gt;</w:t>
-              <w:br/>
-              <w:t xml:space="preserve">            &lt;/div&gt;</w:t>
-              <w:br/>
-              <w:br/>
-              <w:t xml:space="preserve">            &lt;!-- Форма входа --&gt;</w:t>
-              <w:br/>
-              <w:t xml:space="preserve">            &lt;form id="login-form"&gt;</w:t>
-              <w:br/>
-              <w:t xml:space="preserve">                &lt;div class="form-group"&gt;</w:t>
-              <w:br/>
-              <w:t xml:space="preserve">                    &lt;label for="login-username"&gt;Логин (Username)&lt;/label&gt;</w:t>
-              <w:br/>
-              <w:t xml:space="preserve">                    &lt;input type="text" id="login-username" class="input-control" placeholder="Введите ваш логин" required autocomplete="username"&gt;</w:t>
-              <w:br/>
-              <w:t xml:space="preserve">                &lt;/div&gt;</w:t>
-              <w:br/>
-              <w:t xml:space="preserve">                &lt;div class="form-group"&gt;</w:t>
-              <w:br/>
-              <w:t xml:space="preserve">                    &lt;label for="login-password"&gt;Пароль&lt;/label&gt;</w:t>
-              <w:br/>
-              <w:t xml:space="preserve">                    &lt;input type="password" id="login-password" class="input-control" placeholder="Введите ваш пароль" required autocomplete="current-password"&gt;</w:t>
-              <w:br/>
-              <w:t xml:space="preserve">                &lt;/div&gt;</w:t>
-              <w:br/>
-              <w:t xml:space="preserve">                &lt;button type="submit" class="btn btn-student" style="width: 100%; margin-top: 10px;"&gt;Войти в кабинет&lt;/button&gt;</w:t>
-              <w:br/>
-              <w:t xml:space="preserve">            &lt;/form&gt;</w:t>
-              <w:br/>
-              <w:br/>
-              <w:t xml:space="preserve">            &lt;!-- Форма регистрации --&gt;</w:t>
-              <w:br/>
-              <w:t xml:space="preserve">            &lt;form id="register-form" style="display: none;"&gt;</w:t>
-              <w:br/>
-              <w:t xml:space="preserve">                &lt;div class="form-group"&gt;</w:t>
-              <w:br/>
-              <w:t xml:space="preserve">                    &lt;label for="reg-lastname"&gt;Фамилия&lt;/label&gt;</w:t>
-              <w:br/>
-              <w:t xml:space="preserve">                    &lt;input type="text" id="reg-lastname" class="input-control" placeholder="Например: Иванов" required&gt;</w:t>
-              <w:br/>
-              <w:t xml:space="preserve">                &lt;/div&gt;</w:t>
-              <w:br/>
-              <w:t xml:space="preserve">                &lt;div class="form-group"&gt;</w:t>
-              <w:br/>
-              <w:t xml:space="preserve">                    &lt;label for="reg-firstname"&gt;Имя&lt;/label&gt;</w:t>
-              <w:br/>
-              <w:t xml:space="preserve">                    &lt;input type="text" id="reg-firstname" class="input-control" placeholder="Например: Иван" required&gt;</w:t>
-              <w:br/>
-              <w:t xml:space="preserve">                &lt;/div&gt;</w:t>
-              <w:br/>
-              <w:t xml:space="preserve">                &lt;div class="form-group"&gt;</w:t>
-              <w:br/>
-              <w:t xml:space="preserve">                    &lt;label for="reg-patronymic"&gt;Отчество&lt;/label&gt;</w:t>
-              <w:br/>
-              <w:t xml:space="preserve">                    &lt;input type="text" id="reg-patronymic" class="input-control" placeholder="Например: Иванович (необязательно)"&gt;</w:t>
-              <w:br/>
-              <w:t xml:space="preserve">                &lt;/div&gt;</w:t>
-              <w:br/>
-              <w:t xml:space="preserve">                &lt;div class="form-group"&gt;</w:t>
-              <w:br/>
-              <w:t xml:space="preserve">                    &lt;label for="reg-group"&gt;Группа&lt;/label&gt;</w:t>
-              <w:br/>
-              <w:t xml:space="preserve">                    &lt;input type="text" id="reg-group" class="input-control" placeholder="Например: ИС-21" required&gt;</w:t>
-              <w:br/>
-              <w:t xml:space="preserve">                &lt;/div&gt;</w:t>
-              <w:br/>
-              <w:t xml:space="preserve">                &lt;div class="form-group"&gt;</w:t>
-              <w:br/>
-              <w:t xml:space="preserve">                    &lt;label for="reg-username"&gt;Придумайте Логин&lt;/label&gt;</w:t>
-              <w:br/>
-              <w:t xml:space="preserve">                    &lt;input type="text" id="reg-username" class="input-control" placeholder="Латинскими буквами" required autocomplete="username"&gt;</w:t>
-              <w:br/>
-              <w:t xml:space="preserve">                &lt;/div&gt;</w:t>
-              <w:br/>
-              <w:t xml:space="preserve">                &lt;div class="form-group"&gt;</w:t>
-              <w:br/>
-              <w:t xml:space="preserve">                    &lt;label for="reg-password"&gt;Придумайте Пароль&lt;/label&gt;</w:t>
-              <w:br/>
-              <w:t xml:space="preserve">                    &lt;input type="password" id="reg-password" class="input-control" placeholder="Минимум 4 символа" required autocomplete="new-password"&gt;</w:t>
-              <w:br/>
-              <w:t xml:space="preserve">                &lt;/div&gt;</w:t>
-              <w:br/>
-              <w:t xml:space="preserve">                &lt;button type="submit" class="btn btn-student" style="width: 100%; margin-top: 10px;"&gt;Зарегистрироваться&lt;/button&gt;</w:t>
-              <w:br/>
-              <w:t xml:space="preserve">            &lt;/form&gt;</w:t>
-              <w:br/>
-              <w:t xml:space="preserve">            </w:t>
-              <w:br/>
-              <w:t xml:space="preserve">            &lt;div class="auth-footer-link"&gt;</w:t>
-              <w:br/>
-              <w:t xml:space="preserve">                &lt;p&gt;Вы преподаватель? &lt;a href="teacher.html" style="color: var(--clr-teacher);"&gt;Кабинет Учителя &amp;rarr;&lt;/a&gt;&lt;/p&gt;</w:t>
-              <w:br/>
-              <w:t xml:space="preserve">            &lt;/div&gt;</w:t>
-              <w:br/>
-              <w:t xml:space="preserve">        &lt;/div&gt;</w:t>
-              <w:br/>
-              <w:t xml:space="preserve">    &lt;/main&gt;</w:t>
-              <w:br/>
-              <w:br/>
-              <w:t xml:space="preserve">    &lt;!-- Основной кабинет Студента (После авторизации) --&gt;</w:t>
-              <w:br/>
-              <w:t xml:space="preserve">    &lt;main class="student-container" id="dashboard-section" style="display: none;"&gt;</w:t>
-              <w:br/>
-              <w:t xml:space="preserve">        </w:t>
-              <w:br/>
-              <w:t xml:space="preserve">        &lt;!-- Левая колонка - Профиль &amp; Статистика --&gt;</w:t>
-              <w:br/>
-              <w:t xml:space="preserve">        &lt;aside class="glass-card student-profile-card fade-in"&gt;</w:t>
-              <w:br/>
-              <w:t xml:space="preserve">            &lt;div class="student-avatar" id="student-avatar-letter"&gt;И&lt;/div&gt;</w:t>
-              <w:br/>
-              <w:t xml:space="preserve">            &lt;h3 id="student-full-name"&gt;Иванов Иван Иванович&lt;/h3&gt;</w:t>
-              <w:br/>
-              <w:t xml:space="preserve">            &lt;span class="student-group-tag" id="student-group-name"&gt;ГРУППА ИС-21&lt;/span&gt;</w:t>
-              <w:br/>
-              <w:t xml:space="preserve">            </w:t>
-              <w:br/>
-              <w:t xml:space="preserve">            &lt;div class="student-stats-container"&gt;</w:t>
-              <w:br/>
-              <w:t xml:space="preserve">                &lt;h4 style="margin-bottom: 20px; font-size: 0.95rem; text-align: center; color: var(--text-secondary);"&gt;ОБЩАЯ ПОСЕЩАЕМОСТЬ&lt;/h4&gt;</w:t>
-              <w:br/>
-              <w:t xml:space="preserve">                </w:t>
-              <w:br/>
-              <w:t xml:space="preserve">                &lt;!-- Анимированный SVG-график посещаемости --&gt;</w:t>
-              <w:br/>
-              <w:t xml:space="preserve">                &lt;div id="attendance-chart-container"&gt;&lt;/div&gt;</w:t>
-              <w:br/>
-              <w:t xml:space="preserve">                </w:t>
-              <w:br/>
-              <w:t xml:space="preserve">                &lt;div class="mini-stats-grid"&gt;</w:t>
-              <w:br/>
-              <w:t xml:space="preserve">                    &lt;div class="mini-stat-card"&gt;</w:t>
-              <w:br/>
-              <w:t xml:space="preserve">                        &lt;span class="value success" id="stat-attended"&gt;0&lt;/span&gt;</w:t>
-              <w:br/>
-              <w:t xml:space="preserve">                        &lt;span class="label"&gt;Присутствовал&lt;/span&gt;</w:t>
-              <w:br/>
-              <w:t xml:space="preserve">                    &lt;/div&gt;</w:t>
-              <w:br/>
-              <w:t xml:space="preserve">                    &lt;div class="mini-stat-card"&gt;</w:t>
-              <w:br/>
-              <w:t xml:space="preserve">                        &lt;span class="value danger" id="stat-missed"&gt;0&lt;/span&gt;</w:t>
-              <w:br/>
-              <w:t xml:space="preserve">                        &lt;span class="label"&gt;Пропущено&lt;/span&gt;</w:t>
-              <w:br/>
-              <w:t xml:space="preserve">                    &lt;/div&gt;</w:t>
-              <w:br/>
-              <w:t xml:space="preserve">                &lt;/div&gt;</w:t>
-              <w:br/>
-              <w:t xml:space="preserve">            &lt;/div&gt;</w:t>
-              <w:br/>
-              <w:t xml:space="preserve">        &lt;/aside&gt;</w:t>
-              <w:br/>
-              <w:br/>
-              <w:t xml:space="preserve">        &lt;!-- Правая колонка - Сканер &amp; Таблица посещаемости --&gt;</w:t>
-              <w:br/>
-              <w:t xml:space="preserve">        &lt;section class="fade-in" style="display: flex; flex-direction: column; gap: 30px;"&gt;</w:t>
-              <w:br/>
-              <w:t xml:space="preserve">            </w:t>
-              <w:br/>
-              <w:t xml:space="preserve">            &lt;!-- Баннер Быстрого Действия (Сканирование QR) --&gt;</w:t>
-              <w:br/>
-              <w:t xml:space="preserve">            &lt;div class="glass-card" style="background: linear-gradient(135deg, rgba(79, 70, 229, 0.15), rgba(15, 23, 42, 0.55)); border-color: rgba(99, 102, 241, 0.2); display: flex; align-items: center; justify-content: space-between; flex-wrap: wrap; gap: 20px; padding: 30px;"&gt;</w:t>
-              <w:br/>
-              <w:t xml:space="preserve">                &lt;div&gt;</w:t>
-              <w:br/>
-              <w:t xml:space="preserve">                    &lt;h2 style="margin-bottom: 8px;"&gt;Отметиться на лекции&lt;/h2&gt;</w:t>
-              <w:br/>
-              <w:t xml:space="preserve">                    &lt;p style="color: var(--text-secondary); max-width: 450px; font-size: 0.95rem;"&gt;Нажмите на кнопку ниже, чтобы запустить камеру, наведите на QR-код лекции преподавателя и мгновенно подтвердите свое присутствие.&lt;/p&gt;</w:t>
-              <w:br/>
-              <w:t xml:space="preserve">                &lt;/div&gt;</w:t>
-              <w:br/>
-              <w:t xml:space="preserve">                &lt;button class="btn btn-student btn-lg" id="scan-qr-trigger-btn" style="padding: 16px 32px; font-size: 1.1rem; border-radius: 14px;"&gt;</w:t>
-              <w:br/>
-              <w:t xml:space="preserve">                    📷 Сканировать QR-код</w:t>
-              <w:br/>
-              <w:t xml:space="preserve">                &lt;/button&gt;</w:t>
-              <w:br/>
-              <w:t xml:space="preserve">            &lt;/div&gt;</w:t>
-              <w:br/>
-              <w:br/>
-              <w:t xml:space="preserve">            &lt;!-- Таблица Истории Посещаемости --&gt;</w:t>
-              <w:br/>
-              <w:t xml:space="preserve">            &lt;div class="glass-card"&gt;</w:t>
-              <w:br/>
-              <w:t xml:space="preserve">                &lt;h3 style="margin-bottom: 20px; display: flex; align-items: center; gap: 10px;"&gt;</w:t>
-              <w:br/>
-              <w:t xml:space="preserve">                    &lt;span&gt;📅&lt;/span&gt; Моя история посещений</w:t>
-              <w:br/>
-              <w:t xml:space="preserve">                &lt;/h3&gt;</w:t>
-              <w:br/>
-              <w:t xml:space="preserve">                </w:t>
-              <w:br/>
-              <w:t xml:space="preserve">                &lt;div class="table-wrapper"&gt;</w:t>
-              <w:br/>
-              <w:t xml:space="preserve">                    &lt;table class="attendance-table"&gt;</w:t>
-              <w:br/>
-              <w:t xml:space="preserve">                        &lt;thead&gt;</w:t>
-              <w:br/>
-              <w:t xml:space="preserve">                            &lt;tr&gt;</w:t>
-              <w:br/>
-              <w:t xml:space="preserve">                                &lt;th&gt;Предмет&lt;/th&gt;</w:t>
-              <w:br/>
-              <w:t xml:space="preserve">                                &lt;th&gt;День недели&lt;/th&gt;</w:t>
-              <w:br/>
-              <w:t xml:space="preserve">                                &lt;th&gt;Дата&lt;/th&gt;</w:t>
-              <w:br/>
-              <w:t xml:space="preserve">                                &lt;th&gt;Время проведения&lt;/th&gt;</w:t>
-              <w:br/>
-              <w:t xml:space="preserve">                                &lt;th&gt;Время отметки&lt;/th&gt;</w:t>
-              <w:br/>
-              <w:t xml:space="preserve">                                &lt;th&gt;Статус&lt;/th&gt;</w:t>
-              <w:br/>
-              <w:t xml:space="preserve">                            &lt;/tr&gt;</w:t>
-              <w:br/>
-              <w:t xml:space="preserve">                        &lt;/thead&gt;</w:t>
-              <w:br/>
-              <w:t xml:space="preserve">                        &lt;tbody id="student-attendance-tbody"&gt;</w:t>
-              <w:br/>
-              <w:t xml:space="preserve">                            &lt;!-- Заполняется динамически через JS --&gt;</w:t>
-              <w:br/>
-              <w:t xml:space="preserve">                        &lt;/tbody&gt;</w:t>
-              <w:br/>
-              <w:t xml:space="preserve">                    &lt;/table&gt;</w:t>
-              <w:br/>
-              <w:t xml:space="preserve">                &lt;/div&gt;</w:t>
-              <w:br/>
-              <w:br/>
-              <w:t xml:space="preserve">                &lt;div id="attendance-empty-state" class="empty-placeholder" style="display: none;"&gt;</w:t>
-              <w:br/>
-              <w:t xml:space="preserve">                    &lt;span class="icon"&gt;📭&lt;/span&gt;</w:t>
-              <w:br/>
-              <w:t xml:space="preserve">                    &lt;p&gt;История посещаемости пуста. Отметьтесь на первом занятии!&lt;/p&gt;</w:t>
-              <w:br/>
-              <w:t xml:space="preserve">                &lt;/div&gt;</w:t>
-              <w:br/>
-              <w:t xml:space="preserve">            &lt;/div&gt;</w:t>
-              <w:br/>
-              <w:t xml:space="preserve">        &lt;/section&gt;</w:t>
-              <w:br/>
-              <w:t xml:space="preserve">    &lt;/main&gt;</w:t>
-              <w:br/>
-              <w:br/>
-              <w:t xml:space="preserve">    &lt;!-- ========================================== --&gt;</w:t>
-              <w:br/>
-              <w:t xml:space="preserve">    &lt;!-- МОДАЛЬНОЕ ОКНО КАМЕРЫ (СКАНИРОВАНИЕ QR) --&gt;</w:t>
-              <w:br/>
-              <w:t xml:space="preserve">    &lt;!-- ========================================== --&gt;</w:t>
-              <w:br/>
-              <w:t xml:space="preserve">    &lt;div class="scanner-modal" id="scanner-modal"&gt;</w:t>
-              <w:br/>
-              <w:t xml:space="preserve">        &lt;div class="scanner-content"&gt;</w:t>
-              <w:br/>
-              <w:t xml:space="preserve">            &lt;button class="scanner-close-btn" id="scanner-close-btn"&gt;&amp;times;&lt;/button&gt;</w:t>
-              <w:br/>
-              <w:t xml:space="preserve">            &lt;h3 class="scanner-modal-title"&gt;Сканирование QR-кода&lt;/h3&gt;</w:t>
-              <w:br/>
-              <w:t xml:space="preserve">            &lt;p class="scanner-modal-subtitle"&gt;Поместите QR-код преподавателя в рамку видоискателя для считывания&lt;/p&gt;</w:t>
-              <w:br/>
-              <w:t xml:space="preserve">            </w:t>
-              <w:br/>
-              <w:t xml:space="preserve">            &lt;div class="scanner-camera-box"&gt;</w:t>
-              <w:br/>
-              <w:t xml:space="preserve">                &lt;!-- Контейнер для HTML5-QRCode видео --&gt;</w:t>
-              <w:br/>
-              <w:t xml:space="preserve">                &lt;div id="camera-reader-element"&gt;&lt;/div&gt;</w:t>
-              <w:br/>
-              <w:t xml:space="preserve">                </w:t>
-              <w:br/>
-              <w:t xml:space="preserve">                &lt;!-- Декоративный интерфейс поверх камеры --&gt;</w:t>
-              <w:br/>
-              <w:t xml:space="preserve">                &lt;div class="scanner-overlay-frame"&gt;</w:t>
-              <w:br/>
-              <w:t xml:space="preserve">                    &lt;div class="scanner-target-square"&gt;</w:t>
-              <w:br/>
-              <w:t xml:space="preserve">                        &lt;div class="scanner-laser-line"&gt;&lt;/div&gt;</w:t>
-              <w:br/>
-              <w:t xml:space="preserve">                    &lt;/div&gt;</w:t>
-              <w:br/>
-              <w:t xml:space="preserve">                &lt;/div&gt;</w:t>
-              <w:br/>
-              <w:t xml:space="preserve">            &lt;/div&gt;</w:t>
-              <w:br/>
-              <w:t xml:space="preserve">            </w:t>
-              <w:br/>
-              <w:t xml:space="preserve">            &lt;p style="color: var(--text-muted); font-size: 0.8rem; margin-top: 20px; text-align: center;"&gt;Не забудьте разрешить доступ к камере при запросе браузера&lt;/p&gt;</w:t>
-              <w:br/>
-              <w:t xml:space="preserve">        &lt;/div&gt;</w:t>
-              <w:br/>
-              <w:t xml:space="preserve">    &lt;/div&gt;</w:t>
-              <w:br/>
-              <w:br/>
-              <w:t xml:space="preserve">    &lt;!-- ========================================== --&gt;</w:t>
-              <w:br/>
-              <w:t xml:space="preserve">    &lt;!-- МОДАЛЬНОЕ ОКНО УСПЕШНОЙ ОТМЕТКИ --&gt;</w:t>
-              <w:br/>
-              <w:t xml:space="preserve">    &lt;!-- ========================================== --&gt;</w:t>
-              <w:br/>
-              <w:t xml:space="preserve">    &lt;div class="dialog-modal" id="success-modal"&gt;</w:t>
-              <w:br/>
-              <w:t xml:space="preserve">        &lt;div class="glass-card dialog-card success-checkmark-card"&gt;</w:t>
-              <w:br/>
-              <w:t xml:space="preserve">            &lt;div class="success-icon-circle"&gt;✓&lt;/div&gt;</w:t>
-              <w:br/>
-              <w:t xml:space="preserve">            &lt;h3 style="font-size: 1.5rem; margin-bottom: 8px;"&gt;Вы успешно отмечены!&lt;/h3&gt;</w:t>
-              <w:br/>
-              <w:t xml:space="preserve">            &lt;p id="success-modal-class-details" style="color: var(--text-secondary); font-size: 0.95rem; margin-bottom: 24px; line-height: 1.4;"&gt;</w:t>
-              <w:br/>
-              <w:t xml:space="preserve">                Предмет: Английский язык (Лекция)&lt;br&gt;</w:t>
-              <w:br/>
-              <w:t xml:space="preserve">                Время: 14:02</w:t>
-              <w:br/>
-              <w:t xml:space="preserve">            &lt;/p&gt;</w:t>
-              <w:br/>
-              <w:t xml:space="preserve">            &lt;button class="btn btn-student" id="success-modal-close-btn" style="width: 100%;"&gt;Отлично&lt;/button&gt;</w:t>
-              <w:br/>
-              <w:t xml:space="preserve">        &lt;/div&gt;</w:t>
-              <w:br/>
-              <w:t xml:space="preserve">    &lt;/div&gt;</w:t>
-              <w:br/>
-              <w:br/>
-              <w:t xml:space="preserve">    &lt;!-- Общие базы данных, компоненты и основное приложение студента --&gt;</w:t>
-              <w:br/>
-              <w:t xml:space="preserve">    &lt;script src="https://cdn.jsdelivr.net/npm/@supabase/supabase-js@2"&gt;&lt;/script&gt;</w:t>
-              <w:br/>
-              <w:t xml:space="preserve">    &lt;script src="js/database.js?v=1.1"&gt;&lt;/script&gt;</w:t>
-              <w:br/>
-              <w:t xml:space="preserve">    &lt;script src="js/components.js?v=1.1"&gt;&lt;/script&gt;</w:t>
-              <w:br/>
-              <w:t xml:space="preserve">    &lt;script src="js/app-student.js?v=1.1"&gt;&lt;/script&gt;</w:t>
-              <w:br/>
-              <w:t>&lt;/body&gt;</w:t>
-              <w:br/>
-              <w:t>&lt;/html&gt;</w:t>
-              <w:br/>
-            </w:r>
-          </w:p>
-        </w:tc>
-      </w:tr>
-    </w:tbl>
-    <w:tbl>
-      <w:tblPr>
-        <w:tblW w:type="auto" w:w="0"/>
-        <w:jc w:val="center"/>
-        <w:tblLook w:firstColumn="1" w:firstRow="1" w:lastColumn="0" w:lastRow="0" w:noHBand="0" w:noVBand="1" w:val="04A0"/>
-      </w:tblPr>
-      <w:tblGrid>
-        <w:gridCol w:w="9354"/>
-      </w:tblGrid>
-      <w:tr>
-        <w:tc>
-          <w:tcPr>
-            <w:tcW w:type="dxa" w:w="9354"/>
-            <w:shd w:val="clear" w:color="auto" w:fill="F1F5F9"/>
-            <w:tcMar>
-              <w:top w:w="120" w:type="dxa"/>
-              <w:left w:w="120" w:type="dxa"/>
-              <w:bottom w:w="120" w:type="dxa"/>
-              <w:right w:w="120" w:type="dxa"/>
-            </w:tcMar>
-          </w:tcPr>
-          <w:p>
-            <w:pPr>
-              <w:spacing w:after="40" w:before="40"/>
-            </w:pPr>
-            <w:r>
-              <w:rPr>
-                <w:rFonts w:ascii="Courier New" w:hAnsi="Courier New"/>
-                <w:color w:val="0F172A"/>
-                <w:sz w:val="17"/>
-              </w:rPr>
-              <w:t>&lt;!DOCTYPE html&gt;</w:t>
-              <w:br/>
-              <w:t>&lt;html lang="ru"&gt;</w:t>
-              <w:br/>
-              <w:t>&lt;head&gt;</w:t>
-              <w:br/>
-              <w:t xml:space="preserve">    &lt;meta charset="UTF-8"&gt;</w:t>
-              <w:br/>
-              <w:t xml:space="preserve">    &lt;meta name="viewport" content="width=device-width, initial-scale=1.0"&gt;</w:t>
-              <w:br/>
-              <w:t xml:space="preserve">    &lt;title&gt;Панель Преподавателя | Система учета посещаемости&lt;/title&gt;</w:t>
-              <w:br/>
-              <w:t xml:space="preserve">    </w:t>
-              <w:br/>
-              <w:t xml:space="preserve">    &lt;!-- Глобальный отслеживатель ошибок в UI для отладки --&gt;</w:t>
-              <w:br/>
-              <w:t xml:space="preserve">    &lt;script&gt;</w:t>
-              <w:br/>
-              <w:t xml:space="preserve">        window.addEventListener('error', function(e) {</w:t>
-              <w:br/>
-              <w:t xml:space="preserve">            const errorDiv = document.createElement('div');</w:t>
-              <w:br/>
-              <w:t xml:space="preserve">            errorDiv.style.position = 'fixed';</w:t>
-              <w:br/>
-              <w:t xml:space="preserve">            errorDiv.style.top = '10px';</w:t>
-              <w:br/>
-              <w:t xml:space="preserve">            errorDiv.style.left = '10px';</w:t>
-              <w:br/>
-              <w:t xml:space="preserve">            errorDiv.style.right = '10px';</w:t>
-              <w:br/>
-              <w:t xml:space="preserve">            errorDiv.style.background = 'rgba(244, 63, 94, 0.95)';</w:t>
-              <w:br/>
-              <w:t xml:space="preserve">            errorDiv.style.color = '#ffffff';</w:t>
-              <w:br/>
-              <w:t xml:space="preserve">            errorDiv.style.padding = '15px';</w:t>
-              <w:br/>
-              <w:t xml:space="preserve">            errorDiv.style.borderRadius = '8px';</w:t>
-              <w:br/>
-              <w:t xml:space="preserve">            errorDiv.style.zIndex = '99999';</w:t>
-              <w:br/>
-              <w:t xml:space="preserve">            errorDiv.style.fontFamily = 'monospace';</w:t>
-              <w:br/>
-              <w:t xml:space="preserve">            errorDiv.style.fontSize = '12px';</w:t>
-              <w:br/>
-              <w:t xml:space="preserve">            errorDiv.style.boxShadow = '0 10px 30px rgba(0,0,0,0.5)';</w:t>
-              <w:br/>
-              <w:t xml:space="preserve">            errorDiv.innerHTML = '&lt;strong&gt;[JS ERROR]&lt;/strong&gt; ' + e.message + ' &lt;br&gt;&lt;small style="color:rgba(255,255,255,0.7);"&gt;' + e.filename + ':' + e.lineno + '&lt;/small&gt;';</w:t>
-              <w:br/>
-              <w:t xml:space="preserve">            document.body.appendChild(errorDiv);</w:t>
-              <w:br/>
-              <w:t xml:space="preserve">        });</w:t>
-              <w:br/>
-              <w:br/>
-              <w:t xml:space="preserve">        window.addEventListener('unhandledrejection', function(e) {</w:t>
-              <w:br/>
-              <w:t xml:space="preserve">            const errorDiv = document.createElement('div');</w:t>
-              <w:br/>
-              <w:t xml:space="preserve">            errorDiv.style.position = 'fixed';</w:t>
-              <w:br/>
-              <w:t xml:space="preserve">            errorDiv.style.top = '10px';</w:t>
-              <w:br/>
-              <w:t xml:space="preserve">            errorDiv.style.left = '10px';</w:t>
-              <w:br/>
-              <w:t xml:space="preserve">            errorDiv.style.right = '10px';</w:t>
-              <w:br/>
-              <w:t xml:space="preserve">            errorDiv.style.background = 'rgba(244, 63, 94, 0.95)';</w:t>
-              <w:br/>
-              <w:t xml:space="preserve">            errorDiv.style.color = '#ffffff';</w:t>
-              <w:br/>
-              <w:t xml:space="preserve">            errorDiv.style.padding = '15px';</w:t>
-              <w:br/>
-              <w:t xml:space="preserve">            errorDiv.style.borderRadius = '8px';</w:t>
-              <w:br/>
-              <w:t xml:space="preserve">            errorDiv.style.zIndex = '99999';</w:t>
-              <w:br/>
-              <w:t xml:space="preserve">            errorDiv.style.fontFamily = 'monospace';</w:t>
-              <w:br/>
-              <w:t xml:space="preserve">            errorDiv.style.fontSize = '12px';</w:t>
-              <w:br/>
-              <w:t xml:space="preserve">            errorDiv.style.boxShadow = '0 10px 30px rgba(0,0,0,0.5)';</w:t>
-              <w:br/>
-              <w:t xml:space="preserve">            errorDiv.innerHTML = '&lt;strong&gt;[DATABASE/PROMISE ERROR]&lt;/strong&gt; ' + (e.reason ? e.reason.message || e.reason : 'Unhandled Rejection') + (e.reason &amp;&amp; e.reason.stack ? '&lt;br&gt;&lt;pre style="white-space:pre-wrap;font-size:10px;margin-top:5px;opacity:0.8;font-family:monospace;"&gt;' + e.reason.stack + '&lt;/pre&gt;' : '');</w:t>
-              <w:br/>
-              <w:t xml:space="preserve">            document.body.appendChild(errorDiv);</w:t>
-              <w:br/>
-              <w:t xml:space="preserve">        });</w:t>
-              <w:br/>
-              <w:t xml:space="preserve">    &lt;/script&gt;</w:t>
-              <w:br/>
-              <w:t xml:space="preserve">    </w:t>
-              <w:br/>
-              <w:t xml:space="preserve">    &lt;!-- Подключение QRious из CDN для оффлайн генерации QR-кодов на холсте --&gt;</w:t>
-              <w:br/>
-              <w:t xml:space="preserve">    &lt;script src="https://cdnjs.cloudflare.com/ajax/libs/qrious/4.0.2/qrious.min.js" referrerpolicy="no-referrer"&gt;&lt;/script&gt;</w:t>
-              <w:br/>
-              <w:t xml:space="preserve">    </w:t>
-              <w:br/>
-              <w:t xml:space="preserve">    &lt;!-- Стили --&gt;</w:t>
-              <w:br/>
-              <w:t xml:space="preserve">    &lt;link rel="stylesheet" href="css/style.css"&gt;</w:t>
-              <w:br/>
-              <w:t>&lt;/head&gt;</w:t>
-              <w:br/>
-              <w:t>&lt;body&gt;</w:t>
-              <w:br/>
-              <w:br/>
-              <w:t xml:space="preserve">    &lt;!-- Шапка сайта (Header) --&gt;</w:t>
-              <w:br/>
-              <w:t xml:space="preserve">    &lt;header class="header-glass" id="main-header" style="display: none;"&gt;</w:t>
-              <w:br/>
-              <w:t xml:space="preserve">        &lt;div class="logo"&gt;</w:t>
-              <w:br/>
-              <w:t xml:space="preserve">            &lt;span&gt;🎓&lt;/span&gt; SMART&lt;span&gt;ATTEND&lt;/span&gt; &lt;small style="font-size: 0.65rem; background: var(--clr-teacher); color: #fff; padding: 2px 8px; border-radius: 10px; margin-left: 5px; text-transform: uppercase;"&gt;Teacher&lt;/small&gt;</w:t>
-              <w:br/>
-              <w:t xml:space="preserve">        &lt;/div&gt;</w:t>
-              <w:br/>
-              <w:t xml:space="preserve">        &lt;div class="header-user-badge"&gt;</w:t>
-              <w:br/>
-              <w:t xml:space="preserve">            &lt;div class="user-info-text"&gt;</w:t>
-              <w:br/>
-              <w:t xml:space="preserve">                &lt;span class="name" id="header-teacher-name"&gt;Смирнов Д. А.&lt;/span&gt;</w:t>
-              <w:br/>
-              <w:t xml:space="preserve">                &lt;span class="role"&gt;Преподаватель&lt;/span&gt;</w:t>
-              <w:br/>
-              <w:t xml:space="preserve">            &lt;/div&gt;</w:t>
-              <w:br/>
-              <w:t xml:space="preserve">            &lt;button class="btn btn-secondary" id="logout-btn" style="padding: 8px 16px; font-size: 0.85rem;"&gt;Выйти&lt;/button&gt;</w:t>
-              <w:br/>
-              <w:t xml:space="preserve">        &lt;/div&gt;</w:t>
-              <w:br/>
-              <w:t xml:space="preserve">    &lt;/header&gt;</w:t>
-              <w:br/>
-              <w:br/>
-              <w:t xml:space="preserve">    &lt;!-- Раздел Авторизации (Вход / Регистрация) --&gt;</w:t>
-              <w:br/>
-              <w:t xml:space="preserve">    &lt;main class="auth-wrapper" id="auth-section"&gt;</w:t>
-              <w:br/>
-              <w:t xml:space="preserve">        &lt;div class="glass-card auth-card fade-in"&gt;</w:t>
-              <w:br/>
-              <w:t xml:space="preserve">            &lt;div class="auth-header"&gt;</w:t>
-              <w:br/>
-              <w:t xml:space="preserve">                &lt;div style="font-size: 3rem; margin-bottom: 10px;"&gt;👨‍🏫&lt;/div&gt;</w:t>
-              <w:br/>
-              <w:t xml:space="preserve">                &lt;h2&gt;Кабинет Преподавателя&lt;/h2&gt;</w:t>
-              <w:br/>
-              <w:t xml:space="preserve">                &lt;p style="color: var(--text-secondary); font-size: 0.9rem;"&gt;Создавайте лекции, генерируйте QR-коды и управляйте отметками&lt;/p&gt;</w:t>
-              <w:br/>
-              <w:t xml:space="preserve">            &lt;/div&gt;</w:t>
-              <w:br/>
-              <w:br/>
-              <w:t xml:space="preserve">            &lt;!-- Табы переключения --&gt;</w:t>
-              <w:br/>
-              <w:t xml:space="preserve">            &lt;div class="auth-tabs"&gt;</w:t>
-              <w:br/>
-              <w:t xml:space="preserve">                &lt;button class="auth-tab active" id="tab-login-btn"&gt;Войти&lt;/button&gt;</w:t>
-              <w:br/>
-              <w:t xml:space="preserve">                &lt;button class="auth-tab" id="tab-register-btn"&gt;Регистрация&lt;/button&gt;</w:t>
-              <w:br/>
-              <w:t xml:space="preserve">            &lt;/div&gt;</w:t>
-              <w:br/>
-              <w:br/>
-              <w:t xml:space="preserve">            &lt;!-- Форма входа --&gt;</w:t>
-              <w:br/>
-              <w:t xml:space="preserve">            &lt;form id="login-form"&gt;</w:t>
-              <w:br/>
-              <w:t xml:space="preserve">                &lt;div class="form-group"&gt;</w:t>
-              <w:br/>
-              <w:t xml:space="preserve">                    &lt;label for="login-username"&gt;Логин преподавателя&lt;/label&gt;</w:t>
-              <w:br/>
-              <w:t xml:space="preserve">                    &lt;input type="text" id="login-username" class="input-control" placeholder="Введите логин" required autocomplete="username"&gt;</w:t>
-              <w:br/>
-              <w:t xml:space="preserve">                &lt;/div&gt;</w:t>
-              <w:br/>
-              <w:t xml:space="preserve">                &lt;div class="form-group"&gt;</w:t>
-              <w:br/>
-              <w:t xml:space="preserve">                    &lt;label for="login-password"&gt;Пароль&lt;/label&gt;</w:t>
-              <w:br/>
-              <w:t xml:space="preserve">                    &lt;input type="password" id="login-password" class="input-control" placeholder="Введите пароль" required autocomplete="current-password"&gt;</w:t>
-              <w:br/>
-              <w:t xml:space="preserve">                &lt;/div&gt;</w:t>
-              <w:br/>
-              <w:t xml:space="preserve">                &lt;button type="submit" class="btn btn-teacher" style="width: 100%; margin-top: 10px;"&gt;Войти в кабинет&lt;/button&gt;</w:t>
-              <w:br/>
-              <w:t xml:space="preserve">            &lt;/form&gt;</w:t>
-              <w:br/>
-              <w:br/>
-              <w:t xml:space="preserve">            &lt;!-- Форма регистрации --&gt;</w:t>
-              <w:br/>
-              <w:t xml:space="preserve">            &lt;form id="register-form" style="display: none;"&gt;</w:t>
-              <w:br/>
-              <w:t xml:space="preserve">                &lt;div class="form-group"&gt;</w:t>
-              <w:br/>
-              <w:t xml:space="preserve">                    &lt;label for="reg-lastname"&gt;Фамилия&lt;/label&gt;</w:t>
-              <w:br/>
-              <w:t xml:space="preserve">                    &lt;input type="text" id="reg-lastname" class="input-control" placeholder="Например: Смирнов" required&gt;</w:t>
-              <w:br/>
-              <w:t xml:space="preserve">                &lt;/div&gt;</w:t>
-              <w:br/>
-              <w:t xml:space="preserve">                &lt;div class="form-group"&gt;</w:t>
-              <w:br/>
-              <w:t xml:space="preserve">                    &lt;label for="reg-firstname"&gt;Имя&lt;/label&gt;</w:t>
-              <w:br/>
-              <w:t xml:space="preserve">                    &lt;input type="text" id="reg-firstname" class="input-control" placeholder="Например: Дмитрий" required&gt;</w:t>
-              <w:br/>
-              <w:t xml:space="preserve">                &lt;/div&gt;</w:t>
-              <w:br/>
-              <w:t xml:space="preserve">                &lt;div class="form-group"&gt;</w:t>
-              <w:br/>
-              <w:t xml:space="preserve">                    &lt;label for="reg-patronymic"&gt;Отчество&lt;/label&gt;</w:t>
-              <w:br/>
-              <w:t xml:space="preserve">                    &lt;input type="text" id="reg-patronymic" class="input-control" placeholder="Например: Алексеевич (необязательно)"&gt;</w:t>
-              <w:br/>
-              <w:t xml:space="preserve">                &lt;/div&gt;</w:t>
-              <w:br/>
-              <w:t xml:space="preserve">                &lt;div class="form-group"&gt;</w:t>
-              <w:br/>
-              <w:t xml:space="preserve">                    &lt;label for="reg-username"&gt;Создайте Логин&lt;/label&gt;</w:t>
-              <w:br/>
-              <w:t xml:space="preserve">                    &lt;input type="text" id="reg-username" class="input-control" placeholder="Например: teacher123" required autocomplete="username"&gt;</w:t>
-              <w:br/>
-              <w:t xml:space="preserve">                &lt;/div&gt;</w:t>
-              <w:br/>
-              <w:t xml:space="preserve">                &lt;div class="form-group"&gt;</w:t>
-              <w:br/>
-              <w:t xml:space="preserve">                    &lt;label for="reg-password"&gt;Создайте Пароль&lt;/label&gt;</w:t>
-              <w:br/>
-              <w:t xml:space="preserve">                    &lt;input type="password" id="reg-password" class="input-control" placeholder="Минимум 4 символа" required autocomplete="new-password"&gt;</w:t>
-              <w:br/>
-              <w:t xml:space="preserve">                &lt;/div&gt;</w:t>
-              <w:br/>
-              <w:t xml:space="preserve">                &lt;button type="submit" class="btn btn-teacher" style="width: 100%; margin-top: 10px;"&gt;Зарегистрироваться&lt;/button&gt;</w:t>
-              <w:br/>
-              <w:t xml:space="preserve">            &lt;/form&gt;</w:t>
-              <w:br/>
-              <w:t xml:space="preserve">            </w:t>
-              <w:br/>
-              <w:t xml:space="preserve">            &lt;div class="auth-footer-link"&gt;</w:t>
-              <w:br/>
-              <w:t xml:space="preserve">                &lt;p&gt;Вы студент? &lt;a href="student.html" style="color: var(--clr-student);"&gt;Кабинет Студента &amp;rarr;&lt;/a&gt;&lt;/p&gt;</w:t>
-              <w:br/>
-              <w:t xml:space="preserve">            &lt;/div&gt;</w:t>
-              <w:br/>
-              <w:t xml:space="preserve">        &lt;/div&gt;</w:t>
-              <w:br/>
-              <w:t xml:space="preserve">    &lt;/main&gt;</w:t>
-              <w:br/>
-              <w:br/>
-              <w:t xml:space="preserve">    &lt;!-- Основной кабинет Преподавателя (После авторизации) --&gt;</w:t>
-              <w:br/>
-              <w:t xml:space="preserve">    &lt;main class="teacher-grid" id="dashboard-section" style="display: none;"&gt;</w:t>
-              <w:br/>
-              <w:t xml:space="preserve">        </w:t>
-              <w:br/>
-              <w:t xml:space="preserve">        &lt;!-- Левый Сайдбар - Управление Предметами &amp; История --&gt;</w:t>
-              <w:br/>
-              <w:t xml:space="preserve">        &lt;aside class="teacher-sidebar"&gt;</w:t>
-              <w:br/>
-              <w:t xml:space="preserve">            &lt;div&gt;</w:t>
-              <w:br/>
-              <w:t xml:space="preserve">                &lt;button class="btn btn-teacher" id="add-subject-trigger-btn" style="width: 100%; border-radius: 12px; margin-bottom: 24px; padding: 14px 20px;"&gt;</w:t>
-              <w:br/>
-              <w:t xml:space="preserve">                    ➕ Добавить предмет</w:t>
-              <w:br/>
-              <w:t xml:space="preserve">                &lt;/button&gt;</w:t>
-              <w:br/>
-              <w:t xml:space="preserve">                </w:t>
-              <w:br/>
-              <w:t xml:space="preserve">                &lt;h4 class="sidebar-title"&gt;Мои Предметы &amp; Занятия&lt;/h4&gt;</w:t>
-              <w:br/>
-              <w:t xml:space="preserve">                </w:t>
-              <w:br/>
-              <w:t xml:space="preserve">                &lt;!-- Список предметов и истории (динамически через JS) --&gt;</w:t>
-              <w:br/>
-              <w:t xml:space="preserve">                &lt;div id="subjects-container-list"&gt;</w:t>
-              <w:br/>
-              <w:t xml:space="preserve">                    &lt;!-- Заполняется группами предметов, внутри каждой раскрывается история сессий по дням --&gt;</w:t>
-              <w:br/>
-              <w:t xml:space="preserve">                &lt;/div&gt;</w:t>
-              <w:br/>
-              <w:t xml:space="preserve">                </w:t>
-              <w:br/>
-              <w:t xml:space="preserve">                &lt;div id="subjects-empty-state" class="empty-placeholder" style="padding: 20px 10px; font-size: 0.85rem;"&gt;</w:t>
-              <w:br/>
-              <w:t xml:space="preserve">                    &lt;span&gt;📚&lt;/span&gt;</w:t>
-              <w:br/>
-              <w:t xml:space="preserve">                    &lt;p&gt;Нет предметов. Нажмите кнопку выше для добавления!&lt;/p&gt;</w:t>
-              <w:br/>
-              <w:t xml:space="preserve">                &lt;/div&gt;</w:t>
-              <w:br/>
-              <w:t xml:space="preserve">            &lt;/div&gt;</w:t>
-              <w:br/>
-              <w:t xml:space="preserve">        &lt;/aside&gt;</w:t>
-              <w:br/>
-              <w:br/>
-              <w:t xml:space="preserve">        &lt;!-- Правая рабочая панель --&gt;</w:t>
-              <w:br/>
-              <w:t xml:space="preserve">        &lt;section class="teacher-main fade-in"&gt;</w:t>
-              <w:br/>
-              <w:t xml:space="preserve">            </w:t>
-              <w:br/>
-              <w:t xml:space="preserve">            &lt;!-- Заголовок / Приветствие --&gt;</w:t>
-              <w:br/>
-              <w:t xml:space="preserve">            &lt;div class="teacher-welcome-container"&gt;</w:t>
-              <w:br/>
-              <w:t xml:space="preserve">                &lt;div&gt;</w:t>
-              <w:br/>
-              <w:t xml:space="preserve">                    &lt;h2 id="teacher-welcome-title"&gt;С возвращением, Дмитрий Алексеевич!&lt;/h2&gt;</w:t>
-              <w:br/>
-              <w:t xml:space="preserve">                    &lt;p style="color: var(--text-secondary); font-size: 0.95rem;"&gt;Управляйте аудиториями, создавайте QR-коды для лекций&lt;/p&gt;</w:t>
-              <w:br/>
-              <w:t xml:space="preserve">                &lt;/div&gt;</w:t>
-              <w:br/>
-              <w:t xml:space="preserve">            &lt;/div&gt;</w:t>
-              <w:br/>
-              <w:br/>
-              <w:t xml:space="preserve">            &lt;!-- Лента показателей KPI --&gt;</w:t>
-              <w:br/>
-              <w:t xml:space="preserve">            &lt;div class="dashboard-stats-strip"&gt;</w:t>
-              <w:br/>
-              <w:t xml:space="preserve">                &lt;div class="glass-card stat-card-glow"&gt;</w:t>
-              <w:br/>
-              <w:t xml:space="preserve">                    &lt;span class="title"&gt;Мои предметы&lt;/span&gt;</w:t>
-              <w:br/>
-              <w:t xml:space="preserve">                    &lt;span class="number" id="kpi-subjects-count"&gt;0&lt;/span&gt;</w:t>
-              <w:br/>
-              <w:t xml:space="preserve">                &lt;/div&gt;</w:t>
-              <w:br/>
-              <w:t xml:space="preserve">                &lt;div class="glass-card stat-card-glow success"&gt;</w:t>
-              <w:br/>
-              <w:t xml:space="preserve">                    &lt;span class="title"&gt;Всего лекций&lt;/span&gt;</w:t>
-              <w:br/>
-              <w:t xml:space="preserve">                    &lt;span class="number" id="kpi-sessions-count"&gt;0&lt;/span&gt;</w:t>
-              <w:br/>
-              <w:t xml:space="preserve">                &lt;/div&gt;</w:t>
-              <w:br/>
-              <w:t xml:space="preserve">                &lt;div class="glass-card stat-card-glow active"&gt;</w:t>
-              <w:br/>
-              <w:t xml:space="preserve">                    &lt;span class="title"&gt;Присутствуют сейчас&lt;/span&gt;</w:t>
-              <w:br/>
-              <w:t xml:space="preserve">                    &lt;span class="number" id="kpi-present-count"&gt;0&lt;/span&gt;</w:t>
-              <w:br/>
-              <w:t xml:space="preserve">                &lt;/div&gt;</w:t>
-              <w:br/>
-              <w:t xml:space="preserve">            &lt;/div&gt;</w:t>
-              <w:br/>
-              <w:br/>
-              <w:t xml:space="preserve">            &lt;!-- Главный блок выбранного занятия --&gt;</w:t>
-              <w:br/>
-              <w:t xml:space="preserve">            &lt;div id="active-session-workspace" style="display: none;"&gt;</w:t>
-              <w:br/>
-              <w:t xml:space="preserve">                </w:t>
-              <w:br/>
-              <w:t xml:space="preserve">                &lt;!-- QR-код сессии --&gt;</w:t>
-              <w:br/>
-              <w:t xml:space="preserve">                &lt;div class="glass-card qr-container-card" id="qr-display-container" style="display: none;"&gt;</w:t>
-              <w:br/>
-              <w:t xml:space="preserve">                    &lt;div class="qr-box-wrapper"&gt;</w:t>
-              <w:br/>
-              <w:t xml:space="preserve">                        &lt;canvas id="class-qr-canvas"&gt;&lt;/canvas&gt;</w:t>
-              <w:br/>
-              <w:t xml:space="preserve">                    &lt;/div&gt;</w:t>
-              <w:br/>
-              <w:t xml:space="preserve">                    &lt;div class="active-lesson-info"&gt;</w:t>
-              <w:br/>
-              <w:t xml:space="preserve">                        &lt;span class="active-lesson-badge"&gt;АКТИВНОЕ ЗАНЯТИЕ&lt;/span&gt;</w:t>
-              <w:br/>
-              <w:t xml:space="preserve">                        &lt;h2 id="active-lesson-subject-name" style="margin: 4px 0 8px;"&gt;Английский язык (Лекция)&lt;/h2&gt;</w:t>
-              <w:br/>
-              <w:t xml:space="preserve">                        &lt;p style="color: var(--text-secondary); font-size: 0.95rem; line-height: 1.4;"&gt;</w:t>
-              <w:br/>
-              <w:t xml:space="preserve">                            📅 &lt;strong&gt;День:&lt;/strong&gt; &lt;span id="active-lesson-day"&gt;Понедельник&lt;/span&gt;, &lt;span id="active-lesson-date"&gt;30 мая 2026&lt;/span&gt;&lt;br&gt;</w:t>
-              <w:br/>
-              <w:t xml:space="preserve">                            ⏰ &lt;strong&gt;Начало лекции:&lt;/strong&gt; &lt;span id="active-lesson-time"&gt;13:45&lt;/span&gt;</w:t>
-              <w:br/>
-              <w:t xml:space="preserve">                        &lt;/p&gt;</w:t>
-              <w:br/>
-              <w:t xml:space="preserve">                        &lt;div style="display: flex; gap: 12px; margin-top: 14px;"&gt;</w:t>
-              <w:br/>
-              <w:t xml:space="preserve">                            &lt;button class="btn btn-teacher" id="fullscreen-qr-btn"&gt;🔍 Во весь экран&lt;/button&gt;</w:t>
-              <w:br/>
-              <w:t xml:space="preserve">                            &lt;button class="btn btn-secondary" id="deactivate-qr-btn"&gt;❌ Закрыть занятие&lt;/button&gt;</w:t>
-              <w:br/>
-              <w:t xml:space="preserve">                        &lt;/div&gt;</w:t>
-              <w:br/>
-              <w:t xml:space="preserve">                    &lt;/div&gt;</w:t>
-              <w:br/>
-              <w:t xml:space="preserve">                &lt;/div&gt;</w:t>
-              <w:br/>
-              <w:br/>
-              <w:t xml:space="preserve">                &lt;!-- Шапка таблицы, Сортировка и Фильтрация --&gt;</w:t>
-              <w:br/>
-              <w:t xml:space="preserve">                &lt;div class="glass-card"&gt;</w:t>
-              <w:br/>
-              <w:t xml:space="preserve">                    &lt;div class="table-header-strip"&gt;</w:t>
-              <w:br/>
-              <w:t xml:space="preserve">                        &lt;div&gt;</w:t>
-              <w:br/>
-              <w:t xml:space="preserve">                            &lt;h3 id="table-roster-title" style="margin-bottom: 4px;"&gt;Список посещаемости&lt;/h3&gt;</w:t>
-              <w:br/>
-              <w:t xml:space="preserve">                            &lt;p style="color: var(--text-secondary); font-size: 0.85rem;" id="table-roster-subtitle"&gt;Сессия: Понедельник, 30 мая&lt;/p&gt;</w:t>
-              <w:br/>
-              <w:t xml:space="preserve">                        &lt;/div&gt;</w:t>
-              <w:br/>
-              <w:t xml:space="preserve">                        </w:t>
-              <w:br/>
-              <w:t xml:space="preserve">                        &lt;!-- Блок Управления и Фильтров --&gt;</w:t>
-              <w:br/>
-              <w:t xml:space="preserve">                        &lt;div class="table-filter-group"&gt;</w:t>
-              <w:br/>
-              <w:t xml:space="preserve">                            &lt;button class="btn btn-teacher" id="start-new-session-btn" style="padding: 8px 16px; font-size: 0.85rem; border-radius: 8px;"&gt;</w:t>
-              <w:br/>
-              <w:t xml:space="preserve">                                🔄 Начать новое занятие (Новый QR)</w:t>
-              <w:br/>
-              <w:t xml:space="preserve">                            &lt;/button&gt;</w:t>
-              <w:br/>
-              <w:t xml:space="preserve">                            </w:t>
-              <w:br/>
-              <w:t xml:space="preserve">                            &lt;select id="group-filter-dropdown" class="select-control"&gt;</w:t>
-              <w:br/>
-              <w:t xml:space="preserve">                                &lt;option value="all"&gt;Все группы&lt;/option&gt;</w:t>
-              <w:br/>
-              <w:t xml:space="preserve">                                &lt;!-- Наполняется динамически --&gt;</w:t>
-              <w:br/>
-              <w:t xml:space="preserve">                            &lt;/select&gt;</w:t>
-              <w:br/>
-              <w:t xml:space="preserve">                        &lt;/div&gt;</w:t>
-              <w:br/>
-              <w:t xml:space="preserve">                    &lt;/div&gt;</w:t>
-              <w:br/>
-              <w:br/>
-              <w:t xml:space="preserve">                    &lt;!-- Таблица студентов --&gt;</w:t>
-              <w:br/>
-              <w:t xml:space="preserve">                    &lt;div class="table-wrapper"&gt;</w:t>
-              <w:br/>
-              <w:t xml:space="preserve">                        &lt;table class="attendance-table" id="roster-table"&gt;</w:t>
-              <w:br/>
-              <w:t xml:space="preserve">                            &lt;thead&gt;</w:t>
-              <w:br/>
-              <w:t xml:space="preserve">                                &lt;tr&gt;</w:t>
-              <w:br/>
-              <w:t xml:space="preserve">                                    &lt;th class="sortable" id="sort-lastname"&gt;Фамилия&lt;/th&gt;</w:t>
-              <w:br/>
-              <w:t xml:space="preserve">                                    &lt;th class="sortable" id="sort-firstname"&gt;Имя&lt;/th&gt;</w:t>
-              <w:br/>
-              <w:t xml:space="preserve">                                    &lt;th class="sortable" id="sort-patronymic"&gt;Отчество&lt;/th&gt;</w:t>
-              <w:br/>
-              <w:t xml:space="preserve">                                    &lt;th class="sortable" id="sort-group"&gt;Группа&lt;/th&gt;</w:t>
-              <w:br/>
-              <w:t xml:space="preserve">                                    &lt;th class="sortable" id="sort-time"&gt;Время отметки&lt;/th&gt;</w:t>
-              <w:br/>
-              <w:t xml:space="preserve">                                    &lt;th&gt;Статус&lt;/th&gt;</w:t>
-              <w:br/>
-              <w:t xml:space="preserve">                                &lt;/tr&gt;</w:t>
-              <w:br/>
-              <w:t xml:space="preserve">                            &lt;/thead&gt;</w:t>
-              <w:br/>
-              <w:t xml:space="preserve">                            &lt;tbody id="teacher-attendance-tbody"&gt;</w:t>
-              <w:br/>
-              <w:t xml:space="preserve">                                &lt;!-- Наполняется динамически через JS --&gt;</w:t>
-              <w:br/>
-              <w:t xml:space="preserve">                            &lt;/tbody&gt;</w:t>
-              <w:br/>
-              <w:t xml:space="preserve">                        &lt;/table&gt;</w:t>
-              <w:br/>
-              <w:t xml:space="preserve">                    &lt;/div&gt;</w:t>
-              <w:br/>
-              <w:br/>
-              <w:t xml:space="preserve">                    &lt;div id="roster-empty-state" class="empty-placeholder"&gt;</w:t>
-              <w:br/>
-              <w:t xml:space="preserve">                        &lt;span class="icon"&gt;👥&lt;/span&gt;</w:t>
-              <w:br/>
-              <w:t xml:space="preserve">                        &lt;p&gt;На этой лекции пока никто не отметился. Покажите QR-код студентам для сканирования!&lt;/p&gt;</w:t>
-              <w:br/>
-              <w:t xml:space="preserve">                    &lt;/div&gt;</w:t>
-              <w:br/>
-              <w:t xml:space="preserve">                &lt;/div&gt;</w:t>
-              <w:br/>
-              <w:t xml:space="preserve">            &lt;/div&gt;</w:t>
-              <w:br/>
-              <w:br/>
-              <w:t xml:space="preserve">            &lt;!-- Подсказка, если предмет не выбран --&gt;</w:t>
-              <w:br/>
-              <w:t xml:space="preserve">            &lt;div id="no-subject-selected-workspace" class="glass-card empty-placeholder" style="padding: 100px 20px;"&gt;</w:t>
-              <w:br/>
-              <w:t xml:space="preserve">                &lt;span class="icon" style="font-size: 4rem;"&gt;👈&lt;/span&gt;</w:t>
-              <w:br/>
-              <w:t xml:space="preserve">                &lt;h3&gt;Добро пожаловать в Кабинет Учителя!&lt;/h3&gt;</w:t>
-              <w:br/>
-              <w:t xml:space="preserve">                &lt;p style="max-width: 420px; margin: 10px auto 0; color: var(--text-secondary); font-size: 0.95rem;"&gt;Выберите предмет в меню слева или добавьте новый, чтобы сгенерировать QR-код лекции и просмотреть статистику посещаемости по дням.&lt;/p&gt;</w:t>
-              <w:br/>
-              <w:t xml:space="preserve">            &lt;/div&gt;</w:t>
-              <w:br/>
-              <w:t xml:space="preserve">        &lt;/section&gt;</w:t>
-              <w:br/>
-              <w:t xml:space="preserve">    &lt;/main&gt;</w:t>
-              <w:br/>
-              <w:br/>
-              <w:t xml:space="preserve">    &lt;!-- ========================================== --&gt;</w:t>
-              <w:br/>
-              <w:t xml:space="preserve">    &lt;!-- МОДАЛЬНОЕ ОКНО ДОБАВЛЕНИЯ ПРЕДМЕТА --&gt;</w:t>
-              <w:br/>
-              <w:t xml:space="preserve">    &lt;!-- ========================================== --&gt;</w:t>
-              <w:br/>
-              <w:t xml:space="preserve">    &lt;div class="dialog-modal" id="add-subject-modal"&gt;</w:t>
-              <w:br/>
-              <w:t xml:space="preserve">        &lt;div class="glass-card dialog-card"&gt;</w:t>
-              <w:br/>
-              <w:t xml:space="preserve">            &lt;h3 style="margin-bottom: 16px; font-size: 1.3rem;"&gt;Добавление предмета&lt;/h3&gt;</w:t>
-              <w:br/>
-              <w:t xml:space="preserve">            </w:t>
-              <w:br/>
-              <w:t xml:space="preserve">            &lt;form id="add-subject-form"&gt;</w:t>
-              <w:br/>
-              <w:t xml:space="preserve">                &lt;div class="form-group"&gt;</w:t>
-              <w:br/>
-              <w:t xml:space="preserve">                    &lt;label for="new-subject-name"&gt;Название предмета&lt;/label&gt;</w:t>
-              <w:br/>
-              <w:t xml:space="preserve">                    &lt;input type="text" id="new-subject-name" class="input-control" placeholder="Например: Английский язык (Лекция)" required&gt;</w:t>
-              <w:br/>
-              <w:t xml:space="preserve">                &lt;/div&gt;</w:t>
-              <w:br/>
-              <w:t xml:space="preserve">                </w:t>
-              <w:br/>
-              <w:t xml:space="preserve">                &lt;div style="display: flex; gap: 12px; justify-content: flex-end; margin-top: 24px;"&gt;</w:t>
-              <w:br/>
-              <w:t xml:space="preserve">                    &lt;button type="button" class="btn btn-secondary" id="add-subject-cancel-btn"&gt;Отмена&lt;/button&gt;</w:t>
-              <w:br/>
-              <w:t xml:space="preserve">                    &lt;button type="submit" class="btn btn-teacher"&gt;Создать&lt;/button&gt;</w:t>
-              <w:br/>
-              <w:t xml:space="preserve">                &lt;/div&gt;</w:t>
-              <w:br/>
-              <w:t xml:space="preserve">            &lt;/form&gt;</w:t>
-              <w:br/>
-              <w:t xml:space="preserve">        &lt;/div&gt;</w:t>
-              <w:br/>
-              <w:t xml:space="preserve">    &lt;/div&gt;</w:t>
-              <w:br/>
-              <w:br/>
-              <w:t xml:space="preserve">    &lt;!-- ========================================== --&gt;</w:t>
-              <w:br/>
-              <w:t xml:space="preserve">    &lt;!-- МОДАЛЬНОЕ ОКНО QR-КОДА ВО ВЕСЬ ЭКРАН --&gt;</w:t>
-              <w:br/>
-              <w:t xml:space="preserve">    &lt;!-- ========================================== --&gt;</w:t>
-              <w:br/>
-              <w:t xml:space="preserve">    &lt;div class="fullscreen-qr-modal" id="fullscreen-qr-modal"&gt;</w:t>
-              <w:br/>
-              <w:t xml:space="preserve">        &lt;button class="scanner-close-btn" id="fullscreen-qr-close-btn" style="top: 40px; right: 40px;"&gt;&amp;times;&lt;/button&gt;</w:t>
-              <w:br/>
-              <w:t xml:space="preserve">        </w:t>
-              <w:br/>
-              <w:t xml:space="preserve">        &lt;div class="fullscreen-qr-box"&gt;</w:t>
-              <w:br/>
-              <w:t xml:space="preserve">            &lt;canvas id="fullscreen-qr-canvas"&gt;&lt;/canvas&gt;</w:t>
-              <w:br/>
-              <w:t xml:space="preserve">        &lt;/div&gt;</w:t>
-              <w:br/>
-              <w:t xml:space="preserve">        </w:t>
-              <w:br/>
-              <w:t xml:space="preserve">        &lt;h2 class="fullscreen-title" id="fullscreen-subject-title"&gt;Английский язык (Лекция)&lt;/h2&gt;</w:t>
-              <w:br/>
-              <w:t xml:space="preserve">        &lt;p style="color: var(--text-secondary); font-size: 1.1rem; margin-top: 8px;"&gt;</w:t>
-              <w:br/>
-              <w:t xml:space="preserve">            Сессия от: &lt;span id="fullscreen-session-details"&gt;Понедельник, 30 мая, 13:45&lt;/span&gt;</w:t>
-              <w:br/>
-              <w:t xml:space="preserve">        &lt;/p&gt;</w:t>
-              <w:br/>
-              <w:t xml:space="preserve">        &lt;p style="color: var(--clr-success); font-weight: 600; font-size: 0.95rem; margin-top: 14px; background: rgba(16,185,129,0.12); padding: 6px 16px; border-radius: 20px;"&gt;</w:t>
-              <w:br/>
-              <w:t xml:space="preserve">            📡 Сканируйте код для подтверждения посещаемости</w:t>
-              <w:br/>
-              <w:t xml:space="preserve">        &lt;/p&gt;</w:t>
-              <w:br/>
-              <w:t xml:space="preserve">    &lt;/div&gt;</w:t>
-              <w:br/>
-              <w:br/>
-              <w:t xml:space="preserve">    &lt;!-- Общие базы данных, компоненты и основное приложение преподавателя --&gt;</w:t>
-              <w:br/>
-              <w:t xml:space="preserve">    &lt;script src="https://cdn.jsdelivr.net/npm/@supabase/supabase-js@2"&gt;&lt;/script&gt;</w:t>
-              <w:br/>
-              <w:t xml:space="preserve">    &lt;script src="js/database.js?v=1.1"&gt;&lt;/script&gt;</w:t>
-              <w:br/>
-              <w:t xml:space="preserve">    &lt;script src="js/components.js?v=1.1"&gt;&lt;/script&gt;</w:t>
-              <w:br/>
-              <w:t xml:space="preserve">    &lt;script src="js/app-teacher.js?v=1.1"&gt;&lt;/script&gt;</w:t>
-              <w:br/>
-              <w:t>&lt;/body&gt;</w:t>
-              <w:br/>
-              <w:t>&lt;/html&gt;</w:t>
-              <w:br/>
-            </w:r>
-          </w:p>
-        </w:tc>
-      </w:tr>
-    </w:tbl>
-    <w:p>
-      <w:pPr>
-        <w:spacing w:after="120" w:before="360" w:line="276" w:lineRule="auto"/>
-      </w:pPr>
-      <w:r>
-        <w:rPr>
-          <w:rFonts w:ascii="Times New Roman" w:hAnsi="Times New Roman"/>
-          <w:b/>
-          <w:i w:val="0"/>
-          <w:sz w:val="28"/>
-        </w:rPr>
-        <w:t>Жобаның сілтемесі (GitHub Pages):</w:t>
-      </w:r>
-    </w:p>
-    <w:p>
-      <w:pPr>
-        <w:spacing w:after="240"/>
-      </w:pPr>
-      <w:r>
-        <w:rPr>
-          <w:rFonts w:ascii="Times New Roman" w:hAnsi="Times New Roman"/>
-          <w:b/>
-          <w:color w:val="4F46E5"/>
-          <w:sz w:val="24"/>
-        </w:rPr>
-        <w:t>https://novacoding1.github.io/student-attendance2/</w:t>
-      </w:r>
-    </w:p>
-    <w:p>
-      <w:pPr>
-        <w:spacing w:after="120" w:before="360" w:line="276" w:lineRule="auto"/>
-      </w:pPr>
-      <w:r>
-        <w:rPr>
-          <w:rFonts w:ascii="Times New Roman" w:hAnsi="Times New Roman"/>
-          <w:b/>
-          <w:i w:val="0"/>
-          <w:sz w:val="28"/>
-        </w:rPr>
-        <w:t>Жобаның архитектурасы мен файлдары:</w:t>
-      </w:r>
-    </w:p>
-    <w:p>
-      <w:pPr>
-        <w:spacing w:after="240" w:before="0" w:line="276" w:lineRule="auto"/>
-      </w:pPr>
-      <w:r>
-        <w:rPr>
-          <w:rFonts w:ascii="Times New Roman" w:hAnsi="Times New Roman"/>
-          <w:b w:val="0"/>
-          <w:i w:val="0"/>
-          <w:sz w:val="24"/>
-        </w:rPr>
-        <w:t>Студенттер мен оқытушылардың сабаққа қатысуын бақылайтын жаңа веб-жүйе озық технологиялар мен премиум дизайн негізінде жасалған. Жүйе бұлтты Supabase (PostgreSQL) деректер қорымен толық интеграцияланған және екі дербес кабинеттен тұрады:</w:t>
-        <w:br/>
-        <w:br/>
-        <w:t>• index.html — Жобаның бірыңғай кіру беті (Landing Page). Студент немесе Оқытушы порталын таңдау мүмкіндігін ұсынады.</w:t>
-        <w:br/>
-        <w:t>• student.html — Студенттің жеке кабинеті мен камера арқылы QR-код сканері.</w:t>
-        <w:br/>
-        <w:t>• teacher.html — Оқытушының жеке кабинеті, сабақтар тізімі және QR-код генераторы (7 секунд сайын жаңарады).</w:t>
-        <w:br/>
-        <w:t>• js/database.js — Бұлтты Supabase деректер қорымен және интернет болмаған жағдайда автоматты түрде оффлайн режимге (localStorage) ауысу логикасы бар негізгі деректер менеджері.</w:t>
-        <w:br/>
-        <w:t>• js/app-student.js — Студент кабинеті мен камера сканерінің клиенттік логикасы.</w:t>
-        <w:br/>
-        <w:t>• js/app-teacher.js — Оқытушы кабинеті мен 7 секундтық QR-код ротациясының клиенттік логикасы.</w:t>
-        <w:br/>
-        <w:t>• css/style.css — Заманауи Obsidian Space Dark стиліндегі визуалды дизайн жүйесі.</w:t>
-      </w:r>
-    </w:p>
-    <w:p>
-      <w:pPr>
-        <w:spacing w:after="240" w:before="480" w:line="276" w:lineRule="auto"/>
-      </w:pPr>
-      <w:r>
-        <w:rPr>
-          <w:rFonts w:ascii="Times New Roman" w:hAnsi="Times New Roman"/>
-          <w:b/>
-          <w:i w:val="0"/>
-          <w:sz w:val="28"/>
-        </w:rPr>
-        <w:t>Жобаның негізгі функционалдық кодтары (Маңызды үзінділер):</w:t>
-      </w:r>
-    </w:p>
-    <w:p>
-      <w:pPr>
-        <w:spacing w:after="120" w:before="240" w:line="276" w:lineRule="auto"/>
-      </w:pPr>
-      <w:r>
-        <w:rPr>
-          <w:rFonts w:ascii="Times New Roman" w:hAnsi="Times New Roman"/>
-          <w:b/>
-          <w:i w:val="0"/>
-          <w:sz w:val="24"/>
-        </w:rPr>
-        <w:t>💻 Деректер қоры және Токендерді жаңарту логикасы (js/database.js)</w:t>
-      </w:r>
-    </w:p>
-    <w:tbl>
-      <w:tblPr>
-        <w:tblW w:type="auto" w:w="0"/>
-        <w:jc w:val="center"/>
-        <w:tblLook w:firstColumn="1" w:firstRow="1" w:lastColumn="0" w:lastRow="0" w:noHBand="0" w:noVBand="1" w:val="04A0"/>
-      </w:tblPr>
-      <w:tblGrid>
-        <w:gridCol w:w="9354"/>
-      </w:tblGrid>
-      <w:tr>
-        <w:tc>
-          <w:tcPr>
-            <w:tcW w:type="dxa" w:w="9354"/>
-            <w:shd w:val="clear" w:color="auto" w:fill="F1F5F9"/>
-            <w:tcMar>
-              <w:top w:w="120" w:type="dxa"/>
-              <w:left w:w="120" w:type="dxa"/>
-              <w:bottom w:w="120" w:type="dxa"/>
-              <w:right w:w="120" w:type="dxa"/>
-            </w:tcMar>
-          </w:tcPr>
-          <w:p>
-            <w:pPr>
-              <w:spacing w:after="40" w:before="40"/>
-            </w:pPr>
-            <w:r>
-              <w:rPr>
-                <w:rFonts w:ascii="Courier New" w:hAnsi="Courier New"/>
-                <w:color w:val="0F172A"/>
-                <w:sz w:val="17"/>
-              </w:rPr>
-              <w:t>// js/database.js - Деректер қорын бұлтты Supabase жүйесімен байланыстыру</w:t>
-              <w:br/>
-              <w:t>const SUPABASE_URL = 'https://bxgtxtbwiiltabolfcph.supabase.co';</w:t>
-              <w:br/>
-              <w:t>const SUPABASE_KEY = 'sb_publishable_RQatZXJ0ZXwC3fV9tu9XMg_HN56FOzP';</w:t>
-              <w:br/>
-              <w:t>let supabaseClient = null;</w:t>
-              <w:br/>
-              <w:t>let isSupabaseMode = false;</w:t>
-              <w:br/>
-              <w:br/>
-              <w:t>// Supabase API клиентін инициализациялау</w:t>
-              <w:br/>
-              <w:t>if (SUPABASE_URL &amp;&amp; SUPABASE_KEY) {</w:t>
-              <w:br/>
-              <w:t xml:space="preserve">    try {</w:t>
-              <w:br/>
-              <w:t xml:space="preserve">        supabaseClient = window.supabase.createClient(SUPABASE_URL, SUPABASE_KEY);</w:t>
-              <w:br/>
-              <w:t xml:space="preserve">        isSupabaseMode = true;</w:t>
-              <w:br/>
-              <w:t xml:space="preserve">        console.log('☁️ Подключена облачная база данных Supabase!');</w:t>
-              <w:br/>
-              <w:t xml:space="preserve">    } catch (e) {</w:t>
-              <w:br/>
-              <w:t xml:space="preserve">        console.error('Используется локальный localStorage.', e);</w:t>
-              <w:br/>
-              <w:t xml:space="preserve">    }</w:t>
-              <w:br/>
-              <w:t>}</w:t>
-              <w:br/>
-              <w:br/>
-              <w:t>// 7 секунд сайын сессияның қауіпсіздік токенін жаңарту әдісі</w:t>
-              <w:br/>
-              <w:t>async updateSessionToken(sessionId) {</w:t>
-              <w:br/>
-              <w:t xml:space="preserve">    const newToken = sessionId + '_tok_' + Math.random().toString(36).substr(2, 5);</w:t>
-              <w:br/>
-              <w:br/>
-              <w:t xml:space="preserve">    if (isSupabaseMode) {</w:t>
-              <w:br/>
-              <w:t xml:space="preserve">        const { error } = await supabaseClient</w:t>
-              <w:br/>
-              <w:t xml:space="preserve">            .from('sessions')</w:t>
-              <w:br/>
-              <w:t xml:space="preserve">            .update({ active_token: newToken })</w:t>
-              <w:br/>
-              <w:t xml:space="preserve">            .eq('id', sessionId);</w:t>
-              <w:br/>
-              <w:br/>
-              <w:t xml:space="preserve">        if (error) return null;</w:t>
-              <w:br/>
-              <w:t xml:space="preserve">        return newToken;</w:t>
-              <w:br/>
-              <w:t xml:space="preserve">    } else {</w:t>
-              <w:br/>
-              <w:t xml:space="preserve">        const sessions = this._get('sessions');</w:t>
-              <w:br/>
-              <w:t xml:space="preserve">        const session = sessions.find(s =&gt; s.id === sessionId);</w:t>
-              <w:br/>
-              <w:t xml:space="preserve">        if (!session || !session.isActive) return null;</w:t>
-              <w:br/>
-              <w:br/>
-              <w:t xml:space="preserve">        session.activeToken = newToken;</w:t>
-              <w:br/>
-              <w:t xml:space="preserve">        this._set('sessions', sessions);</w:t>
-              <w:br/>
-              <w:t xml:space="preserve">        return newToken;</w:t>
-              <w:br/>
-              <w:t xml:space="preserve">    }</w:t>
-              <w:br/>
-              <w:t>}</w:t>
-            </w:r>
-          </w:p>
-        </w:tc>
-      </w:tr>
-    </w:tbl>
-    <w:p>
-      <w:pPr>
-        <w:spacing w:after="120" w:before="240" w:line="276" w:lineRule="auto"/>
-      </w:pPr>
-      <w:r>
-        <w:rPr>
-          <w:rFonts w:ascii="Times New Roman" w:hAnsi="Times New Roman"/>
-          <w:b/>
-          <w:i w:val="0"/>
-          <w:sz w:val="24"/>
-        </w:rPr>
-        <w:t>💻 Оқытушы кабинетіндегі 7-секундтық QR-код ротациясы (js/app-teacher.js)</w:t>
-      </w:r>
-    </w:p>
-    <w:tbl>
-      <w:tblPr>
-        <w:tblW w:type="auto" w:w="0"/>
-        <w:jc w:val="center"/>
-        <w:tblLook w:firstColumn="1" w:firstRow="1" w:lastColumn="0" w:lastRow="0" w:noHBand="0" w:noVBand="1" w:val="04A0"/>
-      </w:tblPr>
-      <w:tblGrid>
-        <w:gridCol w:w="9354"/>
-      </w:tblGrid>
-      <w:tr>
-        <w:tc>
-          <w:tcPr>
-            <w:tcW w:type="dxa" w:w="9354"/>
-            <w:shd w:val="clear" w:color="auto" w:fill="F1F5F9"/>
-            <w:tcMar>
-              <w:top w:w="120" w:type="dxa"/>
-              <w:left w:w="120" w:type="dxa"/>
-              <w:bottom w:w="120" w:type="dxa"/>
-              <w:right w:w="120" w:type="dxa"/>
-            </w:tcMar>
-          </w:tcPr>
-          <w:p>
-            <w:pPr>
-              <w:spacing w:after="40" w:before="40"/>
-            </w:pPr>
-            <w:r>
-              <w:rPr>
-                <w:rFonts w:ascii="Courier New" w:hAnsi="Courier New"/>
-                <w:color w:val="0F172A"/>
-                <w:sz w:val="17"/>
-              </w:rPr>
-              <w:t>// js/app-teacher.js - Оқытушы тарапынан QR-кодты әрбір 7 секунд сайын жаңарту</w:t>
-              <w:br/>
-              <w:t>function startQrRotation() {</w:t>
-              <w:br/>
-              <w:t xml:space="preserve">    stopQrRotation();</w:t>
-              <w:br/>
-              <w:t xml:space="preserve">    if (!selectedSessionId) return;</w:t>
-              <w:br/>
-              <w:br/>
-              <w:t xml:space="preserve">    qrRotationInterval = setInterval(async () =&gt; {</w:t>
-              <w:br/>
-              <w:t xml:space="preserve">        const session = await Database.getSessionById(selectedSessionId);</w:t>
-              <w:br/>
-              <w:t xml:space="preserve">        if (session &amp;&amp; session.isActive) {</w:t>
-              <w:br/>
-              <w:t xml:space="preserve">            // Деректер қорында токенді жаңартып, жаңа мәнді аламыз</w:t>
-              <w:br/>
-              <w:t xml:space="preserve">            const newToken = await Database.updateSessionToken(selectedSessionId);</w:t>
-              <w:br/>
-              <w:t xml:space="preserve">            if (newToken) {</w:t>
-              <w:br/>
-              <w:t xml:space="preserve">                // Экрандағы және толық экрандық режимдегі QR-кодты жаңарту</w:t>
-              <w:br/>
-              <w:t xml:space="preserve">                if (qrGenerator) {</w:t>
-              <w:br/>
-              <w:t xml:space="preserve">                    qrGenerator.value = newToken;</w:t>
-              <w:br/>
-              <w:t xml:space="preserve">                }</w:t>
-              <w:br/>
-              <w:t xml:space="preserve">                if (fullscreenQrGenerator) {</w:t>
-              <w:br/>
-              <w:t xml:space="preserve">                    fullscreenQrGenerator.value = newToken;</w:t>
-              <w:br/>
-              <w:t xml:space="preserve">                }</w:t>
-              <w:br/>
-              <w:t xml:space="preserve">                console.log("Сгенерирован новый QR-токен (7с):", newToken);</w:t>
-              <w:br/>
-              <w:t xml:space="preserve">            }</w:t>
-              <w:br/>
-              <w:t xml:space="preserve">        }</w:t>
-              <w:br/>
-              <w:t xml:space="preserve">    }, 7000); // 7 секундтық жаңару интервалы</w:t>
-              <w:br/>
-              <w:t>}</w:t>
             </w:r>
           </w:p>
         </w:tc>

</xml_diff>